<commit_message>
Added educational attainment dynamic adding or removing plus made it date picker instead of manual date input
</commit_message>
<xml_diff>
--- a/PHPInput_Resume_Format.docx
+++ b/PHPInput_Resume_Format.docx
@@ -129,7 +129,25 @@
           <w:b/>
           <w:sz w:val="44"/>
         </w:rPr>
-        <w:t>${FullName}</w:t>
+        <w:t>${</w:t>
+      </w:r>
+      <w:proofErr w:type="spellStart"/>
+      <w:r>
+        <w:rPr>
+          <w:rFonts w:ascii="Times New Roman" w:hAnsi="Times New Roman" w:cs="Times New Roman"/>
+          <w:b/>
+          <w:sz w:val="44"/>
+        </w:rPr>
+        <w:t>FullName</w:t>
+      </w:r>
+      <w:proofErr w:type="spellEnd"/>
+      <w:r>
+        <w:rPr>
+          <w:rFonts w:ascii="Times New Roman" w:hAnsi="Times New Roman" w:cs="Times New Roman"/>
+          <w:b/>
+          <w:sz w:val="44"/>
+        </w:rPr>
+        <w:t>}</w:t>
       </w:r>
     </w:p>
     <w:bookmarkEnd w:id="0"/>
@@ -423,6 +441,7 @@
         <w:rPr>
           <w:rFonts w:ascii="Times New Roman" w:hAnsi="Times New Roman" w:cs="Times New Roman"/>
           <w:b/>
+          <w:color w:val="002060"/>
           <w:szCs w:val="24"/>
           <w:u w:val="single"/>
         </w:rPr>
@@ -431,28 +450,11 @@
         <w:rPr>
           <w:rFonts w:ascii="Times New Roman" w:hAnsi="Times New Roman" w:cs="Times New Roman"/>
           <w:b/>
+          <w:color w:val="002060"/>
           <w:szCs w:val="24"/>
           <w:u w:val="single"/>
         </w:rPr>
-        <w:t xml:space="preserve">CAREER </w:t>
-      </w:r>
-      <w:r>
-        <w:rPr>
-          <w:rFonts w:ascii="Times New Roman" w:hAnsi="Times New Roman" w:cs="Times New Roman"/>
-          <w:b/>
-          <w:szCs w:val="24"/>
-          <w:u w:val="single"/>
-        </w:rPr>
-        <w:t>O</w:t>
-      </w:r>
-      <w:r>
-        <w:rPr>
-          <w:rFonts w:ascii="Times New Roman" w:hAnsi="Times New Roman" w:cs="Times New Roman"/>
-          <w:b/>
-          <w:szCs w:val="24"/>
-          <w:u w:val="single"/>
-        </w:rPr>
-        <w:t>BJECTIVE</w:t>
+        <w:t>CAREER OBJECTIVE</w:t>
       </w:r>
     </w:p>
     <w:p>
@@ -502,6 +504,7 @@
         <w:rPr>
           <w:rFonts w:ascii="Times New Roman" w:hAnsi="Times New Roman" w:cs="Times New Roman"/>
           <w:b/>
+          <w:color w:val="002060"/>
           <w:szCs w:val="24"/>
           <w:u w:val="single"/>
         </w:rPr>
@@ -510,6 +513,7 @@
         <w:rPr>
           <w:rFonts w:ascii="Times New Roman" w:hAnsi="Times New Roman" w:cs="Times New Roman"/>
           <w:b/>
+          <w:color w:val="002060"/>
           <w:szCs w:val="24"/>
           <w:u w:val="single"/>
         </w:rPr>
@@ -567,7 +571,23 @@
           <w:rFonts w:ascii="Times New Roman" w:hAnsi="Times New Roman" w:cs="Times New Roman"/>
           <w:szCs w:val="24"/>
         </w:rPr>
-        <w:t>${BirthDate}</w:t>
+        <w:t>${</w:t>
+      </w:r>
+      <w:proofErr w:type="spellStart"/>
+      <w:r>
+        <w:rPr>
+          <w:rFonts w:ascii="Times New Roman" w:hAnsi="Times New Roman" w:cs="Times New Roman"/>
+          <w:szCs w:val="24"/>
+        </w:rPr>
+        <w:t>BirthDate</w:t>
+      </w:r>
+      <w:proofErr w:type="spellEnd"/>
+      <w:r>
+        <w:rPr>
+          <w:rFonts w:ascii="Times New Roman" w:hAnsi="Times New Roman" w:cs="Times New Roman"/>
+          <w:szCs w:val="24"/>
+        </w:rPr>
+        <w:t>}</w:t>
       </w:r>
       <w:r>
         <w:rPr>
@@ -681,7 +701,23 @@
           <w:rFonts w:ascii="Times New Roman" w:hAnsi="Times New Roman" w:cs="Times New Roman"/>
           <w:szCs w:val="24"/>
         </w:rPr>
-        <w:t>${BirthPlace}</w:t>
+        <w:t>${</w:t>
+      </w:r>
+      <w:proofErr w:type="spellStart"/>
+      <w:r>
+        <w:rPr>
+          <w:rFonts w:ascii="Times New Roman" w:hAnsi="Times New Roman" w:cs="Times New Roman"/>
+          <w:szCs w:val="24"/>
+        </w:rPr>
+        <w:t>BirthPlace</w:t>
+      </w:r>
+      <w:proofErr w:type="spellEnd"/>
+      <w:r>
+        <w:rPr>
+          <w:rFonts w:ascii="Times New Roman" w:hAnsi="Times New Roman" w:cs="Times New Roman"/>
+          <w:szCs w:val="24"/>
+        </w:rPr>
+        <w:t>}</w:t>
       </w:r>
       <w:r>
         <w:rPr>
@@ -1034,7 +1070,23 @@
           <w:rFonts w:ascii="Times New Roman" w:hAnsi="Times New Roman" w:cs="Times New Roman"/>
           <w:szCs w:val="24"/>
         </w:rPr>
-        <w:t>${CivilStatus}</w:t>
+        <w:t>${</w:t>
+      </w:r>
+      <w:proofErr w:type="spellStart"/>
+      <w:r>
+        <w:rPr>
+          <w:rFonts w:ascii="Times New Roman" w:hAnsi="Times New Roman" w:cs="Times New Roman"/>
+          <w:szCs w:val="24"/>
+        </w:rPr>
+        <w:t>CivilStatus</w:t>
+      </w:r>
+      <w:proofErr w:type="spellEnd"/>
+      <w:r>
+        <w:rPr>
+          <w:rFonts w:ascii="Times New Roman" w:hAnsi="Times New Roman" w:cs="Times New Roman"/>
+          <w:szCs w:val="24"/>
+        </w:rPr>
+        <w:t>}</w:t>
       </w:r>
       <w:r>
         <w:rPr>
@@ -1085,7 +1137,23 @@
           <w:rFonts w:ascii="Times New Roman" w:hAnsi="Times New Roman" w:cs="Times New Roman"/>
           <w:szCs w:val="24"/>
         </w:rPr>
-        <w:t>${EmergencyContactName}</w:t>
+        <w:t>${</w:t>
+      </w:r>
+      <w:proofErr w:type="spellStart"/>
+      <w:r>
+        <w:rPr>
+          <w:rFonts w:ascii="Times New Roman" w:hAnsi="Times New Roman" w:cs="Times New Roman"/>
+          <w:szCs w:val="24"/>
+        </w:rPr>
+        <w:t>EmergencyContactName</w:t>
+      </w:r>
+      <w:proofErr w:type="spellEnd"/>
+      <w:r>
+        <w:rPr>
+          <w:rFonts w:ascii="Times New Roman" w:hAnsi="Times New Roman" w:cs="Times New Roman"/>
+          <w:szCs w:val="24"/>
+        </w:rPr>
+        <w:t>}</w:t>
       </w:r>
     </w:p>
     <w:p>
@@ -1193,7 +1261,23 @@
           <w:rFonts w:ascii="Times New Roman" w:hAnsi="Times New Roman" w:cs="Times New Roman"/>
           <w:szCs w:val="24"/>
         </w:rPr>
-        <w:t>${EmergencyContact}</w:t>
+        <w:t>${</w:t>
+      </w:r>
+      <w:proofErr w:type="spellStart"/>
+      <w:r>
+        <w:rPr>
+          <w:rFonts w:ascii="Times New Roman" w:hAnsi="Times New Roman" w:cs="Times New Roman"/>
+          <w:szCs w:val="24"/>
+        </w:rPr>
+        <w:t>EmergencyContact</w:t>
+      </w:r>
+      <w:proofErr w:type="spellEnd"/>
+      <w:r>
+        <w:rPr>
+          <w:rFonts w:ascii="Times New Roman" w:hAnsi="Times New Roman" w:cs="Times New Roman"/>
+          <w:szCs w:val="24"/>
+        </w:rPr>
+        <w:t>}</w:t>
       </w:r>
     </w:p>
     <w:p>
@@ -1280,6 +1364,7 @@
         <w:pStyle w:val="NoSpacing"/>
         <w:rPr>
           <w:rFonts w:ascii="Times New Roman" w:hAnsi="Times New Roman" w:cs="Times New Roman"/>
+          <w:color w:val="002060"/>
           <w:szCs w:val="24"/>
           <w:u w:val="single"/>
         </w:rPr>
@@ -1288,6 +1373,7 @@
         <w:rPr>
           <w:rFonts w:ascii="Times New Roman" w:hAnsi="Times New Roman" w:cs="Times New Roman"/>
           <w:b/>
+          <w:color w:val="002060"/>
           <w:szCs w:val="24"/>
           <w:u w:val="single"/>
         </w:rPr>
@@ -1310,6 +1396,32 @@
           <w:szCs w:val="24"/>
         </w:rPr>
         <w:tab/>
+      </w:r>
+      <w:r>
+        <w:rPr>
+          <w:rFonts w:ascii="Times New Roman" w:hAnsi="Times New Roman" w:cs="Times New Roman"/>
+          <w:b/>
+          <w:szCs w:val="24"/>
+        </w:rPr>
+        <w:t>${</w:t>
+      </w:r>
+      <w:proofErr w:type="spellStart"/>
+      <w:r>
+        <w:rPr>
+          <w:rFonts w:ascii="Times New Roman" w:hAnsi="Times New Roman" w:cs="Times New Roman"/>
+          <w:b/>
+          <w:szCs w:val="24"/>
+        </w:rPr>
+        <w:t>block_tertiary</w:t>
+      </w:r>
+      <w:proofErr w:type="spellEnd"/>
+      <w:r>
+        <w:rPr>
+          <w:rFonts w:ascii="Times New Roman" w:hAnsi="Times New Roman" w:cs="Times New Roman"/>
+          <w:b/>
+          <w:szCs w:val="24"/>
+        </w:rPr>
+        <w:t>}</w:t>
       </w:r>
     </w:p>
     <w:p>
@@ -1371,49 +1483,163 @@
           <w:b/>
           <w:szCs w:val="24"/>
         </w:rPr>
-        <w:t>${CollegeName}</w:t>
-      </w:r>
-      <w:r>
-        <w:rPr>
-          <w:rFonts w:ascii="Times New Roman" w:hAnsi="Times New Roman" w:cs="Times New Roman"/>
-          <w:b/>
-          <w:szCs w:val="24"/>
-        </w:rPr>
-        <w:tab/>
-      </w:r>
-      <w:r>
-        <w:rPr>
-          <w:rFonts w:ascii="Times New Roman" w:hAnsi="Times New Roman" w:cs="Times New Roman"/>
-          <w:b/>
-          <w:szCs w:val="24"/>
-        </w:rPr>
-        <w:tab/>
-      </w:r>
-      <w:r>
-        <w:rPr>
-          <w:rFonts w:ascii="Times New Roman" w:hAnsi="Times New Roman" w:cs="Times New Roman"/>
-          <w:b/>
-          <w:szCs w:val="24"/>
-        </w:rPr>
-        <w:tab/>
-      </w:r>
-      <w:r>
-        <w:rPr>
-          <w:rFonts w:ascii="Times New Roman" w:hAnsi="Times New Roman" w:cs="Times New Roman"/>
-          <w:szCs w:val="24"/>
-        </w:rPr>
-        <w:t>${CollegeYear}</w:t>
+        <w:t>${</w:t>
+      </w:r>
+      <w:proofErr w:type="spellStart"/>
+      <w:r>
+        <w:rPr>
+          <w:rFonts w:ascii="Times New Roman" w:hAnsi="Times New Roman" w:cs="Times New Roman"/>
+          <w:b/>
+          <w:szCs w:val="24"/>
+        </w:rPr>
+        <w:t>CollegeName</w:t>
+      </w:r>
+      <w:proofErr w:type="spellEnd"/>
+      <w:r>
+        <w:rPr>
+          <w:rFonts w:ascii="Times New Roman" w:hAnsi="Times New Roman" w:cs="Times New Roman"/>
+          <w:b/>
+          <w:szCs w:val="24"/>
+        </w:rPr>
+        <w:t>}</w:t>
+      </w:r>
+      <w:r>
+        <w:rPr>
+          <w:rFonts w:ascii="Times New Roman" w:hAnsi="Times New Roman" w:cs="Times New Roman"/>
+          <w:b/>
+          <w:szCs w:val="24"/>
+        </w:rPr>
+        <w:tab/>
+      </w:r>
+      <w:r>
+        <w:rPr>
+          <w:rFonts w:ascii="Times New Roman" w:hAnsi="Times New Roman" w:cs="Times New Roman"/>
+          <w:b/>
+          <w:szCs w:val="24"/>
+        </w:rPr>
+        <w:tab/>
+      </w:r>
+      <w:r>
+        <w:rPr>
+          <w:rFonts w:ascii="Times New Roman" w:hAnsi="Times New Roman" w:cs="Times New Roman"/>
+          <w:b/>
+          <w:szCs w:val="24"/>
+        </w:rPr>
+        <w:tab/>
+      </w:r>
+      <w:r>
+        <w:rPr>
+          <w:rFonts w:ascii="Times New Roman" w:hAnsi="Times New Roman" w:cs="Times New Roman"/>
+          <w:szCs w:val="24"/>
+        </w:rPr>
+        <w:t>${</w:t>
+      </w:r>
+      <w:proofErr w:type="spellStart"/>
+      <w:r>
+        <w:rPr>
+          <w:rFonts w:ascii="Times New Roman" w:hAnsi="Times New Roman" w:cs="Times New Roman"/>
+          <w:szCs w:val="24"/>
+        </w:rPr>
+        <w:t>CollegeStart</w:t>
+      </w:r>
+      <w:proofErr w:type="spellEnd"/>
+      <w:r>
+        <w:rPr>
+          <w:rFonts w:ascii="Times New Roman" w:hAnsi="Times New Roman" w:cs="Times New Roman"/>
+          <w:szCs w:val="24"/>
+        </w:rPr>
+        <w:t>} - ${</w:t>
+      </w:r>
+      <w:proofErr w:type="spellStart"/>
+      <w:r>
+        <w:rPr>
+          <w:rFonts w:ascii="Times New Roman" w:hAnsi="Times New Roman" w:cs="Times New Roman"/>
+          <w:szCs w:val="24"/>
+        </w:rPr>
+        <w:t>CollegeEnd</w:t>
+      </w:r>
+      <w:proofErr w:type="spellEnd"/>
+      <w:r>
+        <w:rPr>
+          <w:rFonts w:ascii="Times New Roman" w:hAnsi="Times New Roman" w:cs="Times New Roman"/>
+          <w:szCs w:val="24"/>
+        </w:rPr>
+        <w:t>}</w:t>
       </w:r>
     </w:p>
     <w:p>
       <w:pPr>
         <w:pStyle w:val="NoSpacing"/>
-        <w:rPr>
-          <w:rFonts w:ascii="Times New Roman" w:hAnsi="Times New Roman" w:cs="Times New Roman"/>
-          <w:b/>
-          <w:szCs w:val="24"/>
-        </w:rPr>
-      </w:pPr>
+        <w:ind w:left="720"/>
+        <w:rPr>
+          <w:rFonts w:ascii="Times New Roman" w:hAnsi="Times New Roman" w:cs="Times New Roman"/>
+          <w:b/>
+          <w:szCs w:val="24"/>
+        </w:rPr>
+      </w:pPr>
+      <w:r>
+        <w:rPr>
+          <w:rFonts w:ascii="Times New Roman" w:hAnsi="Times New Roman" w:cs="Times New Roman"/>
+          <w:b/>
+          <w:szCs w:val="24"/>
+        </w:rPr>
+        <w:t>${/</w:t>
+      </w:r>
+      <w:proofErr w:type="spellStart"/>
+      <w:r>
+        <w:rPr>
+          <w:rFonts w:ascii="Times New Roman" w:hAnsi="Times New Roman" w:cs="Times New Roman"/>
+          <w:b/>
+          <w:szCs w:val="24"/>
+        </w:rPr>
+        <w:t>block_tertiary</w:t>
+      </w:r>
+      <w:proofErr w:type="spellEnd"/>
+      <w:r>
+        <w:rPr>
+          <w:rFonts w:ascii="Times New Roman" w:hAnsi="Times New Roman" w:cs="Times New Roman"/>
+          <w:b/>
+          <w:szCs w:val="24"/>
+        </w:rPr>
+        <w:t>}</w:t>
+      </w:r>
+    </w:p>
+    <w:p>
+      <w:pPr>
+        <w:pStyle w:val="NoSpacing"/>
+        <w:ind w:left="720"/>
+        <w:rPr>
+          <w:rFonts w:ascii="Times New Roman" w:hAnsi="Times New Roman" w:cs="Times New Roman"/>
+          <w:b/>
+          <w:szCs w:val="24"/>
+        </w:rPr>
+      </w:pPr>
+      <w:r>
+        <w:rPr>
+          <w:rFonts w:ascii="Times New Roman" w:hAnsi="Times New Roman" w:cs="Times New Roman"/>
+          <w:b/>
+          <w:szCs w:val="24"/>
+        </w:rPr>
+        <w:t>${</w:t>
+      </w:r>
+      <w:proofErr w:type="spellStart"/>
+      <w:r>
+        <w:rPr>
+          <w:rFonts w:ascii="Times New Roman" w:hAnsi="Times New Roman" w:cs="Times New Roman"/>
+          <w:b/>
+          <w:szCs w:val="24"/>
+        </w:rPr>
+        <w:t>block_highschool</w:t>
+      </w:r>
+      <w:proofErr w:type="spellEnd"/>
+      <w:r>
+        <w:rPr>
+          <w:rFonts w:ascii="Times New Roman" w:hAnsi="Times New Roman" w:cs="Times New Roman"/>
+          <w:b/>
+          <w:szCs w:val="24"/>
+        </w:rPr>
+        <w:t>}</w:t>
+      </w:r>
     </w:p>
     <w:p>
       <w:pPr>
@@ -1466,49 +1692,163 @@
           <w:b/>
           <w:szCs w:val="24"/>
         </w:rPr>
-        <w:t>${HighSchoolName}</w:t>
-      </w:r>
-      <w:r>
-        <w:rPr>
-          <w:rFonts w:ascii="Times New Roman" w:hAnsi="Times New Roman" w:cs="Times New Roman"/>
-          <w:b/>
-          <w:szCs w:val="24"/>
-        </w:rPr>
-        <w:tab/>
-      </w:r>
-      <w:r>
-        <w:rPr>
-          <w:rFonts w:ascii="Times New Roman" w:hAnsi="Times New Roman" w:cs="Times New Roman"/>
-          <w:b/>
-          <w:szCs w:val="24"/>
-        </w:rPr>
-        <w:tab/>
-      </w:r>
-      <w:r>
-        <w:rPr>
-          <w:rFonts w:ascii="Times New Roman" w:hAnsi="Times New Roman" w:cs="Times New Roman"/>
-          <w:b/>
-          <w:szCs w:val="24"/>
-        </w:rPr>
-        <w:tab/>
-      </w:r>
-      <w:r>
-        <w:rPr>
-          <w:rFonts w:ascii="Times New Roman" w:hAnsi="Times New Roman" w:cs="Times New Roman"/>
-          <w:szCs w:val="24"/>
-        </w:rPr>
-        <w:t>${HighSchoolYear}</w:t>
+        <w:t>${</w:t>
+      </w:r>
+      <w:proofErr w:type="spellStart"/>
+      <w:r>
+        <w:rPr>
+          <w:rFonts w:ascii="Times New Roman" w:hAnsi="Times New Roman" w:cs="Times New Roman"/>
+          <w:b/>
+          <w:szCs w:val="24"/>
+        </w:rPr>
+        <w:t>HighSchoolName</w:t>
+      </w:r>
+      <w:proofErr w:type="spellEnd"/>
+      <w:r>
+        <w:rPr>
+          <w:rFonts w:ascii="Times New Roman" w:hAnsi="Times New Roman" w:cs="Times New Roman"/>
+          <w:b/>
+          <w:szCs w:val="24"/>
+        </w:rPr>
+        <w:t>}</w:t>
+      </w:r>
+      <w:r>
+        <w:rPr>
+          <w:rFonts w:ascii="Times New Roman" w:hAnsi="Times New Roman" w:cs="Times New Roman"/>
+          <w:b/>
+          <w:szCs w:val="24"/>
+        </w:rPr>
+        <w:tab/>
+      </w:r>
+      <w:r>
+        <w:rPr>
+          <w:rFonts w:ascii="Times New Roman" w:hAnsi="Times New Roman" w:cs="Times New Roman"/>
+          <w:b/>
+          <w:szCs w:val="24"/>
+        </w:rPr>
+        <w:tab/>
+      </w:r>
+      <w:r>
+        <w:rPr>
+          <w:rFonts w:ascii="Times New Roman" w:hAnsi="Times New Roman" w:cs="Times New Roman"/>
+          <w:b/>
+          <w:szCs w:val="24"/>
+        </w:rPr>
+        <w:tab/>
+      </w:r>
+      <w:r>
+        <w:rPr>
+          <w:rFonts w:ascii="Times New Roman" w:hAnsi="Times New Roman" w:cs="Times New Roman"/>
+          <w:szCs w:val="24"/>
+        </w:rPr>
+        <w:t>${</w:t>
+      </w:r>
+      <w:proofErr w:type="spellStart"/>
+      <w:r>
+        <w:rPr>
+          <w:rFonts w:ascii="Times New Roman" w:hAnsi="Times New Roman" w:cs="Times New Roman"/>
+          <w:szCs w:val="24"/>
+        </w:rPr>
+        <w:t>HighSchoolStart</w:t>
+      </w:r>
+      <w:proofErr w:type="spellEnd"/>
+      <w:r>
+        <w:rPr>
+          <w:rFonts w:ascii="Times New Roman" w:hAnsi="Times New Roman" w:cs="Times New Roman"/>
+          <w:szCs w:val="24"/>
+        </w:rPr>
+        <w:t>} - ${</w:t>
+      </w:r>
+      <w:proofErr w:type="spellStart"/>
+      <w:r>
+        <w:rPr>
+          <w:rFonts w:ascii="Times New Roman" w:hAnsi="Times New Roman" w:cs="Times New Roman"/>
+          <w:szCs w:val="24"/>
+        </w:rPr>
+        <w:t>HighSchoolEnd</w:t>
+      </w:r>
+      <w:proofErr w:type="spellEnd"/>
+      <w:r>
+        <w:rPr>
+          <w:rFonts w:ascii="Times New Roman" w:hAnsi="Times New Roman" w:cs="Times New Roman"/>
+          <w:szCs w:val="24"/>
+        </w:rPr>
+        <w:t>}</w:t>
       </w:r>
     </w:p>
     <w:p>
       <w:pPr>
         <w:pStyle w:val="NoSpacing"/>
-        <w:rPr>
-          <w:rFonts w:ascii="Times New Roman" w:hAnsi="Times New Roman" w:cs="Times New Roman"/>
-          <w:b/>
-          <w:szCs w:val="24"/>
-        </w:rPr>
-      </w:pPr>
+        <w:ind w:left="720"/>
+        <w:rPr>
+          <w:rFonts w:ascii="Times New Roman" w:hAnsi="Times New Roman" w:cs="Times New Roman"/>
+          <w:b/>
+          <w:szCs w:val="24"/>
+        </w:rPr>
+      </w:pPr>
+      <w:r>
+        <w:rPr>
+          <w:rFonts w:ascii="Times New Roman" w:hAnsi="Times New Roman" w:cs="Times New Roman"/>
+          <w:b/>
+          <w:szCs w:val="24"/>
+        </w:rPr>
+        <w:t>${/</w:t>
+      </w:r>
+      <w:proofErr w:type="spellStart"/>
+      <w:r>
+        <w:rPr>
+          <w:rFonts w:ascii="Times New Roman" w:hAnsi="Times New Roman" w:cs="Times New Roman"/>
+          <w:b/>
+          <w:szCs w:val="24"/>
+        </w:rPr>
+        <w:t>block_highschool</w:t>
+      </w:r>
+      <w:proofErr w:type="spellEnd"/>
+      <w:r>
+        <w:rPr>
+          <w:rFonts w:ascii="Times New Roman" w:hAnsi="Times New Roman" w:cs="Times New Roman"/>
+          <w:b/>
+          <w:szCs w:val="24"/>
+        </w:rPr>
+        <w:t>}</w:t>
+      </w:r>
+    </w:p>
+    <w:p>
+      <w:pPr>
+        <w:pStyle w:val="NoSpacing"/>
+        <w:ind w:left="720"/>
+        <w:rPr>
+          <w:rFonts w:ascii="Times New Roman" w:hAnsi="Times New Roman" w:cs="Times New Roman"/>
+          <w:b/>
+          <w:szCs w:val="24"/>
+        </w:rPr>
+      </w:pPr>
+      <w:r>
+        <w:rPr>
+          <w:rFonts w:ascii="Times New Roman" w:hAnsi="Times New Roman" w:cs="Times New Roman"/>
+          <w:b/>
+          <w:szCs w:val="24"/>
+        </w:rPr>
+        <w:t>${</w:t>
+      </w:r>
+      <w:proofErr w:type="spellStart"/>
+      <w:r>
+        <w:rPr>
+          <w:rFonts w:ascii="Times New Roman" w:hAnsi="Times New Roman" w:cs="Times New Roman"/>
+          <w:b/>
+          <w:szCs w:val="24"/>
+        </w:rPr>
+        <w:t>block_elementary</w:t>
+      </w:r>
+      <w:proofErr w:type="spellEnd"/>
+      <w:r>
+        <w:rPr>
+          <w:rFonts w:ascii="Times New Roman" w:hAnsi="Times New Roman" w:cs="Times New Roman"/>
+          <w:b/>
+          <w:szCs w:val="24"/>
+        </w:rPr>
+        <w:t>}</w:t>
+      </w:r>
     </w:p>
     <w:p>
       <w:pPr>
@@ -1561,56 +1901,133 @@
           <w:b/>
           <w:szCs w:val="24"/>
         </w:rPr>
-        <w:t>${ElementaryName}</w:t>
-      </w:r>
-      <w:r>
-        <w:rPr>
-          <w:rFonts w:ascii="Times New Roman" w:hAnsi="Times New Roman" w:cs="Times New Roman"/>
-          <w:b/>
-          <w:szCs w:val="24"/>
-        </w:rPr>
-        <w:tab/>
-      </w:r>
-      <w:r>
-        <w:rPr>
-          <w:rFonts w:ascii="Times New Roman" w:hAnsi="Times New Roman" w:cs="Times New Roman"/>
-          <w:b/>
-          <w:szCs w:val="24"/>
-        </w:rPr>
-        <w:tab/>
-      </w:r>
-      <w:r>
-        <w:rPr>
-          <w:rFonts w:ascii="Times New Roman" w:hAnsi="Times New Roman" w:cs="Times New Roman"/>
-          <w:b/>
-          <w:szCs w:val="24"/>
-        </w:rPr>
-        <w:tab/>
-      </w:r>
-      <w:r>
-        <w:rPr>
-          <w:rFonts w:ascii="Times New Roman" w:hAnsi="Times New Roman" w:cs="Times New Roman"/>
-          <w:szCs w:val="24"/>
-        </w:rPr>
-        <w:t>${ElementaryYear}</w:t>
+        <w:t>${</w:t>
+      </w:r>
+      <w:proofErr w:type="spellStart"/>
+      <w:r>
+        <w:rPr>
+          <w:rFonts w:ascii="Times New Roman" w:hAnsi="Times New Roman" w:cs="Times New Roman"/>
+          <w:b/>
+          <w:szCs w:val="24"/>
+        </w:rPr>
+        <w:t>ElementaryName</w:t>
+      </w:r>
+      <w:proofErr w:type="spellEnd"/>
+      <w:r>
+        <w:rPr>
+          <w:rFonts w:ascii="Times New Roman" w:hAnsi="Times New Roman" w:cs="Times New Roman"/>
+          <w:b/>
+          <w:szCs w:val="24"/>
+        </w:rPr>
+        <w:t>}</w:t>
+      </w:r>
+      <w:r>
+        <w:rPr>
+          <w:rFonts w:ascii="Times New Roman" w:hAnsi="Times New Roman" w:cs="Times New Roman"/>
+          <w:b/>
+          <w:szCs w:val="24"/>
+        </w:rPr>
+        <w:tab/>
+      </w:r>
+      <w:r>
+        <w:rPr>
+          <w:rFonts w:ascii="Times New Roman" w:hAnsi="Times New Roman" w:cs="Times New Roman"/>
+          <w:b/>
+          <w:szCs w:val="24"/>
+        </w:rPr>
+        <w:tab/>
+      </w:r>
+      <w:r>
+        <w:rPr>
+          <w:rFonts w:ascii="Times New Roman" w:hAnsi="Times New Roman" w:cs="Times New Roman"/>
+          <w:b/>
+          <w:szCs w:val="24"/>
+        </w:rPr>
+        <w:tab/>
+      </w:r>
+      <w:r>
+        <w:rPr>
+          <w:rFonts w:ascii="Times New Roman" w:hAnsi="Times New Roman" w:cs="Times New Roman"/>
+          <w:szCs w:val="24"/>
+        </w:rPr>
+        <w:t>${</w:t>
+      </w:r>
+      <w:proofErr w:type="spellStart"/>
+      <w:r>
+        <w:rPr>
+          <w:rFonts w:ascii="Times New Roman" w:hAnsi="Times New Roman" w:cs="Times New Roman"/>
+          <w:szCs w:val="24"/>
+        </w:rPr>
+        <w:t>ElementaryStart</w:t>
+      </w:r>
+      <w:proofErr w:type="spellEnd"/>
+      <w:r>
+        <w:rPr>
+          <w:rFonts w:ascii="Times New Roman" w:hAnsi="Times New Roman" w:cs="Times New Roman"/>
+          <w:szCs w:val="24"/>
+        </w:rPr>
+        <w:t>} - ${</w:t>
+      </w:r>
+      <w:proofErr w:type="spellStart"/>
+      <w:r>
+        <w:rPr>
+          <w:rFonts w:ascii="Times New Roman" w:hAnsi="Times New Roman" w:cs="Times New Roman"/>
+          <w:szCs w:val="24"/>
+        </w:rPr>
+        <w:t>ElementaryEnd</w:t>
+      </w:r>
+      <w:proofErr w:type="spellEnd"/>
+      <w:r>
+        <w:rPr>
+          <w:rFonts w:ascii="Times New Roman" w:hAnsi="Times New Roman" w:cs="Times New Roman"/>
+          <w:szCs w:val="24"/>
+        </w:rPr>
+        <w:t>}</w:t>
       </w:r>
     </w:p>
     <w:p>
       <w:pPr>
         <w:pStyle w:val="NoSpacing"/>
-        <w:rPr>
-          <w:rFonts w:ascii="Times New Roman" w:hAnsi="Times New Roman" w:cs="Times New Roman"/>
-          <w:b/>
-          <w:szCs w:val="24"/>
-          <w:u w:val="single"/>
-        </w:rPr>
-      </w:pPr>
+        <w:ind w:left="720"/>
+        <w:rPr>
+          <w:rFonts w:ascii="Times New Roman" w:hAnsi="Times New Roman" w:cs="Times New Roman"/>
+          <w:b/>
+          <w:szCs w:val="24"/>
+        </w:rPr>
+      </w:pPr>
+      <w:r>
+        <w:rPr>
+          <w:rFonts w:ascii="Times New Roman" w:hAnsi="Times New Roman" w:cs="Times New Roman"/>
+          <w:b/>
+          <w:szCs w:val="24"/>
+        </w:rPr>
+        <w:t>${/</w:t>
+      </w:r>
+      <w:proofErr w:type="spellStart"/>
+      <w:r>
+        <w:rPr>
+          <w:rFonts w:ascii="Times New Roman" w:hAnsi="Times New Roman" w:cs="Times New Roman"/>
+          <w:b/>
+          <w:szCs w:val="24"/>
+        </w:rPr>
+        <w:t>block_elementary</w:t>
+      </w:r>
+      <w:proofErr w:type="spellEnd"/>
+      <w:r>
+        <w:rPr>
+          <w:rFonts w:ascii="Times New Roman" w:hAnsi="Times New Roman" w:cs="Times New Roman"/>
+          <w:b/>
+          <w:szCs w:val="24"/>
+        </w:rPr>
+        <w:t>}</w:t>
+      </w:r>
     </w:p>
     <w:p>
       <w:pPr>
         <w:pStyle w:val="NoSpacing"/>
         <w:rPr>
           <w:rFonts w:ascii="Times New Roman" w:hAnsi="Times New Roman" w:cs="Times New Roman"/>
+          <w:color w:val="002060"/>
           <w:szCs w:val="24"/>
           <w:u w:val="single"/>
         </w:rPr>
@@ -1619,6 +2036,7 @@
         <w:rPr>
           <w:rFonts w:ascii="Times New Roman" w:hAnsi="Times New Roman" w:cs="Times New Roman"/>
           <w:b/>
+          <w:color w:val="002060"/>
           <w:szCs w:val="24"/>
           <w:u w:val="single"/>
         </w:rPr>
@@ -1649,7 +2067,21 @@
         <w:rPr>
           <w:rFonts w:ascii="Times New Roman" w:hAnsi="Times New Roman" w:cs="Times New Roman"/>
         </w:rPr>
-        <w:t>${WorkExperience}</w:t>
+        <w:t>${</w:t>
+      </w:r>
+      <w:proofErr w:type="spellStart"/>
+      <w:r>
+        <w:rPr>
+          <w:rFonts w:ascii="Times New Roman" w:hAnsi="Times New Roman" w:cs="Times New Roman"/>
+        </w:rPr>
+        <w:t>WorkExperience</w:t>
+      </w:r>
+      <w:proofErr w:type="spellEnd"/>
+      <w:r>
+        <w:rPr>
+          <w:rFonts w:ascii="Times New Roman" w:hAnsi="Times New Roman" w:cs="Times New Roman"/>
+        </w:rPr>
+        <w:t>}</w:t>
       </w:r>
       <w:r>
         <w:rPr>
@@ -1671,6 +2103,7 @@
         <w:pStyle w:val="NoSpacing"/>
         <w:rPr>
           <w:rFonts w:ascii="Times New Roman" w:hAnsi="Times New Roman" w:cs="Times New Roman"/>
+          <w:color w:val="002060"/>
           <w:szCs w:val="24"/>
           <w:u w:val="single"/>
         </w:rPr>
@@ -1679,6 +2112,7 @@
         <w:rPr>
           <w:rFonts w:ascii="Times New Roman" w:hAnsi="Times New Roman" w:cs="Times New Roman"/>
           <w:b/>
+          <w:color w:val="002060"/>
           <w:szCs w:val="24"/>
           <w:u w:val="single"/>
         </w:rPr>
@@ -1847,22 +2281,7 @@
         <w:pStyle w:val="NoSpacing"/>
         <w:rPr>
           <w:rFonts w:ascii="Times New Roman" w:hAnsi="Times New Roman" w:cs="Times New Roman"/>
-        </w:rPr>
-      </w:pPr>
-    </w:p>
-    <w:p>
-      <w:pPr>
-        <w:pStyle w:val="NoSpacing"/>
-        <w:rPr>
-          <w:rFonts w:ascii="Times New Roman" w:hAnsi="Times New Roman" w:cs="Times New Roman"/>
-        </w:rPr>
-      </w:pPr>
-    </w:p>
-    <w:p>
-      <w:pPr>
-        <w:pStyle w:val="NoSpacing"/>
-        <w:rPr>
-          <w:rFonts w:ascii="Times New Roman" w:hAnsi="Times New Roman" w:cs="Times New Roman"/>
+          <w:color w:val="002060"/>
           <w:szCs w:val="24"/>
           <w:u w:val="single"/>
         </w:rPr>
@@ -1871,6 +2290,7 @@
         <w:rPr>
           <w:rFonts w:ascii="Times New Roman" w:hAnsi="Times New Roman" w:cs="Times New Roman"/>
           <w:b/>
+          <w:color w:val="002060"/>
           <w:szCs w:val="24"/>
           <w:u w:val="single"/>
         </w:rPr>
@@ -1900,9 +2320,11 @@
       <w:r>
         <w:t>${</w:t>
       </w:r>
+      <w:proofErr w:type="spellStart"/>
       <w:r>
         <w:t>CharacterReference</w:t>
       </w:r>
+      <w:proofErr w:type="spellEnd"/>
       <w:r>
         <w:t>}</w:t>
       </w:r>
@@ -2168,7 +2590,25 @@
           <w:b/>
           <w:szCs w:val="24"/>
         </w:rPr>
-        <w:t>${FullName}</w:t>
+        <w:t>${</w:t>
+      </w:r>
+      <w:proofErr w:type="spellStart"/>
+      <w:r>
+        <w:rPr>
+          <w:rFonts w:ascii="Times New Roman" w:eastAsia="Calibri" w:hAnsi="Times New Roman" w:cs="Times New Roman"/>
+          <w:b/>
+          <w:szCs w:val="24"/>
+        </w:rPr>
+        <w:t>FullName</w:t>
+      </w:r>
+      <w:proofErr w:type="spellEnd"/>
+      <w:r>
+        <w:rPr>
+          <w:rFonts w:ascii="Times New Roman" w:eastAsia="Calibri" w:hAnsi="Times New Roman" w:cs="Times New Roman"/>
+          <w:b/>
+          <w:szCs w:val="24"/>
+        </w:rPr>
+        <w:t>}</w:t>
       </w:r>
     </w:p>
     <w:sectPr>
@@ -2204,7 +2644,7 @@
         <v:path o:extrusionok="f" gradientshapeok="t" o:connecttype="rect"/>
         <o:lock v:ext="edit" aspectratio="t"/>
       </v:shapetype>
-      <v:shape id="_x0000_i1127" type="#_x0000_t75" style="width:9.6pt;height:9.6pt" o:bullet="t">
+      <v:shape id="_x0000_i1199" type="#_x0000_t75" style="width:9.6pt;height:9.6pt" o:bullet="t">
         <v:imagedata r:id="rId1" o:title="msoA35"/>
       </v:shape>
     </w:pict>
@@ -4939,6 +5379,7 @@
   <w:style w:type="character" w:default="1" w:styleId="DefaultParagraphFont">
     <w:name w:val="Default Paragraph Font"/>
     <w:uiPriority w:val="1"/>
+    <w:semiHidden/>
     <w:unhideWhenUsed/>
   </w:style>
   <w:style w:type="table" w:default="1" w:styleId="TableNormal">

</xml_diff>

<commit_message>
Final Output Proper Formatting Plus Image Handling and other stuff
</commit_message>
<xml_diff>
--- a/PHPInput_Resume_Format.docx
+++ b/PHPInput_Resume_Format.docx
@@ -2,84 +2,443 @@
 <file path=word/document.xml><?xml version="1.0" encoding="utf-8"?>
 <w:document xmlns:wpc="http://schemas.microsoft.com/office/word/2010/wordprocessingCanvas" xmlns:cx="http://schemas.microsoft.com/office/drawing/2014/chartex" xmlns:cx1="http://schemas.microsoft.com/office/drawing/2015/9/8/chartex" xmlns:cx2="http://schemas.microsoft.com/office/drawing/2015/10/21/chartex" xmlns:cx3="http://schemas.microsoft.com/office/drawing/2016/5/9/chartex" xmlns:cx4="http://schemas.microsoft.com/office/drawing/2016/5/10/chartex" xmlns:cx5="http://schemas.microsoft.com/office/drawing/2016/5/11/chartex" xmlns:cx6="http://schemas.microsoft.com/office/drawing/2016/5/12/chartex" xmlns:cx7="http://schemas.microsoft.com/office/drawing/2016/5/13/chartex" xmlns:cx8="http://schemas.microsoft.com/office/drawing/2016/5/14/chartex" xmlns:mc="http://schemas.openxmlformats.org/markup-compatibility/2006" xmlns:aink="http://schemas.microsoft.com/office/drawing/2016/ink" xmlns:am3d="http://schemas.microsoft.com/office/drawing/2017/model3d" xmlns:o="urn:schemas-microsoft-com:office:office" xmlns:r="http://schemas.openxmlformats.org/officeDocument/2006/relationships" xmlns:m="http://schemas.openxmlformats.org/officeDocument/2006/math" xmlns:v="urn:schemas-microsoft-com:vml" xmlns:wp14="http://schemas.microsoft.com/office/word/2010/wordprocessingDrawing" xmlns:wp="http://schemas.openxmlformats.org/drawingml/2006/wordprocessingDrawing" xmlns:w10="urn:schemas-microsoft-com:office:word" xmlns:w="http://schemas.openxmlformats.org/wordprocessingml/2006/main" xmlns:w14="http://schemas.microsoft.com/office/word/2010/wordml" xmlns:w15="http://schemas.microsoft.com/office/word/2012/wordml" xmlns:w16cex="http://schemas.microsoft.com/office/word/2018/wordml/cex" xmlns:w16cid="http://schemas.microsoft.com/office/word/2016/wordml/cid" xmlns:w16="http://schemas.microsoft.com/office/word/2018/wordml" xmlns:w16sdtdh="http://schemas.microsoft.com/office/word/2020/wordml/sdtdatahash" xmlns:w16se="http://schemas.microsoft.com/office/word/2015/wordml/symex" xmlns:wpg="http://schemas.microsoft.com/office/word/2010/wordprocessingGroup" xmlns:wpi="http://schemas.microsoft.com/office/word/2010/wordprocessingInk" xmlns:wne="http://schemas.microsoft.com/office/word/2006/wordml" xmlns:wps="http://schemas.microsoft.com/office/word/2010/wordprocessingShape" mc:Ignorable="w14 w15 w16se w16cid w16 w16cex w16sdtdh wp14">
   <w:body>
+    <w:tbl>
+      <w:tblPr>
+        <w:tblStyle w:val="TableGrid"/>
+        <w:tblW w:w="10773" w:type="dxa"/>
+        <w:tblLook w:val="04A0" w:firstRow="1" w:lastRow="0" w:firstColumn="1" w:lastColumn="0" w:noHBand="0" w:noVBand="1"/>
+      </w:tblPr>
+      <w:tblGrid>
+        <w:gridCol w:w="8080"/>
+        <w:gridCol w:w="2693"/>
+      </w:tblGrid>
+      <w:tr>
+        <w:trPr>
+          <w:trHeight w:hRule="exact" w:val="2552"/>
+        </w:trPr>
+        <w:tc>
+          <w:tcPr>
+            <w:tcW w:w="8080" w:type="dxa"/>
+            <w:tcBorders>
+              <w:top w:val="nil"/>
+              <w:left w:val="nil"/>
+              <w:bottom w:val="nil"/>
+              <w:right w:val="nil"/>
+            </w:tcBorders>
+          </w:tcPr>
+          <w:p>
+            <w:pPr>
+              <w:pStyle w:val="NoSpacing"/>
+              <w:rPr>
+                <w:rFonts w:ascii="Times New Roman" w:hAnsi="Times New Roman" w:cs="Times New Roman"/>
+                <w:b/>
+                <w:sz w:val="44"/>
+              </w:rPr>
+            </w:pPr>
+          </w:p>
+          <w:p>
+            <w:pPr>
+              <w:pStyle w:val="NoSpacing"/>
+              <w:rPr>
+                <w:rFonts w:ascii="Times New Roman" w:hAnsi="Times New Roman" w:cs="Times New Roman"/>
+                <w:b/>
+                <w:sz w:val="44"/>
+              </w:rPr>
+            </w:pPr>
+            <w:r>
+              <w:rPr>
+                <w:rFonts w:ascii="Times New Roman" w:hAnsi="Times New Roman" w:cs="Times New Roman"/>
+                <w:b/>
+                <w:sz w:val="44"/>
+              </w:rPr>
+              <w:br/>
+            </w:r>
+            <w:r>
+              <w:rPr>
+                <w:rFonts w:ascii="Times New Roman" w:hAnsi="Times New Roman" w:cs="Times New Roman"/>
+                <w:b/>
+                <w:sz w:val="44"/>
+              </w:rPr>
+              <w:t>${</w:t>
+            </w:r>
+            <w:proofErr w:type="spellStart"/>
+            <w:r>
+              <w:rPr>
+                <w:rFonts w:ascii="Times New Roman" w:hAnsi="Times New Roman" w:cs="Times New Roman"/>
+                <w:b/>
+                <w:sz w:val="44"/>
+              </w:rPr>
+              <w:t>FullName</w:t>
+            </w:r>
+            <w:proofErr w:type="spellEnd"/>
+            <w:r>
+              <w:rPr>
+                <w:rFonts w:ascii="Times New Roman" w:hAnsi="Times New Roman" w:cs="Times New Roman"/>
+                <w:b/>
+                <w:sz w:val="44"/>
+              </w:rPr>
+              <w:t>}</w:t>
+            </w:r>
+            <w:r>
+              <w:rPr>
+                <w:rFonts w:ascii="Times New Roman" w:hAnsi="Times New Roman" w:cs="Times New Roman"/>
+                <w:b/>
+                <w:sz w:val="44"/>
+              </w:rPr>
+              <w:t xml:space="preserve">  </w:t>
+            </w:r>
+          </w:p>
+          <w:p>
+            <w:pPr>
+              <w:pStyle w:val="NoSpacing"/>
+              <w:rPr>
+                <w:rFonts w:ascii="Times New Roman" w:eastAsia="Calibri" w:hAnsi="Times New Roman" w:cs="Times New Roman"/>
+                <w:szCs w:val="24"/>
+              </w:rPr>
+            </w:pPr>
+          </w:p>
+          <w:p>
+            <w:pPr>
+              <w:pStyle w:val="NoSpacing"/>
+              <w:rPr>
+                <w:rFonts w:ascii="Times New Roman" w:eastAsia="Calibri" w:hAnsi="Times New Roman" w:cs="Times New Roman"/>
+                <w:szCs w:val="24"/>
+              </w:rPr>
+            </w:pPr>
+            <w:r>
+              <w:rPr>
+                <w:rFonts w:ascii="Times New Roman" w:eastAsia="Calibri" w:hAnsi="Times New Roman" w:cs="Times New Roman"/>
+                <w:szCs w:val="24"/>
+              </w:rPr>
+              <w:t>Ad</w:t>
+            </w:r>
+            <w:r>
+              <w:rPr>
+                <w:rFonts w:ascii="Times New Roman" w:eastAsia="Calibri" w:hAnsi="Times New Roman" w:cs="Times New Roman"/>
+                <w:szCs w:val="24"/>
+              </w:rPr>
+              <w:t>dress</w:t>
+            </w:r>
+            <w:r>
+              <w:rPr>
+                <w:rFonts w:ascii="Times New Roman" w:eastAsia="Calibri" w:hAnsi="Times New Roman" w:cs="Times New Roman"/>
+                <w:szCs w:val="24"/>
+              </w:rPr>
+              <w:tab/>
+            </w:r>
+            <w:r>
+              <w:rPr>
+                <w:rFonts w:ascii="Times New Roman" w:eastAsia="Calibri" w:hAnsi="Times New Roman" w:cs="Times New Roman"/>
+                <w:szCs w:val="24"/>
+              </w:rPr>
+              <w:tab/>
+              <w:t>:</w:t>
+            </w:r>
+            <w:r>
+              <w:rPr>
+                <w:rFonts w:ascii="Times New Roman" w:eastAsia="Calibri" w:hAnsi="Times New Roman" w:cs="Times New Roman"/>
+                <w:szCs w:val="24"/>
+              </w:rPr>
+              <w:tab/>
+            </w:r>
+            <w:r>
+              <w:rPr>
+                <w:rFonts w:ascii="Times New Roman" w:eastAsia="Calibri" w:hAnsi="Times New Roman" w:cs="Times New Roman"/>
+                <w:szCs w:val="24"/>
+              </w:rPr>
+              <w:t>${Address}</w:t>
+            </w:r>
+          </w:p>
+          <w:p>
+            <w:pPr>
+              <w:rPr>
+                <w:rFonts w:ascii="Times New Roman" w:hAnsi="Times New Roman" w:cs="Times New Roman"/>
+                <w:szCs w:val="24"/>
+              </w:rPr>
+            </w:pPr>
+            <w:r>
+              <w:rPr>
+                <w:rFonts w:ascii="Times New Roman" w:hAnsi="Times New Roman" w:cs="Times New Roman"/>
+                <w:szCs w:val="24"/>
+              </w:rPr>
+              <w:t>Mobile Number</w:t>
+            </w:r>
+            <w:r>
+              <w:rPr>
+                <w:rFonts w:ascii="Times New Roman" w:hAnsi="Times New Roman" w:cs="Times New Roman"/>
+                <w:szCs w:val="24"/>
+              </w:rPr>
+              <w:tab/>
+            </w:r>
+            <w:r>
+              <w:rPr>
+                <w:rFonts w:ascii="Times New Roman" w:hAnsi="Times New Roman" w:cs="Times New Roman"/>
+                <w:szCs w:val="24"/>
+              </w:rPr>
+              <w:tab/>
+            </w:r>
+            <w:r>
+              <w:rPr>
+                <w:rFonts w:ascii="Times New Roman" w:hAnsi="Times New Roman" w:cs="Times New Roman"/>
+                <w:szCs w:val="24"/>
+              </w:rPr>
+              <w:t>:</w:t>
+            </w:r>
+            <w:r>
+              <w:rPr>
+                <w:rFonts w:ascii="Times New Roman" w:hAnsi="Times New Roman" w:cs="Times New Roman"/>
+                <w:szCs w:val="24"/>
+              </w:rPr>
+              <w:tab/>
+            </w:r>
+            <w:r>
+              <w:rPr>
+                <w:rFonts w:ascii="Times New Roman" w:hAnsi="Times New Roman" w:cs="Times New Roman"/>
+                <w:szCs w:val="24"/>
+              </w:rPr>
+              <w:t>${Mobile}</w:t>
+            </w:r>
+          </w:p>
+          <w:p>
+            <w:pPr>
+              <w:pStyle w:val="NoSpacing"/>
+              <w:rPr>
+                <w:rFonts w:ascii="Times New Roman" w:hAnsi="Times New Roman" w:cs="Times New Roman"/>
+              </w:rPr>
+            </w:pPr>
+            <w:r>
+              <w:rPr>
+                <w:rFonts w:ascii="Times New Roman" w:hAnsi="Times New Roman" w:cs="Times New Roman"/>
+              </w:rPr>
+              <w:t>Email Address</w:t>
+            </w:r>
+            <w:r>
+              <w:rPr>
+                <w:rFonts w:ascii="Times New Roman" w:hAnsi="Times New Roman" w:cs="Times New Roman"/>
+              </w:rPr>
+              <w:tab/>
+            </w:r>
+            <w:r>
+              <w:rPr>
+                <w:rFonts w:ascii="Times New Roman" w:hAnsi="Times New Roman" w:cs="Times New Roman"/>
+              </w:rPr>
+              <w:tab/>
+            </w:r>
+            <w:r>
+              <w:rPr>
+                <w:rFonts w:ascii="Times New Roman" w:hAnsi="Times New Roman" w:cs="Times New Roman"/>
+              </w:rPr>
+              <w:t>:</w:t>
+            </w:r>
+            <w:r>
+              <w:rPr>
+                <w:rFonts w:ascii="Times New Roman" w:hAnsi="Times New Roman" w:cs="Times New Roman"/>
+              </w:rPr>
+              <w:tab/>
+            </w:r>
+            <w:r>
+              <w:rPr>
+                <w:rFonts w:ascii="Times New Roman" w:hAnsi="Times New Roman" w:cs="Times New Roman"/>
+              </w:rPr>
+              <w:t>${Email}</w:t>
+            </w:r>
+            <w:r>
+              <w:rPr>
+                <w:rFonts w:ascii="Times New Roman" w:hAnsi="Times New Roman" w:cs="Times New Roman"/>
+              </w:rPr>
+              <w:br/>
+            </w:r>
+          </w:p>
+        </w:tc>
+        <w:tc>
+          <w:tcPr>
+            <w:tcW w:w="2693" w:type="dxa"/>
+            <w:tcBorders>
+              <w:top w:val="nil"/>
+              <w:left w:val="nil"/>
+              <w:bottom w:val="nil"/>
+              <w:right w:val="nil"/>
+            </w:tcBorders>
+            <w:shd w:val="clear" w:color="auto" w:fill="auto"/>
+          </w:tcPr>
+          <w:p>
+            <w:pPr>
+              <w:jc w:val="center"/>
+              <w:rPr>
+                <w:color w:val="000000" w:themeColor="text1"/>
+              </w:rPr>
+            </w:pPr>
+          </w:p>
+          <w:p>
+            <w:pPr>
+              <w:jc w:val="center"/>
+              <w:rPr>
+                <w:color w:val="000000" w:themeColor="text1"/>
+              </w:rPr>
+            </w:pPr>
+          </w:p>
+          <w:p>
+            <w:pPr>
+              <w:jc w:val="center"/>
+              <w:rPr>
+                <w:color w:val="000000" w:themeColor="text1"/>
+              </w:rPr>
+            </w:pPr>
+          </w:p>
+          <w:p>
+            <w:pPr>
+              <w:jc w:val="center"/>
+              <w:rPr>
+                <w:color w:val="000000" w:themeColor="text1"/>
+              </w:rPr>
+            </w:pPr>
+          </w:p>
+          <w:p>
+            <w:pPr>
+              <w:pStyle w:val="NoSpacing"/>
+              <w:jc w:val="center"/>
+              <w:rPr>
+                <w:rFonts w:ascii="Times New Roman" w:hAnsi="Times New Roman" w:cs="Times New Roman"/>
+                <w:b/>
+                <w:sz w:val="28"/>
+              </w:rPr>
+            </w:pPr>
+          </w:p>
+          <w:p>
+            <w:pPr>
+              <w:jc w:val="center"/>
+              <w:rPr>
+                <w:rFonts w:ascii="Times New Roman" w:hAnsi="Times New Roman" w:cs="Times New Roman"/>
+                <w:b/>
+                <w:sz w:val="28"/>
+              </w:rPr>
+            </w:pPr>
+          </w:p>
+          <w:p>
+            <w:pPr>
+              <w:tabs>
+                <w:tab w:val="left" w:pos="1320"/>
+              </w:tabs>
+            </w:pPr>
+          </w:p>
+          <w:p>
+            <w:pPr>
+              <w:jc w:val="center"/>
+            </w:pPr>
+          </w:p>
+        </w:tc>
+      </w:tr>
+    </w:tbl>
     <w:p>
       <w:pPr>
         <w:pStyle w:val="NoSpacing"/>
         <w:rPr>
           <w:rFonts w:ascii="Times New Roman" w:hAnsi="Times New Roman" w:cs="Times New Roman"/>
-          <w:b/>
-          <w:sz w:val="28"/>
-        </w:rPr>
-      </w:pPr>
-      <w:r>
-        <w:rPr>
-          <w:rFonts w:ascii="Times New Roman" w:hAnsi="Times New Roman" w:cs="Times New Roman"/>
-          <w:b/>
+          <w:sz w:val="20"/>
+        </w:rPr>
+      </w:pPr>
+      <w:r>
+        <w:rPr>
+          <w:rFonts w:ascii="Times New Roman" w:hAnsi="Times New Roman" w:cs="Times New Roman"/>
           <w:noProof/>
-          <w:sz w:val="28"/>
+          <w:sz w:val="20"/>
         </w:rPr>
         <mc:AlternateContent>
           <mc:Choice Requires="wps">
             <w:drawing>
-              <wp:anchor distT="0" distB="0" distL="114300" distR="114300" simplePos="0" relativeHeight="251662336" behindDoc="0" locked="0" layoutInCell="1" allowOverlap="1" wp14:anchorId="5956F4E2" wp14:editId="09B69293">
+              <wp:anchor distT="0" distB="0" distL="114300" distR="114300" simplePos="0" relativeHeight="251662336" behindDoc="0" locked="0" layoutInCell="1" allowOverlap="1" wp14:anchorId="56DE43A2" wp14:editId="579E3D98">
                 <wp:simplePos x="0" y="0"/>
                 <wp:positionH relativeFrom="column">
-                  <wp:posOffset>5197475</wp:posOffset>
+                  <wp:posOffset>4907280</wp:posOffset>
                 </wp:positionH>
                 <wp:positionV relativeFrom="paragraph">
-                  <wp:posOffset>17780</wp:posOffset>
+                  <wp:posOffset>-1902460</wp:posOffset>
                 </wp:positionV>
-                <wp:extent cx="1645920" cy="1645920"/>
-                <wp:effectExtent l="13970" t="6350" r="6985" b="5080"/>
+                <wp:extent cx="2125980" cy="2133600"/>
+                <wp:effectExtent l="0" t="0" r="7620" b="0"/>
                 <wp:wrapNone/>
-                <wp:docPr id="3" name="Text Box 9"/>
-                <wp:cNvGraphicFramePr>
-                  <a:graphicFrameLocks xmlns:a="http://schemas.openxmlformats.org/drawingml/2006/main"/>
-                </wp:cNvGraphicFramePr>
+                <wp:docPr id="1" name="Rectangle 1"/>
+                <wp:cNvGraphicFramePr/>
                 <a:graphic xmlns:a="http://schemas.openxmlformats.org/drawingml/2006/main">
                   <a:graphicData uri="http://schemas.microsoft.com/office/word/2010/wordprocessingShape">
                     <wps:wsp>
-                      <wps:cNvSpPr txBox="1">
-                        <a:spLocks noChangeArrowheads="1"/>
-                      </wps:cNvSpPr>
-                      <wps:spPr bwMode="auto">
+                      <wps:cNvSpPr/>
+                      <wps:spPr>
                         <a:xfrm>
                           <a:off x="0" y="0"/>
-                          <a:ext cx="1645920" cy="1645920"/>
+                          <a:ext cx="2125980" cy="2133600"/>
                         </a:xfrm>
                         <a:prstGeom prst="rect">
                           <a:avLst/>
                         </a:prstGeom>
                         <a:solidFill>
-                          <a:schemeClr val="bg1">
-                            <a:lumMod val="95000"/>
-                            <a:lumOff val="0"/>
-                          </a:schemeClr>
+                          <a:srgbClr val="FFFF00"/>
                         </a:solidFill>
-                        <a:ln w="9525">
-                          <a:solidFill>
-                            <a:srgbClr val="000000"/>
-                          </a:solidFill>
-                          <a:miter lim="800000"/>
-                          <a:headEnd/>
-                          <a:tailEnd/>
+                        <a:ln>
+                          <a:noFill/>
                         </a:ln>
                       </wps:spPr>
+                      <wps:style>
+                        <a:lnRef idx="2">
+                          <a:schemeClr val="accent1">
+                            <a:shade val="50000"/>
+                          </a:schemeClr>
+                        </a:lnRef>
+                        <a:fillRef idx="1">
+                          <a:schemeClr val="accent1"/>
+                        </a:fillRef>
+                        <a:effectRef idx="0">
+                          <a:schemeClr val="accent1"/>
+                        </a:effectRef>
+                        <a:fontRef idx="minor">
+                          <a:schemeClr val="lt1"/>
+                        </a:fontRef>
+                      </wps:style>
                       <wps:txbx>
                         <w:txbxContent>
-                          <w:p/>
+                          <w:p>
+                            <w:pPr>
+                              <w:jc w:val="center"/>
+                              <w:rPr>
+                                <w:color w:val="000000" w:themeColor="text1"/>
+                              </w:rPr>
+                            </w:pPr>
+                            <w:r>
+                              <w:rPr>
+                                <w:color w:val="000000" w:themeColor="text1"/>
+                              </w:rPr>
+                              <w:t>${</w:t>
+                            </w:r>
+                            <w:proofErr w:type="spellStart"/>
+                            <w:r>
+                              <w:rPr>
+                                <w:color w:val="000000" w:themeColor="text1"/>
+                              </w:rPr>
+                              <w:t>ProfilePicture</w:t>
+                            </w:r>
+                            <w:proofErr w:type="spellEnd"/>
+                            <w:r>
+                              <w:rPr>
+                                <w:color w:val="000000" w:themeColor="text1"/>
+                              </w:rPr>
+                              <w:t>}</w:t>
+                            </w:r>
+                          </w:p>
                         </w:txbxContent>
                       </wps:txbx>
-                      <wps:bodyPr rot="0" vert="horz" wrap="square" lIns="91440" tIns="45720" rIns="91440" bIns="45720" anchor="t" anchorCtr="0" upright="1">
+                      <wps:bodyPr rot="0" spcFirstLastPara="0" vertOverflow="overflow" horzOverflow="overflow" vert="horz" wrap="square" lIns="91440" tIns="45720" rIns="91440" bIns="45720" numCol="1" spcCol="0" rtlCol="0" fromWordArt="0" anchor="ctr" anchorCtr="0" forceAA="0" compatLnSpc="1">
+                        <a:prstTxWarp prst="textNoShape">
+                          <a:avLst/>
+                        </a:prstTxWarp>
                         <a:noAutofit/>
                       </wps:bodyPr>
                     </wps:wsp>
                   </a:graphicData>
                 </a:graphic>
-                <wp14:sizeRelH relativeFrom="page">
+                <wp14:sizeRelH relativeFrom="margin">
                   <wp14:pctWidth>0</wp14:pctWidth>
                 </wp14:sizeRelH>
-                <wp14:sizeRelV relativeFrom="page">
+                <wp14:sizeRelV relativeFrom="margin">
                   <wp14:pctHeight>0</wp14:pctHeight>
                 </wp14:sizeRelV>
               </wp:anchor>
@@ -87,263 +446,44 @@
           </mc:Choice>
           <mc:Fallback>
             <w:pict>
-              <v:shapetype w14:anchorId="5956F4E2" id="_x0000_t202" coordsize="21600,21600" o:spt="202" path="m,l,21600r21600,l21600,xe">
-                <v:stroke joinstyle="miter"/>
-                <v:path gradientshapeok="t" o:connecttype="rect"/>
-              </v:shapetype>
-              <v:shape id="Text Box 9" o:spid="_x0000_s1026" type="#_x0000_t202" style="position:absolute;margin-left:409.25pt;margin-top:1.4pt;width:129.6pt;height:129.6pt;z-index:251662336;visibility:visible;mso-wrap-style:square;mso-width-percent:0;mso-height-percent:0;mso-wrap-distance-left:9pt;mso-wrap-distance-top:0;mso-wrap-distance-right:9pt;mso-wrap-distance-bottom:0;mso-position-horizontal:absolute;mso-position-horizontal-relative:text;mso-position-vertical:absolute;mso-position-vertical-relative:text;mso-width-percent:0;mso-height-percent:0;mso-width-relative:page;mso-height-relative:page;v-text-anchor:top" o:gfxdata="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" fillcolor="#f2f2f2 [3052]">
+              <v:rect w14:anchorId="56DE43A2" id="Rectangle 1" o:spid="_x0000_s1026" style="position:absolute;margin-left:386.4pt;margin-top:-149.8pt;width:167.4pt;height:168pt;z-index:251662336;visibility:visible;mso-wrap-style:square;mso-width-percent:0;mso-height-percent:0;mso-wrap-distance-left:9pt;mso-wrap-distance-top:0;mso-wrap-distance-right:9pt;mso-wrap-distance-bottom:0;mso-position-horizontal:absolute;mso-position-horizontal-relative:text;mso-position-vertical:absolute;mso-position-vertical-relative:text;mso-width-percent:0;mso-height-percent:0;mso-width-relative:margin;mso-height-relative:margin;v-text-anchor:middle" o:gfxdata="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" fillcolor="yellow" stroked="f" strokeweight="2pt">
                 <v:textbox>
                   <w:txbxContent>
-                    <w:p/>
+                    <w:p>
+                      <w:pPr>
+                        <w:jc w:val="center"/>
+                        <w:rPr>
+                          <w:color w:val="000000" w:themeColor="text1"/>
+                        </w:rPr>
+                      </w:pPr>
+                      <w:r>
+                        <w:rPr>
+                          <w:color w:val="000000" w:themeColor="text1"/>
+                        </w:rPr>
+                        <w:t>${</w:t>
+                      </w:r>
+                      <w:proofErr w:type="spellStart"/>
+                      <w:r>
+                        <w:rPr>
+                          <w:color w:val="000000" w:themeColor="text1"/>
+                        </w:rPr>
+                        <w:t>ProfilePicture</w:t>
+                      </w:r>
+                      <w:proofErr w:type="spellEnd"/>
+                      <w:r>
+                        <w:rPr>
+                          <w:color w:val="000000" w:themeColor="text1"/>
+                        </w:rPr>
+                        <w:t>}</w:t>
+                      </w:r>
+                    </w:p>
                   </w:txbxContent>
                 </v:textbox>
-              </v:shape>
+              </v:rect>
             </w:pict>
           </mc:Fallback>
         </mc:AlternateContent>
       </w:r>
-    </w:p>
-    <w:p>
-      <w:pPr>
-        <w:pStyle w:val="NoSpacing"/>
-        <w:rPr>
-          <w:rFonts w:ascii="Times New Roman" w:hAnsi="Times New Roman" w:cs="Times New Roman"/>
-          <w:b/>
-          <w:sz w:val="44"/>
-        </w:rPr>
-      </w:pPr>
-    </w:p>
-    <w:p>
-      <w:pPr>
-        <w:pStyle w:val="NoSpacing"/>
-        <w:rPr>
-          <w:rFonts w:ascii="Times New Roman" w:hAnsi="Times New Roman" w:cs="Times New Roman"/>
-          <w:b/>
-          <w:sz w:val="44"/>
-        </w:rPr>
-      </w:pPr>
-      <w:bookmarkStart w:id="0" w:name="_Hlk223013895"/>
-      <w:r>
-        <w:rPr>
-          <w:rFonts w:ascii="Times New Roman" w:hAnsi="Times New Roman" w:cs="Times New Roman"/>
-          <w:b/>
-          <w:sz w:val="44"/>
-        </w:rPr>
-        <w:t>${</w:t>
-      </w:r>
-      <w:proofErr w:type="spellStart"/>
-      <w:r>
-        <w:rPr>
-          <w:rFonts w:ascii="Times New Roman" w:hAnsi="Times New Roman" w:cs="Times New Roman"/>
-          <w:b/>
-          <w:sz w:val="44"/>
-        </w:rPr>
-        <w:t>FullName</w:t>
-      </w:r>
-      <w:proofErr w:type="spellEnd"/>
-      <w:r>
-        <w:rPr>
-          <w:rFonts w:ascii="Times New Roman" w:hAnsi="Times New Roman" w:cs="Times New Roman"/>
-          <w:b/>
-          <w:sz w:val="44"/>
-        </w:rPr>
-        <w:t>}</w:t>
-      </w:r>
-    </w:p>
-    <w:bookmarkEnd w:id="0"/>
-    <w:p>
-      <w:pPr>
-        <w:pStyle w:val="NoSpacing"/>
-        <w:rPr>
-          <w:rFonts w:ascii="Times New Roman" w:eastAsia="Calibri" w:hAnsi="Times New Roman" w:cs="Times New Roman"/>
-          <w:szCs w:val="24"/>
-        </w:rPr>
-      </w:pPr>
-    </w:p>
-    <w:p>
-      <w:pPr>
-        <w:pStyle w:val="NoSpacing"/>
-        <w:rPr>
-          <w:rFonts w:ascii="Times New Roman" w:eastAsia="Calibri" w:hAnsi="Times New Roman" w:cs="Times New Roman"/>
-          <w:szCs w:val="24"/>
-        </w:rPr>
-      </w:pPr>
-    </w:p>
-    <w:p>
-      <w:pPr>
-        <w:pStyle w:val="NoSpacing"/>
-        <w:rPr>
-          <w:rFonts w:ascii="Times New Roman" w:eastAsia="Calibri" w:hAnsi="Times New Roman" w:cs="Times New Roman"/>
-          <w:szCs w:val="24"/>
-        </w:rPr>
-      </w:pPr>
-      <w:r>
-        <w:rPr>
-          <w:rFonts w:ascii="Times New Roman" w:eastAsia="Calibri" w:hAnsi="Times New Roman" w:cs="Times New Roman"/>
-          <w:szCs w:val="24"/>
-        </w:rPr>
-        <w:t>Ad</w:t>
-      </w:r>
-      <w:r>
-        <w:rPr>
-          <w:rFonts w:ascii="Times New Roman" w:eastAsia="Calibri" w:hAnsi="Times New Roman" w:cs="Times New Roman"/>
-          <w:szCs w:val="24"/>
-        </w:rPr>
-        <w:t>dress</w:t>
-      </w:r>
-      <w:r>
-        <w:rPr>
-          <w:rFonts w:ascii="Times New Roman" w:eastAsia="Calibri" w:hAnsi="Times New Roman" w:cs="Times New Roman"/>
-          <w:szCs w:val="24"/>
-        </w:rPr>
-        <w:tab/>
-      </w:r>
-      <w:r>
-        <w:rPr>
-          <w:rFonts w:ascii="Times New Roman" w:eastAsia="Calibri" w:hAnsi="Times New Roman" w:cs="Times New Roman"/>
-          <w:szCs w:val="24"/>
-        </w:rPr>
-        <w:tab/>
-      </w:r>
-      <w:r>
-        <w:rPr>
-          <w:rFonts w:ascii="Times New Roman" w:eastAsia="Calibri" w:hAnsi="Times New Roman" w:cs="Times New Roman"/>
-          <w:szCs w:val="24"/>
-        </w:rPr>
-        <w:t>:</w:t>
-      </w:r>
-      <w:r>
-        <w:rPr>
-          <w:rFonts w:ascii="Times New Roman" w:eastAsia="Calibri" w:hAnsi="Times New Roman" w:cs="Times New Roman"/>
-          <w:szCs w:val="24"/>
-        </w:rPr>
-        <w:tab/>
-      </w:r>
-      <w:r>
-        <w:rPr>
-          <w:rFonts w:ascii="Times New Roman" w:eastAsia="Calibri" w:hAnsi="Times New Roman" w:cs="Times New Roman"/>
-          <w:szCs w:val="24"/>
-        </w:rPr>
-        <w:t>${Address}</w:t>
-      </w:r>
-    </w:p>
-    <w:p>
-      <w:pPr>
-        <w:spacing w:after="0" w:line="240" w:lineRule="auto"/>
-        <w:rPr>
-          <w:rFonts w:ascii="Times New Roman" w:hAnsi="Times New Roman" w:cs="Times New Roman"/>
-          <w:szCs w:val="24"/>
-        </w:rPr>
-      </w:pPr>
-      <w:r>
-        <w:rPr>
-          <w:rFonts w:ascii="Times New Roman" w:hAnsi="Times New Roman" w:cs="Times New Roman"/>
-          <w:szCs w:val="24"/>
-        </w:rPr>
-        <w:t>Mob</w:t>
-      </w:r>
-      <w:r>
-        <w:rPr>
-          <w:rFonts w:ascii="Times New Roman" w:hAnsi="Times New Roman" w:cs="Times New Roman"/>
-          <w:szCs w:val="24"/>
-        </w:rPr>
-        <w:t>ile</w:t>
-      </w:r>
-      <w:r>
-        <w:rPr>
-          <w:rFonts w:ascii="Times New Roman" w:hAnsi="Times New Roman" w:cs="Times New Roman"/>
-          <w:szCs w:val="24"/>
-        </w:rPr>
-        <w:t xml:space="preserve"> Number</w:t>
-      </w:r>
-      <w:r>
-        <w:rPr>
-          <w:rFonts w:ascii="Times New Roman" w:hAnsi="Times New Roman" w:cs="Times New Roman"/>
-          <w:szCs w:val="24"/>
-        </w:rPr>
-        <w:tab/>
-      </w:r>
-      <w:r>
-        <w:rPr>
-          <w:rFonts w:ascii="Times New Roman" w:hAnsi="Times New Roman" w:cs="Times New Roman"/>
-          <w:szCs w:val="24"/>
-        </w:rPr>
-        <w:tab/>
-      </w:r>
-      <w:r>
-        <w:rPr>
-          <w:rFonts w:ascii="Times New Roman" w:hAnsi="Times New Roman" w:cs="Times New Roman"/>
-          <w:szCs w:val="24"/>
-        </w:rPr>
-        <w:t>:</w:t>
-      </w:r>
-      <w:r>
-        <w:rPr>
-          <w:rFonts w:ascii="Times New Roman" w:hAnsi="Times New Roman" w:cs="Times New Roman"/>
-          <w:szCs w:val="24"/>
-        </w:rPr>
-        <w:tab/>
-      </w:r>
-      <w:r>
-        <w:rPr>
-          <w:rFonts w:ascii="Times New Roman" w:hAnsi="Times New Roman" w:cs="Times New Roman"/>
-          <w:szCs w:val="24"/>
-        </w:rPr>
-        <w:t>${Mobile}</w:t>
-      </w:r>
-    </w:p>
-    <w:p>
-      <w:pPr>
-        <w:pStyle w:val="NoSpacing"/>
-        <w:rPr>
-          <w:rFonts w:ascii="Times New Roman" w:hAnsi="Times New Roman" w:cs="Times New Roman"/>
-        </w:rPr>
-      </w:pPr>
-      <w:r>
-        <w:rPr>
-          <w:rFonts w:ascii="Times New Roman" w:hAnsi="Times New Roman" w:cs="Times New Roman"/>
-        </w:rPr>
-        <w:t>Email Address</w:t>
-      </w:r>
-      <w:r>
-        <w:rPr>
-          <w:rFonts w:ascii="Times New Roman" w:hAnsi="Times New Roman" w:cs="Times New Roman"/>
-        </w:rPr>
-        <w:tab/>
-      </w:r>
-      <w:r>
-        <w:rPr>
-          <w:rFonts w:ascii="Times New Roman" w:hAnsi="Times New Roman" w:cs="Times New Roman"/>
-        </w:rPr>
-        <w:tab/>
-      </w:r>
-      <w:r>
-        <w:rPr>
-          <w:rFonts w:ascii="Times New Roman" w:hAnsi="Times New Roman" w:cs="Times New Roman"/>
-        </w:rPr>
-        <w:t>:</w:t>
-      </w:r>
-      <w:r>
-        <w:rPr>
-          <w:rFonts w:ascii="Times New Roman" w:hAnsi="Times New Roman" w:cs="Times New Roman"/>
-        </w:rPr>
-        <w:tab/>
-      </w:r>
-      <w:r>
-        <w:rPr>
-          <w:rFonts w:ascii="Times New Roman" w:hAnsi="Times New Roman" w:cs="Times New Roman"/>
-        </w:rPr>
-        <w:t>${Email}</w:t>
-      </w:r>
-    </w:p>
-    <w:p>
-      <w:pPr>
-        <w:pStyle w:val="NoSpacing"/>
-        <w:rPr>
-          <w:rFonts w:ascii="Times New Roman" w:hAnsi="Times New Roman" w:cs="Times New Roman"/>
-          <w:sz w:val="20"/>
-        </w:rPr>
-      </w:pPr>
       <w:r>
         <w:rPr>
           <w:rFonts w:ascii="Times New Roman" w:hAnsi="Times New Roman" w:cs="Times New Roman"/>
@@ -525,132 +665,1006 @@
         <w:pStyle w:val="NoSpacing"/>
         <w:rPr>
           <w:rFonts w:ascii="Times New Roman" w:hAnsi="Times New Roman" w:cs="Times New Roman"/>
-          <w:szCs w:val="24"/>
-        </w:rPr>
-      </w:pPr>
+          <w:b/>
+          <w:color w:val="002060"/>
+          <w:szCs w:val="24"/>
+          <w:u w:val="single"/>
+        </w:rPr>
+      </w:pPr>
+    </w:p>
+    <w:tbl>
+      <w:tblPr>
+        <w:tblStyle w:val="TableGrid"/>
+        <w:tblW w:w="0" w:type="auto"/>
+        <w:tblBorders>
+          <w:top w:val="none" w:sz="0" w:space="0" w:color="auto"/>
+          <w:left w:val="none" w:sz="0" w:space="0" w:color="auto"/>
+          <w:bottom w:val="none" w:sz="0" w:space="0" w:color="auto"/>
+          <w:right w:val="none" w:sz="0" w:space="0" w:color="auto"/>
+          <w:insideH w:val="none" w:sz="0" w:space="0" w:color="auto"/>
+          <w:insideV w:val="none" w:sz="0" w:space="0" w:color="auto"/>
+        </w:tblBorders>
+        <w:tblLook w:val="04A0" w:firstRow="1" w:lastRow="0" w:firstColumn="1" w:lastColumn="0" w:noHBand="0" w:noVBand="1"/>
+      </w:tblPr>
+      <w:tblGrid>
+        <w:gridCol w:w="2841"/>
+        <w:gridCol w:w="2841"/>
+        <w:gridCol w:w="2842"/>
+        <w:gridCol w:w="2842"/>
+      </w:tblGrid>
+      <w:tr>
+        <w:tc>
+          <w:tcPr>
+            <w:tcW w:w="2841" w:type="dxa"/>
+          </w:tcPr>
+          <w:p>
+            <w:pPr>
+              <w:pStyle w:val="NoSpacing"/>
+              <w:rPr>
+                <w:rFonts w:ascii="Times New Roman" w:hAnsi="Times New Roman" w:cs="Times New Roman"/>
+                <w:b/>
+                <w:color w:val="002060"/>
+                <w:szCs w:val="24"/>
+                <w:u w:val="single"/>
+              </w:rPr>
+            </w:pPr>
+            <w:r>
+              <w:rPr>
+                <w:rFonts w:ascii="Times New Roman" w:hAnsi="Times New Roman" w:cs="Times New Roman"/>
+                <w:szCs w:val="24"/>
+              </w:rPr>
+              <w:t>Birth Date</w:t>
+            </w:r>
+            <w:r>
+              <w:rPr>
+                <w:rFonts w:ascii="Times New Roman" w:hAnsi="Times New Roman" w:cs="Times New Roman"/>
+                <w:szCs w:val="24"/>
+              </w:rPr>
+              <w:tab/>
+            </w:r>
+            <w:r>
+              <w:rPr>
+                <w:rFonts w:ascii="Times New Roman" w:hAnsi="Times New Roman" w:cs="Times New Roman"/>
+                <w:szCs w:val="24"/>
+              </w:rPr>
+              <w:tab/>
+              <w:t>:</w:t>
+            </w:r>
+          </w:p>
+        </w:tc>
+        <w:tc>
+          <w:tcPr>
+            <w:tcW w:w="2841" w:type="dxa"/>
+          </w:tcPr>
+          <w:p>
+            <w:pPr>
+              <w:pStyle w:val="NoSpacing"/>
+              <w:rPr>
+                <w:rFonts w:ascii="Times New Roman" w:hAnsi="Times New Roman" w:cs="Times New Roman"/>
+                <w:b/>
+                <w:color w:val="002060"/>
+                <w:szCs w:val="24"/>
+                <w:u w:val="single"/>
+              </w:rPr>
+            </w:pPr>
+            <w:r>
+              <w:rPr>
+                <w:rFonts w:ascii="Times New Roman" w:hAnsi="Times New Roman" w:cs="Times New Roman"/>
+                <w:szCs w:val="24"/>
+              </w:rPr>
+              <w:t>${</w:t>
+            </w:r>
+            <w:proofErr w:type="spellStart"/>
+            <w:r>
+              <w:rPr>
+                <w:rFonts w:ascii="Times New Roman" w:hAnsi="Times New Roman" w:cs="Times New Roman"/>
+                <w:szCs w:val="24"/>
+              </w:rPr>
+              <w:t>BirthDate</w:t>
+            </w:r>
+            <w:proofErr w:type="spellEnd"/>
+            <w:r>
+              <w:rPr>
+                <w:rFonts w:ascii="Times New Roman" w:hAnsi="Times New Roman" w:cs="Times New Roman"/>
+                <w:szCs w:val="24"/>
+              </w:rPr>
+              <w:t>}</w:t>
+            </w:r>
+          </w:p>
+        </w:tc>
+        <w:tc>
+          <w:tcPr>
+            <w:tcW w:w="2842" w:type="dxa"/>
+          </w:tcPr>
+          <w:p>
+            <w:pPr>
+              <w:pStyle w:val="NoSpacing"/>
+              <w:rPr>
+                <w:rFonts w:ascii="Times New Roman" w:hAnsi="Times New Roman" w:cs="Times New Roman"/>
+                <w:b/>
+                <w:color w:val="002060"/>
+                <w:szCs w:val="24"/>
+                <w:u w:val="single"/>
+              </w:rPr>
+            </w:pPr>
+            <w:r>
+              <w:rPr>
+                <w:rFonts w:ascii="Times New Roman" w:hAnsi="Times New Roman" w:cs="Times New Roman"/>
+                <w:szCs w:val="24"/>
+              </w:rPr>
+              <w:t>Religion</w:t>
+            </w:r>
+            <w:r>
+              <w:rPr>
+                <w:rFonts w:ascii="Times New Roman" w:hAnsi="Times New Roman" w:cs="Times New Roman"/>
+                <w:szCs w:val="24"/>
+              </w:rPr>
+              <w:tab/>
+            </w:r>
+            <w:r>
+              <w:rPr>
+                <w:rFonts w:ascii="Times New Roman" w:hAnsi="Times New Roman" w:cs="Times New Roman"/>
+                <w:szCs w:val="24"/>
+              </w:rPr>
+              <w:tab/>
+            </w:r>
+            <w:r>
+              <w:rPr>
+                <w:rFonts w:ascii="Times New Roman" w:hAnsi="Times New Roman" w:cs="Times New Roman"/>
+                <w:szCs w:val="24"/>
+              </w:rPr>
+              <w:t>:</w:t>
+            </w:r>
+          </w:p>
+        </w:tc>
+        <w:tc>
+          <w:tcPr>
+            <w:tcW w:w="2842" w:type="dxa"/>
+          </w:tcPr>
+          <w:p>
+            <w:pPr>
+              <w:pStyle w:val="NoSpacing"/>
+              <w:rPr>
+                <w:rFonts w:ascii="Times New Roman" w:hAnsi="Times New Roman" w:cs="Times New Roman"/>
+                <w:b/>
+                <w:color w:val="002060"/>
+                <w:szCs w:val="24"/>
+                <w:u w:val="single"/>
+              </w:rPr>
+            </w:pPr>
+            <w:r>
+              <w:rPr>
+                <w:rFonts w:ascii="Times New Roman" w:hAnsi="Times New Roman" w:cs="Times New Roman"/>
+                <w:szCs w:val="24"/>
+              </w:rPr>
+              <w:t>${Religion}</w:t>
+            </w:r>
+          </w:p>
+        </w:tc>
+      </w:tr>
+      <w:tr>
+        <w:tc>
+          <w:tcPr>
+            <w:tcW w:w="2841" w:type="dxa"/>
+          </w:tcPr>
+          <w:p>
+            <w:pPr>
+              <w:pStyle w:val="NoSpacing"/>
+              <w:rPr>
+                <w:rFonts w:ascii="Times New Roman" w:hAnsi="Times New Roman" w:cs="Times New Roman"/>
+                <w:b/>
+                <w:color w:val="002060"/>
+                <w:szCs w:val="24"/>
+                <w:u w:val="single"/>
+              </w:rPr>
+            </w:pPr>
+            <w:r>
+              <w:rPr>
+                <w:rFonts w:ascii="Times New Roman" w:hAnsi="Times New Roman" w:cs="Times New Roman"/>
+                <w:szCs w:val="24"/>
+              </w:rPr>
+              <w:t>Birth Place</w:t>
+            </w:r>
+            <w:r>
+              <w:rPr>
+                <w:rFonts w:ascii="Times New Roman" w:hAnsi="Times New Roman" w:cs="Times New Roman"/>
+                <w:szCs w:val="24"/>
+              </w:rPr>
+              <w:tab/>
+            </w:r>
+            <w:r>
+              <w:rPr>
+                <w:rFonts w:ascii="Times New Roman" w:hAnsi="Times New Roman" w:cs="Times New Roman"/>
+                <w:szCs w:val="24"/>
+              </w:rPr>
+              <w:tab/>
+              <w:t>:</w:t>
+            </w:r>
+          </w:p>
+        </w:tc>
+        <w:tc>
+          <w:tcPr>
+            <w:tcW w:w="2841" w:type="dxa"/>
+          </w:tcPr>
+          <w:p>
+            <w:pPr>
+              <w:pStyle w:val="NoSpacing"/>
+              <w:rPr>
+                <w:rFonts w:ascii="Times New Roman" w:hAnsi="Times New Roman" w:cs="Times New Roman"/>
+                <w:b/>
+                <w:color w:val="002060"/>
+                <w:szCs w:val="24"/>
+                <w:u w:val="single"/>
+              </w:rPr>
+            </w:pPr>
+            <w:r>
+              <w:rPr>
+                <w:rFonts w:ascii="Times New Roman" w:hAnsi="Times New Roman" w:cs="Times New Roman"/>
+                <w:szCs w:val="24"/>
+              </w:rPr>
+              <w:t>${</w:t>
+            </w:r>
+            <w:proofErr w:type="spellStart"/>
+            <w:r>
+              <w:rPr>
+                <w:rFonts w:ascii="Times New Roman" w:hAnsi="Times New Roman" w:cs="Times New Roman"/>
+                <w:szCs w:val="24"/>
+              </w:rPr>
+              <w:t>BirthPlace</w:t>
+            </w:r>
+            <w:proofErr w:type="spellEnd"/>
+            <w:r>
+              <w:rPr>
+                <w:rFonts w:ascii="Times New Roman" w:hAnsi="Times New Roman" w:cs="Times New Roman"/>
+                <w:szCs w:val="24"/>
+              </w:rPr>
+              <w:t>}</w:t>
+            </w:r>
+          </w:p>
+        </w:tc>
+        <w:tc>
+          <w:tcPr>
+            <w:tcW w:w="2842" w:type="dxa"/>
+          </w:tcPr>
+          <w:p>
+            <w:pPr>
+              <w:pStyle w:val="NoSpacing"/>
+              <w:rPr>
+                <w:rFonts w:ascii="Times New Roman" w:hAnsi="Times New Roman" w:cs="Times New Roman"/>
+                <w:b/>
+                <w:color w:val="002060"/>
+                <w:szCs w:val="24"/>
+                <w:u w:val="single"/>
+              </w:rPr>
+            </w:pPr>
+            <w:r>
+              <w:rPr>
+                <w:rFonts w:ascii="Times New Roman" w:hAnsi="Times New Roman" w:cs="Times New Roman"/>
+                <w:szCs w:val="24"/>
+              </w:rPr>
+              <w:t>Height</w:t>
+            </w:r>
+            <w:r>
+              <w:rPr>
+                <w:rFonts w:ascii="Times New Roman" w:hAnsi="Times New Roman" w:cs="Times New Roman"/>
+                <w:szCs w:val="24"/>
+              </w:rPr>
+              <w:tab/>
+            </w:r>
+            <w:r>
+              <w:rPr>
+                <w:rFonts w:ascii="Times New Roman" w:hAnsi="Times New Roman" w:cs="Times New Roman"/>
+                <w:szCs w:val="24"/>
+              </w:rPr>
+              <w:tab/>
+            </w:r>
+            <w:r>
+              <w:rPr>
+                <w:rFonts w:ascii="Times New Roman" w:hAnsi="Times New Roman" w:cs="Times New Roman"/>
+                <w:szCs w:val="24"/>
+              </w:rPr>
+              <w:tab/>
+              <w:t>:</w:t>
+            </w:r>
+          </w:p>
+        </w:tc>
+        <w:tc>
+          <w:tcPr>
+            <w:tcW w:w="2842" w:type="dxa"/>
+          </w:tcPr>
+          <w:p>
+            <w:pPr>
+              <w:pStyle w:val="NoSpacing"/>
+              <w:rPr>
+                <w:rFonts w:ascii="Times New Roman" w:hAnsi="Times New Roman" w:cs="Times New Roman"/>
+                <w:b/>
+                <w:color w:val="002060"/>
+                <w:szCs w:val="24"/>
+                <w:u w:val="single"/>
+              </w:rPr>
+            </w:pPr>
+            <w:r>
+              <w:rPr>
+                <w:rFonts w:ascii="Times New Roman" w:hAnsi="Times New Roman" w:cs="Times New Roman"/>
+                <w:szCs w:val="24"/>
+              </w:rPr>
+              <w:t>${Height}</w:t>
+            </w:r>
+          </w:p>
+        </w:tc>
+      </w:tr>
+      <w:tr>
+        <w:tc>
+          <w:tcPr>
+            <w:tcW w:w="2841" w:type="dxa"/>
+          </w:tcPr>
+          <w:p>
+            <w:pPr>
+              <w:pStyle w:val="NoSpacing"/>
+              <w:rPr>
+                <w:rFonts w:ascii="Times New Roman" w:hAnsi="Times New Roman" w:cs="Times New Roman"/>
+                <w:b/>
+                <w:color w:val="002060"/>
+                <w:szCs w:val="24"/>
+                <w:u w:val="single"/>
+              </w:rPr>
+            </w:pPr>
+            <w:r>
+              <w:rPr>
+                <w:rFonts w:ascii="Times New Roman" w:hAnsi="Times New Roman" w:cs="Times New Roman"/>
+                <w:szCs w:val="24"/>
+              </w:rPr>
+              <w:t>Age</w:t>
+            </w:r>
+            <w:r>
+              <w:rPr>
+                <w:rFonts w:ascii="Times New Roman" w:hAnsi="Times New Roman" w:cs="Times New Roman"/>
+                <w:szCs w:val="24"/>
+              </w:rPr>
+              <w:tab/>
+            </w:r>
+            <w:r>
+              <w:rPr>
+                <w:rFonts w:ascii="Times New Roman" w:hAnsi="Times New Roman" w:cs="Times New Roman"/>
+                <w:szCs w:val="24"/>
+              </w:rPr>
+              <w:tab/>
+            </w:r>
+            <w:r>
+              <w:rPr>
+                <w:rFonts w:ascii="Times New Roman" w:hAnsi="Times New Roman" w:cs="Times New Roman"/>
+                <w:szCs w:val="24"/>
+              </w:rPr>
+              <w:tab/>
+              <w:t>:</w:t>
+            </w:r>
+          </w:p>
+        </w:tc>
+        <w:tc>
+          <w:tcPr>
+            <w:tcW w:w="2841" w:type="dxa"/>
+          </w:tcPr>
+          <w:p>
+            <w:pPr>
+              <w:pStyle w:val="NoSpacing"/>
+              <w:rPr>
+                <w:rFonts w:ascii="Times New Roman" w:hAnsi="Times New Roman" w:cs="Times New Roman"/>
+                <w:b/>
+                <w:color w:val="002060"/>
+                <w:szCs w:val="24"/>
+                <w:u w:val="single"/>
+              </w:rPr>
+            </w:pPr>
+            <w:r>
+              <w:rPr>
+                <w:rFonts w:ascii="Times New Roman" w:hAnsi="Times New Roman" w:cs="Times New Roman"/>
+                <w:szCs w:val="24"/>
+              </w:rPr>
+              <w:t>${Age}</w:t>
+            </w:r>
+            <w:r>
+              <w:rPr>
+                <w:rFonts w:ascii="Times New Roman" w:hAnsi="Times New Roman" w:cs="Times New Roman"/>
+                <w:szCs w:val="24"/>
+              </w:rPr>
+              <w:tab/>
+            </w:r>
+          </w:p>
+        </w:tc>
+        <w:tc>
+          <w:tcPr>
+            <w:tcW w:w="2842" w:type="dxa"/>
+          </w:tcPr>
+          <w:p>
+            <w:pPr>
+              <w:pStyle w:val="NoSpacing"/>
+              <w:rPr>
+                <w:rFonts w:ascii="Times New Roman" w:hAnsi="Times New Roman" w:cs="Times New Roman"/>
+                <w:b/>
+                <w:color w:val="002060"/>
+                <w:szCs w:val="24"/>
+                <w:u w:val="single"/>
+              </w:rPr>
+            </w:pPr>
+            <w:r>
+              <w:rPr>
+                <w:rFonts w:ascii="Times New Roman" w:hAnsi="Times New Roman" w:cs="Times New Roman"/>
+                <w:szCs w:val="24"/>
+              </w:rPr>
+              <w:t>Weight</w:t>
+            </w:r>
+            <w:r>
+              <w:rPr>
+                <w:rFonts w:ascii="Times New Roman" w:hAnsi="Times New Roman" w:cs="Times New Roman"/>
+                <w:szCs w:val="24"/>
+              </w:rPr>
+              <w:tab/>
+            </w:r>
+            <w:r>
+              <w:rPr>
+                <w:rFonts w:ascii="Times New Roman" w:hAnsi="Times New Roman" w:cs="Times New Roman"/>
+                <w:szCs w:val="24"/>
+              </w:rPr>
+              <w:tab/>
+            </w:r>
+            <w:r>
+              <w:rPr>
+                <w:rFonts w:ascii="Times New Roman" w:hAnsi="Times New Roman" w:cs="Times New Roman"/>
+                <w:szCs w:val="24"/>
+              </w:rPr>
+              <w:tab/>
+              <w:t>:</w:t>
+            </w:r>
+          </w:p>
+        </w:tc>
+        <w:tc>
+          <w:tcPr>
+            <w:tcW w:w="2842" w:type="dxa"/>
+          </w:tcPr>
+          <w:p>
+            <w:pPr>
+              <w:pStyle w:val="NoSpacing"/>
+              <w:rPr>
+                <w:rFonts w:ascii="Times New Roman" w:hAnsi="Times New Roman" w:cs="Times New Roman"/>
+                <w:b/>
+                <w:color w:val="002060"/>
+                <w:szCs w:val="24"/>
+                <w:u w:val="single"/>
+              </w:rPr>
+            </w:pPr>
+            <w:r>
+              <w:rPr>
+                <w:rFonts w:ascii="Times New Roman" w:hAnsi="Times New Roman" w:cs="Times New Roman"/>
+                <w:szCs w:val="24"/>
+              </w:rPr>
+              <w:t>${Weight}</w:t>
+            </w:r>
+          </w:p>
+        </w:tc>
+      </w:tr>
+      <w:tr>
+        <w:tc>
+          <w:tcPr>
+            <w:tcW w:w="2841" w:type="dxa"/>
+          </w:tcPr>
+          <w:p>
+            <w:pPr>
+              <w:pStyle w:val="NoSpacing"/>
+              <w:rPr>
+                <w:rFonts w:ascii="Times New Roman" w:hAnsi="Times New Roman" w:cs="Times New Roman"/>
+                <w:b/>
+                <w:color w:val="002060"/>
+                <w:szCs w:val="24"/>
+                <w:u w:val="single"/>
+              </w:rPr>
+            </w:pPr>
+            <w:r>
+              <w:rPr>
+                <w:rFonts w:ascii="Times New Roman" w:hAnsi="Times New Roman" w:cs="Times New Roman"/>
+                <w:szCs w:val="24"/>
+              </w:rPr>
+              <w:t>Sex</w:t>
+            </w:r>
+            <w:r>
+              <w:rPr>
+                <w:rFonts w:ascii="Times New Roman" w:hAnsi="Times New Roman" w:cs="Times New Roman"/>
+                <w:szCs w:val="24"/>
+              </w:rPr>
+              <w:tab/>
+            </w:r>
+            <w:r>
+              <w:rPr>
+                <w:rFonts w:ascii="Times New Roman" w:hAnsi="Times New Roman" w:cs="Times New Roman"/>
+                <w:szCs w:val="24"/>
+              </w:rPr>
+              <w:tab/>
+            </w:r>
+            <w:r>
+              <w:rPr>
+                <w:rFonts w:ascii="Times New Roman" w:hAnsi="Times New Roman" w:cs="Times New Roman"/>
+                <w:szCs w:val="24"/>
+              </w:rPr>
+              <w:tab/>
+              <w:t>:</w:t>
+            </w:r>
+          </w:p>
+        </w:tc>
+        <w:tc>
+          <w:tcPr>
+            <w:tcW w:w="2841" w:type="dxa"/>
+          </w:tcPr>
+          <w:p>
+            <w:pPr>
+              <w:pStyle w:val="NoSpacing"/>
+              <w:rPr>
+                <w:rFonts w:ascii="Times New Roman" w:hAnsi="Times New Roman" w:cs="Times New Roman"/>
+                <w:b/>
+                <w:color w:val="002060"/>
+                <w:szCs w:val="24"/>
+                <w:u w:val="single"/>
+              </w:rPr>
+            </w:pPr>
+            <w:r>
+              <w:rPr>
+                <w:rFonts w:ascii="Times New Roman" w:hAnsi="Times New Roman" w:cs="Times New Roman"/>
+                <w:szCs w:val="24"/>
+              </w:rPr>
+              <w:t>${Sex}</w:t>
+            </w:r>
+          </w:p>
+        </w:tc>
+        <w:tc>
+          <w:tcPr>
+            <w:tcW w:w="2842" w:type="dxa"/>
+          </w:tcPr>
+          <w:p>
+            <w:pPr>
+              <w:pStyle w:val="NoSpacing"/>
+              <w:rPr>
+                <w:rFonts w:ascii="Times New Roman" w:hAnsi="Times New Roman" w:cs="Times New Roman"/>
+                <w:b/>
+                <w:color w:val="002060"/>
+                <w:szCs w:val="24"/>
+                <w:u w:val="single"/>
+              </w:rPr>
+            </w:pPr>
+            <w:r>
+              <w:rPr>
+                <w:rFonts w:ascii="Times New Roman" w:hAnsi="Times New Roman" w:cs="Times New Roman"/>
+                <w:szCs w:val="24"/>
+              </w:rPr>
+              <w:t>Language Spoken</w:t>
+            </w:r>
+            <w:r>
+              <w:rPr>
+                <w:rFonts w:ascii="Times New Roman" w:hAnsi="Times New Roman" w:cs="Times New Roman"/>
+                <w:szCs w:val="24"/>
+              </w:rPr>
+              <w:tab/>
+              <w:t>:</w:t>
+            </w:r>
+          </w:p>
+        </w:tc>
+        <w:tc>
+          <w:tcPr>
+            <w:tcW w:w="2842" w:type="dxa"/>
+          </w:tcPr>
+          <w:p>
+            <w:pPr>
+              <w:pStyle w:val="NoSpacing"/>
+              <w:rPr>
+                <w:rFonts w:ascii="Times New Roman" w:hAnsi="Times New Roman" w:cs="Times New Roman"/>
+                <w:b/>
+                <w:color w:val="002060"/>
+                <w:szCs w:val="24"/>
+                <w:u w:val="single"/>
+              </w:rPr>
+            </w:pPr>
+            <w:r>
+              <w:rPr>
+                <w:rFonts w:ascii="Times New Roman" w:hAnsi="Times New Roman" w:cs="Times New Roman"/>
+                <w:szCs w:val="24"/>
+              </w:rPr>
+              <w:t>${Language}</w:t>
+            </w:r>
+          </w:p>
+        </w:tc>
+      </w:tr>
+      <w:tr>
+        <w:tc>
+          <w:tcPr>
+            <w:tcW w:w="2841" w:type="dxa"/>
+          </w:tcPr>
+          <w:p>
+            <w:pPr>
+              <w:pStyle w:val="NoSpacing"/>
+              <w:rPr>
+                <w:rFonts w:ascii="Times New Roman" w:hAnsi="Times New Roman" w:cs="Times New Roman"/>
+                <w:b/>
+                <w:color w:val="002060"/>
+                <w:szCs w:val="24"/>
+                <w:u w:val="single"/>
+              </w:rPr>
+            </w:pPr>
+            <w:r>
+              <w:rPr>
+                <w:rFonts w:ascii="Times New Roman" w:hAnsi="Times New Roman" w:cs="Times New Roman"/>
+                <w:szCs w:val="24"/>
+              </w:rPr>
+              <w:t>Civil Status</w:t>
+            </w:r>
+            <w:r>
+              <w:rPr>
+                <w:rFonts w:ascii="Times New Roman" w:hAnsi="Times New Roman" w:cs="Times New Roman"/>
+                <w:szCs w:val="24"/>
+              </w:rPr>
+              <w:tab/>
+            </w:r>
+            <w:r>
+              <w:rPr>
+                <w:rFonts w:ascii="Times New Roman" w:hAnsi="Times New Roman" w:cs="Times New Roman"/>
+                <w:szCs w:val="24"/>
+              </w:rPr>
+              <w:tab/>
+            </w:r>
+            <w:r>
+              <w:rPr>
+                <w:rFonts w:ascii="Times New Roman" w:hAnsi="Times New Roman" w:cs="Times New Roman"/>
+                <w:szCs w:val="24"/>
+              </w:rPr>
+              <w:t>:</w:t>
+            </w:r>
+          </w:p>
+        </w:tc>
+        <w:tc>
+          <w:tcPr>
+            <w:tcW w:w="2841" w:type="dxa"/>
+          </w:tcPr>
+          <w:p>
+            <w:pPr>
+              <w:pStyle w:val="NoSpacing"/>
+              <w:rPr>
+                <w:rFonts w:ascii="Times New Roman" w:hAnsi="Times New Roman" w:cs="Times New Roman"/>
+                <w:b/>
+                <w:color w:val="002060"/>
+                <w:szCs w:val="24"/>
+                <w:u w:val="single"/>
+              </w:rPr>
+            </w:pPr>
+            <w:r>
+              <w:rPr>
+                <w:rFonts w:ascii="Times New Roman" w:hAnsi="Times New Roman" w:cs="Times New Roman"/>
+                <w:szCs w:val="24"/>
+              </w:rPr>
+              <w:t>${</w:t>
+            </w:r>
+            <w:proofErr w:type="spellStart"/>
+            <w:r>
+              <w:rPr>
+                <w:rFonts w:ascii="Times New Roman" w:hAnsi="Times New Roman" w:cs="Times New Roman"/>
+                <w:szCs w:val="24"/>
+              </w:rPr>
+              <w:t>CivilStatus</w:t>
+            </w:r>
+            <w:proofErr w:type="spellEnd"/>
+            <w:r>
+              <w:rPr>
+                <w:rFonts w:ascii="Times New Roman" w:hAnsi="Times New Roman" w:cs="Times New Roman"/>
+                <w:szCs w:val="24"/>
+              </w:rPr>
+              <w:t>}</w:t>
+            </w:r>
+          </w:p>
+        </w:tc>
+        <w:tc>
+          <w:tcPr>
+            <w:tcW w:w="2842" w:type="dxa"/>
+          </w:tcPr>
+          <w:p>
+            <w:pPr>
+              <w:pStyle w:val="NoSpacing"/>
+              <w:rPr>
+                <w:rFonts w:ascii="Times New Roman" w:hAnsi="Times New Roman" w:cs="Times New Roman"/>
+                <w:b/>
+                <w:color w:val="002060"/>
+                <w:szCs w:val="24"/>
+                <w:u w:val="single"/>
+              </w:rPr>
+            </w:pPr>
+            <w:r>
+              <w:rPr>
+                <w:rFonts w:ascii="Times New Roman" w:hAnsi="Times New Roman" w:cs="Times New Roman"/>
+                <w:szCs w:val="24"/>
+              </w:rPr>
+              <w:t>Contact Person in</w:t>
+            </w:r>
+            <w:r>
+              <w:rPr>
+                <w:rFonts w:ascii="Times New Roman" w:hAnsi="Times New Roman" w:cs="Times New Roman"/>
+                <w:szCs w:val="24"/>
+              </w:rPr>
+              <w:tab/>
+              <w:t>:</w:t>
+            </w:r>
+          </w:p>
+        </w:tc>
+        <w:tc>
+          <w:tcPr>
+            <w:tcW w:w="2842" w:type="dxa"/>
+          </w:tcPr>
+          <w:p>
+            <w:pPr>
+              <w:pStyle w:val="NoSpacing"/>
+              <w:rPr>
+                <w:rFonts w:ascii="Times New Roman" w:hAnsi="Times New Roman" w:cs="Times New Roman"/>
+                <w:b/>
+                <w:color w:val="002060"/>
+                <w:szCs w:val="24"/>
+                <w:u w:val="single"/>
+              </w:rPr>
+            </w:pPr>
+            <w:r>
+              <w:rPr>
+                <w:rFonts w:ascii="Times New Roman" w:hAnsi="Times New Roman" w:cs="Times New Roman"/>
+                <w:szCs w:val="24"/>
+              </w:rPr>
+              <w:t>${</w:t>
+            </w:r>
+            <w:proofErr w:type="spellStart"/>
+            <w:r>
+              <w:rPr>
+                <w:rFonts w:ascii="Times New Roman" w:hAnsi="Times New Roman" w:cs="Times New Roman"/>
+                <w:szCs w:val="24"/>
+              </w:rPr>
+              <w:t>EmergencyContactName</w:t>
+            </w:r>
+            <w:proofErr w:type="spellEnd"/>
+            <w:r>
+              <w:rPr>
+                <w:rFonts w:ascii="Times New Roman" w:hAnsi="Times New Roman" w:cs="Times New Roman"/>
+                <w:szCs w:val="24"/>
+              </w:rPr>
+              <w:t>}</w:t>
+            </w:r>
+          </w:p>
+        </w:tc>
+      </w:tr>
+      <w:tr>
+        <w:tc>
+          <w:tcPr>
+            <w:tcW w:w="2841" w:type="dxa"/>
+          </w:tcPr>
+          <w:p>
+            <w:pPr>
+              <w:pStyle w:val="NoSpacing"/>
+              <w:rPr>
+                <w:rFonts w:ascii="Times New Roman" w:hAnsi="Times New Roman" w:cs="Times New Roman"/>
+                <w:b/>
+                <w:color w:val="002060"/>
+                <w:szCs w:val="24"/>
+                <w:u w:val="single"/>
+              </w:rPr>
+            </w:pPr>
+            <w:r>
+              <w:rPr>
+                <w:rFonts w:ascii="Times New Roman" w:hAnsi="Times New Roman" w:cs="Times New Roman"/>
+                <w:szCs w:val="24"/>
+              </w:rPr>
+              <w:t>Nationality</w:t>
+            </w:r>
+            <w:r>
+              <w:rPr>
+                <w:rFonts w:ascii="Times New Roman" w:hAnsi="Times New Roman" w:cs="Times New Roman"/>
+                <w:szCs w:val="24"/>
+              </w:rPr>
+              <w:tab/>
+            </w:r>
+            <w:r>
+              <w:rPr>
+                <w:rFonts w:ascii="Times New Roman" w:hAnsi="Times New Roman" w:cs="Times New Roman"/>
+                <w:szCs w:val="24"/>
+              </w:rPr>
+              <w:tab/>
+              <w:t>:</w:t>
+            </w:r>
+          </w:p>
+        </w:tc>
+        <w:tc>
+          <w:tcPr>
+            <w:tcW w:w="2841" w:type="dxa"/>
+          </w:tcPr>
+          <w:p>
+            <w:pPr>
+              <w:pStyle w:val="NoSpacing"/>
+              <w:rPr>
+                <w:rFonts w:ascii="Times New Roman" w:hAnsi="Times New Roman" w:cs="Times New Roman"/>
+                <w:b/>
+                <w:color w:val="002060"/>
+                <w:szCs w:val="24"/>
+                <w:u w:val="single"/>
+              </w:rPr>
+            </w:pPr>
+            <w:r>
+              <w:rPr>
+                <w:rFonts w:ascii="Times New Roman" w:hAnsi="Times New Roman" w:cs="Times New Roman"/>
+                <w:szCs w:val="24"/>
+              </w:rPr>
+              <w:t>${Nationality}</w:t>
+            </w:r>
+          </w:p>
+        </w:tc>
+        <w:tc>
+          <w:tcPr>
+            <w:tcW w:w="2842" w:type="dxa"/>
+          </w:tcPr>
+          <w:p>
+            <w:pPr>
+              <w:pStyle w:val="NoSpacing"/>
+              <w:rPr>
+                <w:rFonts w:ascii="Times New Roman" w:hAnsi="Times New Roman" w:cs="Times New Roman"/>
+                <w:b/>
+                <w:color w:val="002060"/>
+                <w:szCs w:val="24"/>
+                <w:u w:val="single"/>
+              </w:rPr>
+            </w:pPr>
+            <w:r>
+              <w:rPr>
+                <w:rFonts w:ascii="Times New Roman" w:hAnsi="Times New Roman" w:cs="Times New Roman"/>
+                <w:szCs w:val="24"/>
+              </w:rPr>
+              <w:t>case of Emergency</w:t>
+            </w:r>
+            <w:r>
+              <w:rPr>
+                <w:rFonts w:ascii="Times New Roman" w:hAnsi="Times New Roman" w:cs="Times New Roman"/>
+                <w:szCs w:val="24"/>
+              </w:rPr>
+              <w:tab/>
+              <w:t>:</w:t>
+            </w:r>
+          </w:p>
+        </w:tc>
+        <w:tc>
+          <w:tcPr>
+            <w:tcW w:w="2842" w:type="dxa"/>
+          </w:tcPr>
+          <w:p>
+            <w:pPr>
+              <w:pStyle w:val="NoSpacing"/>
+              <w:rPr>
+                <w:rFonts w:ascii="Times New Roman" w:hAnsi="Times New Roman" w:cs="Times New Roman"/>
+                <w:b/>
+                <w:color w:val="002060"/>
+                <w:szCs w:val="24"/>
+                <w:u w:val="single"/>
+              </w:rPr>
+            </w:pPr>
+            <w:r>
+              <w:rPr>
+                <w:rFonts w:ascii="Times New Roman" w:hAnsi="Times New Roman" w:cs="Times New Roman"/>
+                <w:szCs w:val="24"/>
+              </w:rPr>
+              <w:t>${</w:t>
+            </w:r>
+            <w:proofErr w:type="spellStart"/>
+            <w:r>
+              <w:rPr>
+                <w:rFonts w:ascii="Times New Roman" w:hAnsi="Times New Roman" w:cs="Times New Roman"/>
+                <w:szCs w:val="24"/>
+              </w:rPr>
+              <w:t>EmergencyContact</w:t>
+            </w:r>
+            <w:proofErr w:type="spellEnd"/>
+            <w:r>
+              <w:rPr>
+                <w:rFonts w:ascii="Times New Roman" w:hAnsi="Times New Roman" w:cs="Times New Roman"/>
+                <w:szCs w:val="24"/>
+              </w:rPr>
+              <w:t>}</w:t>
+            </w:r>
+          </w:p>
+        </w:tc>
+      </w:tr>
+    </w:tbl>
+    <w:p>
+      <w:pPr>
+        <w:pStyle w:val="NoSpacing"/>
+        <w:rPr>
+          <w:rFonts w:ascii="Times New Roman" w:hAnsi="Times New Roman" w:cs="Times New Roman"/>
+          <w:szCs w:val="24"/>
+        </w:rPr>
+      </w:pPr>
+      <w:r>
+        <w:rPr>
+          <w:rFonts w:ascii="Times New Roman" w:hAnsi="Times New Roman" w:cs="Times New Roman"/>
+          <w:szCs w:val="24"/>
+        </w:rPr>
+        <w:tab/>
+      </w:r>
+      <w:r>
+        <w:rPr>
+          <w:rFonts w:ascii="Times New Roman" w:hAnsi="Times New Roman" w:cs="Times New Roman"/>
+          <w:szCs w:val="24"/>
+        </w:rPr>
+        <w:tab/>
+      </w:r>
+      <w:r>
+        <w:rPr>
+          <w:rFonts w:ascii="Times New Roman" w:hAnsi="Times New Roman" w:cs="Times New Roman"/>
+          <w:szCs w:val="24"/>
+        </w:rPr>
+        <w:tab/>
+      </w:r>
+      <w:r>
+        <w:rPr>
+          <w:rFonts w:ascii="Times New Roman" w:hAnsi="Times New Roman" w:cs="Times New Roman"/>
+          <w:szCs w:val="24"/>
+        </w:rPr>
+        <w:tab/>
+      </w:r>
+      <w:r>
+        <w:rPr>
+          <w:rFonts w:ascii="Times New Roman" w:hAnsi="Times New Roman" w:cs="Times New Roman"/>
+          <w:szCs w:val="24"/>
+        </w:rPr>
+        <w:tab/>
+      </w:r>
+      <w:r>
+        <w:rPr>
+          <w:rFonts w:ascii="Times New Roman" w:hAnsi="Times New Roman" w:cs="Times New Roman"/>
+          <w:szCs w:val="24"/>
+        </w:rPr>
+        <w:tab/>
+      </w:r>
+      <w:r>
+        <w:rPr>
+          <w:rFonts w:ascii="Times New Roman" w:hAnsi="Times New Roman" w:cs="Times New Roman"/>
+          <w:szCs w:val="24"/>
+        </w:rPr>
+        <w:tab/>
+      </w:r>
+      <w:r>
+        <w:rPr>
+          <w:rFonts w:ascii="Times New Roman" w:hAnsi="Times New Roman" w:cs="Times New Roman"/>
+          <w:szCs w:val="24"/>
+        </w:rPr>
+        <w:tab/>
+      </w:r>
+      <w:r>
+        <w:rPr>
+          <w:rFonts w:ascii="Times New Roman" w:hAnsi="Times New Roman" w:cs="Times New Roman"/>
+          <w:szCs w:val="24"/>
+        </w:rPr>
+        <w:tab/>
+      </w:r>
+      <w:r>
+        <w:rPr>
+          <w:rFonts w:ascii="Times New Roman" w:hAnsi="Times New Roman" w:cs="Times New Roman"/>
+          <w:szCs w:val="24"/>
+        </w:rPr>
+        <w:tab/>
+      </w:r>
     </w:p>
     <w:p>
       <w:pPr>
         <w:pStyle w:val="NoSpacing"/>
         <w:rPr>
           <w:rFonts w:ascii="Times New Roman" w:hAnsi="Times New Roman" w:cs="Times New Roman"/>
-          <w:szCs w:val="24"/>
-        </w:rPr>
-      </w:pPr>
-      <w:r>
-        <w:rPr>
-          <w:rFonts w:ascii="Times New Roman" w:hAnsi="Times New Roman" w:cs="Times New Roman"/>
-          <w:szCs w:val="24"/>
-        </w:rPr>
-        <w:t>Birth Date</w:t>
-      </w:r>
-      <w:r>
-        <w:rPr>
-          <w:rFonts w:ascii="Times New Roman" w:hAnsi="Times New Roman" w:cs="Times New Roman"/>
-          <w:szCs w:val="24"/>
-        </w:rPr>
-        <w:tab/>
-      </w:r>
-      <w:r>
-        <w:rPr>
-          <w:rFonts w:ascii="Times New Roman" w:hAnsi="Times New Roman" w:cs="Times New Roman"/>
-          <w:szCs w:val="24"/>
-        </w:rPr>
-        <w:tab/>
-        <w:t>:</w:t>
-      </w:r>
-      <w:r>
-        <w:rPr>
-          <w:rFonts w:ascii="Times New Roman" w:hAnsi="Times New Roman" w:cs="Times New Roman"/>
-          <w:szCs w:val="24"/>
-        </w:rPr>
-        <w:tab/>
-      </w:r>
-      <w:r>
-        <w:rPr>
-          <w:rFonts w:ascii="Times New Roman" w:hAnsi="Times New Roman" w:cs="Times New Roman"/>
-          <w:szCs w:val="24"/>
-        </w:rPr>
-        <w:t>${</w:t>
-      </w:r>
-      <w:proofErr w:type="spellStart"/>
-      <w:r>
-        <w:rPr>
-          <w:rFonts w:ascii="Times New Roman" w:hAnsi="Times New Roman" w:cs="Times New Roman"/>
-          <w:szCs w:val="24"/>
-        </w:rPr>
-        <w:t>BirthDate</w:t>
-      </w:r>
-      <w:proofErr w:type="spellEnd"/>
-      <w:r>
-        <w:rPr>
-          <w:rFonts w:ascii="Times New Roman" w:hAnsi="Times New Roman" w:cs="Times New Roman"/>
-          <w:szCs w:val="24"/>
-        </w:rPr>
-        <w:t>}</w:t>
-      </w:r>
-      <w:r>
-        <w:rPr>
-          <w:rFonts w:ascii="Times New Roman" w:hAnsi="Times New Roman" w:cs="Times New Roman"/>
-          <w:szCs w:val="24"/>
-        </w:rPr>
-        <w:tab/>
-      </w:r>
-      <w:r>
-        <w:rPr>
-          <w:rFonts w:ascii="Times New Roman" w:hAnsi="Times New Roman" w:cs="Times New Roman"/>
-          <w:szCs w:val="24"/>
-        </w:rPr>
-        <w:tab/>
-      </w:r>
-      <w:r>
-        <w:rPr>
-          <w:rFonts w:ascii="Times New Roman" w:hAnsi="Times New Roman" w:cs="Times New Roman"/>
-          <w:szCs w:val="24"/>
-        </w:rPr>
-        <w:tab/>
-      </w:r>
-      <w:r>
-        <w:rPr>
-          <w:rFonts w:ascii="Times New Roman" w:hAnsi="Times New Roman" w:cs="Times New Roman"/>
-          <w:szCs w:val="24"/>
-        </w:rPr>
-        <w:t>Religion</w:t>
-      </w:r>
-      <w:r>
-        <w:rPr>
-          <w:rFonts w:ascii="Times New Roman" w:hAnsi="Times New Roman" w:cs="Times New Roman"/>
-          <w:szCs w:val="24"/>
-        </w:rPr>
-        <w:tab/>
-      </w:r>
-      <w:r>
-        <w:rPr>
-          <w:rFonts w:ascii="Times New Roman" w:hAnsi="Times New Roman" w:cs="Times New Roman"/>
-          <w:szCs w:val="24"/>
-        </w:rPr>
-        <w:tab/>
-      </w:r>
-      <w:r>
-        <w:rPr>
-          <w:rFonts w:ascii="Times New Roman" w:hAnsi="Times New Roman" w:cs="Times New Roman"/>
-          <w:szCs w:val="24"/>
-        </w:rPr>
-        <w:t>:</w:t>
-      </w:r>
-      <w:r>
-        <w:rPr>
-          <w:rFonts w:ascii="Times New Roman" w:hAnsi="Times New Roman" w:cs="Times New Roman"/>
-          <w:szCs w:val="24"/>
-        </w:rPr>
-        <w:tab/>
-      </w:r>
-      <w:r>
-        <w:rPr>
-          <w:rFonts w:ascii="Times New Roman" w:hAnsi="Times New Roman" w:cs="Times New Roman"/>
-          <w:szCs w:val="24"/>
-        </w:rPr>
-        <w:t>${Religion}</w:t>
+          <w:color w:val="002060"/>
+          <w:szCs w:val="24"/>
+          <w:u w:val="single"/>
+        </w:rPr>
+      </w:pPr>
+      <w:r>
+        <w:rPr>
+          <w:rFonts w:ascii="Times New Roman" w:hAnsi="Times New Roman" w:cs="Times New Roman"/>
+          <w:b/>
+          <w:color w:val="002060"/>
+          <w:szCs w:val="24"/>
+          <w:u w:val="single"/>
+        </w:rPr>
+        <w:t>EDUCATIONAL BACKGROUND</w:t>
       </w:r>
     </w:p>
     <w:p>
@@ -658,19 +1672,14 @@
         <w:pStyle w:val="NoSpacing"/>
         <w:rPr>
           <w:rFonts w:ascii="Times New Roman" w:hAnsi="Times New Roman" w:cs="Times New Roman"/>
-          <w:szCs w:val="24"/>
-        </w:rPr>
-      </w:pPr>
-      <w:r>
-        <w:rPr>
-          <w:rFonts w:ascii="Times New Roman" w:hAnsi="Times New Roman" w:cs="Times New Roman"/>
-          <w:szCs w:val="24"/>
-        </w:rPr>
-        <w:t>Birth Place</w:t>
-      </w:r>
-      <w:r>
-        <w:rPr>
-          <w:rFonts w:ascii="Times New Roman" w:hAnsi="Times New Roman" w:cs="Times New Roman"/>
+          <w:b/>
+          <w:szCs w:val="24"/>
+        </w:rPr>
+      </w:pPr>
+      <w:r>
+        <w:rPr>
+          <w:rFonts w:ascii="Times New Roman" w:hAnsi="Times New Roman" w:cs="Times New Roman"/>
+          <w:b/>
           <w:szCs w:val="24"/>
         </w:rPr>
         <w:tab/>
@@ -678,27 +1687,7 @@
       <w:r>
         <w:rPr>
           <w:rFonts w:ascii="Times New Roman" w:hAnsi="Times New Roman" w:cs="Times New Roman"/>
-          <w:szCs w:val="24"/>
-        </w:rPr>
-        <w:tab/>
-      </w:r>
-      <w:r>
-        <w:rPr>
-          <w:rFonts w:ascii="Times New Roman" w:hAnsi="Times New Roman" w:cs="Times New Roman"/>
-          <w:szCs w:val="24"/>
-        </w:rPr>
-        <w:t>:</w:t>
-      </w:r>
-      <w:r>
-        <w:rPr>
-          <w:rFonts w:ascii="Times New Roman" w:hAnsi="Times New Roman" w:cs="Times New Roman"/>
-          <w:szCs w:val="24"/>
-        </w:rPr>
-        <w:tab/>
-      </w:r>
-      <w:r>
-        <w:rPr>
-          <w:rFonts w:ascii="Times New Roman" w:hAnsi="Times New Roman" w:cs="Times New Roman"/>
+          <w:b/>
           <w:szCs w:val="24"/>
         </w:rPr>
         <w:t>${</w:t>
@@ -707,75 +1696,19 @@
       <w:r>
         <w:rPr>
           <w:rFonts w:ascii="Times New Roman" w:hAnsi="Times New Roman" w:cs="Times New Roman"/>
-          <w:szCs w:val="24"/>
-        </w:rPr>
-        <w:t>BirthPlace</w:t>
+          <w:b/>
+          <w:szCs w:val="24"/>
+        </w:rPr>
+        <w:t>block_tertiary</w:t>
       </w:r>
       <w:proofErr w:type="spellEnd"/>
       <w:r>
         <w:rPr>
           <w:rFonts w:ascii="Times New Roman" w:hAnsi="Times New Roman" w:cs="Times New Roman"/>
+          <w:b/>
           <w:szCs w:val="24"/>
         </w:rPr>
         <w:t>}</w:t>
-      </w:r>
-      <w:r>
-        <w:rPr>
-          <w:rFonts w:ascii="Times New Roman" w:hAnsi="Times New Roman" w:cs="Times New Roman"/>
-          <w:szCs w:val="24"/>
-        </w:rPr>
-        <w:tab/>
-      </w:r>
-      <w:r>
-        <w:rPr>
-          <w:rFonts w:ascii="Times New Roman" w:hAnsi="Times New Roman" w:cs="Times New Roman"/>
-          <w:szCs w:val="24"/>
-        </w:rPr>
-        <w:tab/>
-      </w:r>
-      <w:r>
-        <w:rPr>
-          <w:rFonts w:ascii="Times New Roman" w:hAnsi="Times New Roman" w:cs="Times New Roman"/>
-          <w:szCs w:val="24"/>
-        </w:rPr>
-        <w:tab/>
-        <w:t>Height</w:t>
-      </w:r>
-      <w:r>
-        <w:rPr>
-          <w:rFonts w:ascii="Times New Roman" w:hAnsi="Times New Roman" w:cs="Times New Roman"/>
-          <w:szCs w:val="24"/>
-        </w:rPr>
-        <w:tab/>
-      </w:r>
-      <w:r>
-        <w:rPr>
-          <w:rFonts w:ascii="Times New Roman" w:hAnsi="Times New Roman" w:cs="Times New Roman"/>
-          <w:szCs w:val="24"/>
-        </w:rPr>
-        <w:tab/>
-      </w:r>
-      <w:r>
-        <w:rPr>
-          <w:rFonts w:ascii="Times New Roman" w:hAnsi="Times New Roman" w:cs="Times New Roman"/>
-          <w:szCs w:val="24"/>
-        </w:rPr>
-        <w:tab/>
-        <w:t>:</w:t>
-      </w:r>
-      <w:r>
-        <w:rPr>
-          <w:rFonts w:ascii="Times New Roman" w:hAnsi="Times New Roman" w:cs="Times New Roman"/>
-          <w:szCs w:val="24"/>
-        </w:rPr>
-        <w:tab/>
-      </w:r>
-      <w:r>
-        <w:rPr>
-          <w:rFonts w:ascii="Times New Roman" w:hAnsi="Times New Roman" w:cs="Times New Roman"/>
-          <w:szCs w:val="24"/>
-        </w:rPr>
-        <w:t>${Height}</w:t>
       </w:r>
     </w:p>
     <w:p>
@@ -783,646 +1716,10 @@
         <w:pStyle w:val="NoSpacing"/>
         <w:rPr>
           <w:rFonts w:ascii="Times New Roman" w:hAnsi="Times New Roman" w:cs="Times New Roman"/>
-          <w:szCs w:val="24"/>
-        </w:rPr>
-      </w:pPr>
-      <w:r>
-        <w:rPr>
-          <w:rFonts w:ascii="Times New Roman" w:hAnsi="Times New Roman" w:cs="Times New Roman"/>
-          <w:szCs w:val="24"/>
-        </w:rPr>
-        <w:t>Age</w:t>
-      </w:r>
-      <w:r>
-        <w:rPr>
-          <w:rFonts w:ascii="Times New Roman" w:hAnsi="Times New Roman" w:cs="Times New Roman"/>
-          <w:szCs w:val="24"/>
-        </w:rPr>
-        <w:tab/>
-      </w:r>
-      <w:r>
-        <w:rPr>
-          <w:rFonts w:ascii="Times New Roman" w:hAnsi="Times New Roman" w:cs="Times New Roman"/>
-          <w:szCs w:val="24"/>
-        </w:rPr>
-        <w:tab/>
-      </w:r>
-      <w:r>
-        <w:rPr>
-          <w:rFonts w:ascii="Times New Roman" w:hAnsi="Times New Roman" w:cs="Times New Roman"/>
-          <w:szCs w:val="24"/>
-        </w:rPr>
-        <w:tab/>
-      </w:r>
-      <w:r>
-        <w:rPr>
-          <w:rFonts w:ascii="Times New Roman" w:hAnsi="Times New Roman" w:cs="Times New Roman"/>
-          <w:szCs w:val="24"/>
-        </w:rPr>
-        <w:t>:</w:t>
-      </w:r>
-      <w:r>
-        <w:rPr>
-          <w:rFonts w:ascii="Times New Roman" w:hAnsi="Times New Roman" w:cs="Times New Roman"/>
-          <w:szCs w:val="24"/>
-        </w:rPr>
-        <w:tab/>
-      </w:r>
-      <w:r>
-        <w:rPr>
-          <w:rFonts w:ascii="Times New Roman" w:hAnsi="Times New Roman" w:cs="Times New Roman"/>
-          <w:szCs w:val="24"/>
-        </w:rPr>
-        <w:t>${Age}</w:t>
-      </w:r>
-      <w:r>
-        <w:rPr>
-          <w:rFonts w:ascii="Times New Roman" w:hAnsi="Times New Roman" w:cs="Times New Roman"/>
-          <w:szCs w:val="24"/>
-        </w:rPr>
-        <w:tab/>
-      </w:r>
-      <w:r>
-        <w:rPr>
-          <w:rFonts w:ascii="Times New Roman" w:hAnsi="Times New Roman" w:cs="Times New Roman"/>
-          <w:szCs w:val="24"/>
-        </w:rPr>
-        <w:tab/>
-      </w:r>
-      <w:r>
-        <w:rPr>
-          <w:rFonts w:ascii="Times New Roman" w:hAnsi="Times New Roman" w:cs="Times New Roman"/>
-          <w:szCs w:val="24"/>
-        </w:rPr>
-        <w:tab/>
-      </w:r>
-      <w:r>
-        <w:rPr>
-          <w:rFonts w:ascii="Times New Roman" w:hAnsi="Times New Roman" w:cs="Times New Roman"/>
-          <w:szCs w:val="24"/>
-        </w:rPr>
-        <w:tab/>
-      </w:r>
-      <w:r>
-        <w:rPr>
-          <w:rFonts w:ascii="Times New Roman" w:hAnsi="Times New Roman" w:cs="Times New Roman"/>
-          <w:szCs w:val="24"/>
-        </w:rPr>
-        <w:t>Weight</w:t>
-      </w:r>
-      <w:r>
-        <w:rPr>
-          <w:rFonts w:ascii="Times New Roman" w:hAnsi="Times New Roman" w:cs="Times New Roman"/>
-          <w:szCs w:val="24"/>
-        </w:rPr>
-        <w:tab/>
-      </w:r>
-      <w:r>
-        <w:rPr>
-          <w:rFonts w:ascii="Times New Roman" w:hAnsi="Times New Roman" w:cs="Times New Roman"/>
-          <w:szCs w:val="24"/>
-        </w:rPr>
-        <w:tab/>
-      </w:r>
-      <w:r>
-        <w:rPr>
-          <w:rFonts w:ascii="Times New Roman" w:hAnsi="Times New Roman" w:cs="Times New Roman"/>
-          <w:szCs w:val="24"/>
-        </w:rPr>
-        <w:tab/>
-        <w:t>:</w:t>
-      </w:r>
-      <w:r>
-        <w:rPr>
-          <w:rFonts w:ascii="Times New Roman" w:hAnsi="Times New Roman" w:cs="Times New Roman"/>
-          <w:szCs w:val="24"/>
-        </w:rPr>
-        <w:tab/>
-      </w:r>
-      <w:r>
-        <w:rPr>
-          <w:rFonts w:ascii="Times New Roman" w:hAnsi="Times New Roman" w:cs="Times New Roman"/>
-          <w:szCs w:val="24"/>
-        </w:rPr>
-        <w:t>${Weight}</w:t>
-      </w:r>
-    </w:p>
-    <w:p>
-      <w:pPr>
-        <w:pStyle w:val="NoSpacing"/>
-        <w:rPr>
-          <w:rFonts w:ascii="Times New Roman" w:hAnsi="Times New Roman" w:cs="Times New Roman"/>
-          <w:szCs w:val="24"/>
-        </w:rPr>
-      </w:pPr>
-      <w:r>
-        <w:rPr>
-          <w:rFonts w:ascii="Times New Roman" w:hAnsi="Times New Roman" w:cs="Times New Roman"/>
-          <w:szCs w:val="24"/>
-        </w:rPr>
-        <w:t>Sex</w:t>
-      </w:r>
-      <w:r>
-        <w:rPr>
-          <w:rFonts w:ascii="Times New Roman" w:hAnsi="Times New Roman" w:cs="Times New Roman"/>
-          <w:szCs w:val="24"/>
-        </w:rPr>
-        <w:tab/>
-      </w:r>
-      <w:r>
-        <w:rPr>
-          <w:rFonts w:ascii="Times New Roman" w:hAnsi="Times New Roman" w:cs="Times New Roman"/>
-          <w:szCs w:val="24"/>
-        </w:rPr>
-        <w:tab/>
-      </w:r>
-      <w:r>
-        <w:rPr>
-          <w:rFonts w:ascii="Times New Roman" w:hAnsi="Times New Roman" w:cs="Times New Roman"/>
-          <w:szCs w:val="24"/>
-        </w:rPr>
-        <w:tab/>
-      </w:r>
-      <w:r>
-        <w:rPr>
-          <w:rFonts w:ascii="Times New Roman" w:hAnsi="Times New Roman" w:cs="Times New Roman"/>
-          <w:szCs w:val="24"/>
-        </w:rPr>
-        <w:t>:</w:t>
-      </w:r>
-      <w:r>
-        <w:rPr>
-          <w:rFonts w:ascii="Times New Roman" w:hAnsi="Times New Roman" w:cs="Times New Roman"/>
-          <w:szCs w:val="24"/>
-        </w:rPr>
-        <w:tab/>
-      </w:r>
-      <w:r>
-        <w:rPr>
-          <w:rFonts w:ascii="Times New Roman" w:hAnsi="Times New Roman" w:cs="Times New Roman"/>
-          <w:szCs w:val="24"/>
-        </w:rPr>
-        <w:t>${Sex}</w:t>
-      </w:r>
-      <w:r>
-        <w:rPr>
-          <w:rFonts w:ascii="Times New Roman" w:hAnsi="Times New Roman" w:cs="Times New Roman"/>
-          <w:szCs w:val="24"/>
-        </w:rPr>
-        <w:tab/>
-      </w:r>
-      <w:r>
-        <w:rPr>
-          <w:rFonts w:ascii="Times New Roman" w:hAnsi="Times New Roman" w:cs="Times New Roman"/>
-          <w:szCs w:val="24"/>
-        </w:rPr>
-        <w:tab/>
-      </w:r>
-      <w:r>
-        <w:rPr>
-          <w:rFonts w:ascii="Times New Roman" w:hAnsi="Times New Roman" w:cs="Times New Roman"/>
-          <w:szCs w:val="24"/>
-        </w:rPr>
-        <w:tab/>
-      </w:r>
-      <w:r>
-        <w:rPr>
-          <w:rFonts w:ascii="Times New Roman" w:hAnsi="Times New Roman" w:cs="Times New Roman"/>
-          <w:szCs w:val="24"/>
-        </w:rPr>
-        <w:tab/>
-      </w:r>
-      <w:r>
-        <w:rPr>
-          <w:rFonts w:ascii="Times New Roman" w:hAnsi="Times New Roman" w:cs="Times New Roman"/>
-          <w:szCs w:val="24"/>
-        </w:rPr>
-        <w:t>Language Spoken</w:t>
-      </w:r>
-      <w:r>
-        <w:rPr>
-          <w:rFonts w:ascii="Times New Roman" w:hAnsi="Times New Roman" w:cs="Times New Roman"/>
-          <w:szCs w:val="24"/>
-        </w:rPr>
-        <w:tab/>
-        <w:t>:</w:t>
-      </w:r>
-      <w:r>
-        <w:rPr>
-          <w:rFonts w:ascii="Times New Roman" w:hAnsi="Times New Roman" w:cs="Times New Roman"/>
-          <w:szCs w:val="24"/>
-        </w:rPr>
-        <w:tab/>
-      </w:r>
-      <w:r>
-        <w:rPr>
-          <w:rFonts w:ascii="Times New Roman" w:hAnsi="Times New Roman" w:cs="Times New Roman"/>
-          <w:szCs w:val="24"/>
-        </w:rPr>
-        <w:t>${Language}</w:t>
-      </w:r>
-    </w:p>
-    <w:p>
-      <w:pPr>
-        <w:pStyle w:val="NoSpacing"/>
-        <w:rPr>
-          <w:rFonts w:ascii="Times New Roman" w:hAnsi="Times New Roman" w:cs="Times New Roman"/>
-          <w:szCs w:val="24"/>
-        </w:rPr>
-      </w:pPr>
-      <w:r>
-        <w:rPr>
-          <w:rFonts w:ascii="Times New Roman" w:hAnsi="Times New Roman" w:cs="Times New Roman"/>
-          <w:szCs w:val="24"/>
-        </w:rPr>
-        <w:t>Civil Status</w:t>
-      </w:r>
-      <w:r>
-        <w:rPr>
-          <w:rFonts w:ascii="Times New Roman" w:hAnsi="Times New Roman" w:cs="Times New Roman"/>
-          <w:szCs w:val="24"/>
-        </w:rPr>
-        <w:tab/>
-      </w:r>
-      <w:r>
-        <w:rPr>
-          <w:rFonts w:ascii="Times New Roman" w:hAnsi="Times New Roman" w:cs="Times New Roman"/>
-          <w:szCs w:val="24"/>
-        </w:rPr>
-        <w:tab/>
-      </w:r>
-      <w:r>
-        <w:rPr>
-          <w:rFonts w:ascii="Times New Roman" w:hAnsi="Times New Roman" w:cs="Times New Roman"/>
-          <w:szCs w:val="24"/>
-        </w:rPr>
-        <w:t>:</w:t>
-      </w:r>
-      <w:r>
-        <w:rPr>
-          <w:rFonts w:ascii="Times New Roman" w:hAnsi="Times New Roman" w:cs="Times New Roman"/>
-          <w:szCs w:val="24"/>
-        </w:rPr>
-        <w:tab/>
-      </w:r>
-      <w:r>
-        <w:rPr>
-          <w:rFonts w:ascii="Times New Roman" w:hAnsi="Times New Roman" w:cs="Times New Roman"/>
-          <w:szCs w:val="24"/>
-        </w:rPr>
-        <w:t>${</w:t>
-      </w:r>
-      <w:proofErr w:type="spellStart"/>
-      <w:r>
-        <w:rPr>
-          <w:rFonts w:ascii="Times New Roman" w:hAnsi="Times New Roman" w:cs="Times New Roman"/>
-          <w:szCs w:val="24"/>
-        </w:rPr>
-        <w:t>CivilStatus</w:t>
-      </w:r>
-      <w:proofErr w:type="spellEnd"/>
-      <w:r>
-        <w:rPr>
-          <w:rFonts w:ascii="Times New Roman" w:hAnsi="Times New Roman" w:cs="Times New Roman"/>
-          <w:szCs w:val="24"/>
-        </w:rPr>
-        <w:t>}</w:t>
-      </w:r>
-      <w:r>
-        <w:rPr>
-          <w:rFonts w:ascii="Times New Roman" w:hAnsi="Times New Roman" w:cs="Times New Roman"/>
-          <w:szCs w:val="24"/>
-        </w:rPr>
-        <w:tab/>
-      </w:r>
-      <w:r>
-        <w:rPr>
-          <w:rFonts w:ascii="Times New Roman" w:hAnsi="Times New Roman" w:cs="Times New Roman"/>
-          <w:szCs w:val="24"/>
-        </w:rPr>
-        <w:tab/>
-      </w:r>
-      <w:r>
-        <w:rPr>
-          <w:rFonts w:ascii="Times New Roman" w:hAnsi="Times New Roman" w:cs="Times New Roman"/>
-          <w:szCs w:val="24"/>
-        </w:rPr>
-        <w:tab/>
-        <w:t>Conta</w:t>
-      </w:r>
-      <w:r>
-        <w:rPr>
-          <w:rFonts w:ascii="Times New Roman" w:hAnsi="Times New Roman" w:cs="Times New Roman"/>
-          <w:szCs w:val="24"/>
-        </w:rPr>
-        <w:t>ct Person in</w:t>
-      </w:r>
-      <w:r>
-        <w:rPr>
-          <w:rFonts w:ascii="Times New Roman" w:hAnsi="Times New Roman" w:cs="Times New Roman"/>
-          <w:szCs w:val="24"/>
-        </w:rPr>
-        <w:tab/>
-        <w:t>:</w:t>
-      </w:r>
-      <w:r>
-        <w:rPr>
-          <w:rFonts w:ascii="Times New Roman" w:hAnsi="Times New Roman" w:cs="Times New Roman"/>
-          <w:szCs w:val="24"/>
-        </w:rPr>
-        <w:tab/>
-      </w:r>
-      <w:r>
-        <w:rPr>
-          <w:rFonts w:ascii="Times New Roman" w:hAnsi="Times New Roman" w:cs="Times New Roman"/>
-          <w:szCs w:val="24"/>
-        </w:rPr>
-        <w:t>${</w:t>
-      </w:r>
-      <w:proofErr w:type="spellStart"/>
-      <w:r>
-        <w:rPr>
-          <w:rFonts w:ascii="Times New Roman" w:hAnsi="Times New Roman" w:cs="Times New Roman"/>
-          <w:szCs w:val="24"/>
-        </w:rPr>
-        <w:t>EmergencyContactName</w:t>
-      </w:r>
-      <w:proofErr w:type="spellEnd"/>
-      <w:r>
-        <w:rPr>
-          <w:rFonts w:ascii="Times New Roman" w:hAnsi="Times New Roman" w:cs="Times New Roman"/>
-          <w:szCs w:val="24"/>
-        </w:rPr>
-        <w:t>}</w:t>
-      </w:r>
-    </w:p>
-    <w:p>
-      <w:pPr>
-        <w:pStyle w:val="NoSpacing"/>
-        <w:rPr>
-          <w:rFonts w:ascii="Times New Roman" w:hAnsi="Times New Roman" w:cs="Times New Roman"/>
-          <w:szCs w:val="24"/>
-        </w:rPr>
-      </w:pPr>
-      <w:r>
-        <w:rPr>
-          <w:rFonts w:ascii="Times New Roman" w:hAnsi="Times New Roman" w:cs="Times New Roman"/>
-          <w:szCs w:val="24"/>
-        </w:rPr>
-        <w:t>Nationality</w:t>
-      </w:r>
-      <w:r>
-        <w:rPr>
-          <w:rFonts w:ascii="Times New Roman" w:hAnsi="Times New Roman" w:cs="Times New Roman"/>
-          <w:szCs w:val="24"/>
-        </w:rPr>
-        <w:tab/>
-      </w:r>
-      <w:r>
-        <w:rPr>
-          <w:rFonts w:ascii="Times New Roman" w:hAnsi="Times New Roman" w:cs="Times New Roman"/>
-          <w:szCs w:val="24"/>
-        </w:rPr>
-        <w:tab/>
-      </w:r>
-      <w:r>
-        <w:rPr>
-          <w:rFonts w:ascii="Times New Roman" w:hAnsi="Times New Roman" w:cs="Times New Roman"/>
-          <w:szCs w:val="24"/>
-        </w:rPr>
-        <w:t>:</w:t>
-      </w:r>
-      <w:r>
-        <w:rPr>
-          <w:rFonts w:ascii="Times New Roman" w:hAnsi="Times New Roman" w:cs="Times New Roman"/>
-          <w:szCs w:val="24"/>
-        </w:rPr>
-        <w:tab/>
-      </w:r>
-      <w:r>
-        <w:rPr>
-          <w:rFonts w:ascii="Times New Roman" w:hAnsi="Times New Roman" w:cs="Times New Roman"/>
-          <w:szCs w:val="24"/>
-        </w:rPr>
-        <w:t>${Nationality}</w:t>
-      </w:r>
-      <w:r>
-        <w:rPr>
-          <w:rFonts w:ascii="Times New Roman" w:hAnsi="Times New Roman" w:cs="Times New Roman"/>
-          <w:szCs w:val="24"/>
-        </w:rPr>
-        <w:tab/>
-      </w:r>
-      <w:r>
-        <w:rPr>
-          <w:rFonts w:ascii="Times New Roman" w:hAnsi="Times New Roman" w:cs="Times New Roman"/>
-          <w:szCs w:val="24"/>
-        </w:rPr>
-        <w:tab/>
-      </w:r>
-      <w:r>
-        <w:rPr>
-          <w:rFonts w:ascii="Times New Roman" w:hAnsi="Times New Roman" w:cs="Times New Roman"/>
-          <w:szCs w:val="24"/>
-        </w:rPr>
-        <w:tab/>
-      </w:r>
-      <w:r>
-        <w:rPr>
-          <w:rFonts w:ascii="Times New Roman" w:hAnsi="Times New Roman" w:cs="Times New Roman"/>
-          <w:szCs w:val="24"/>
-        </w:rPr>
-        <w:t>c</w:t>
-      </w:r>
-      <w:r>
-        <w:rPr>
-          <w:rFonts w:ascii="Times New Roman" w:hAnsi="Times New Roman" w:cs="Times New Roman"/>
-          <w:szCs w:val="24"/>
-        </w:rPr>
-        <w:t>ase of Emergency</w:t>
-      </w:r>
-      <w:r>
-        <w:rPr>
-          <w:rFonts w:ascii="Times New Roman" w:hAnsi="Times New Roman" w:cs="Times New Roman"/>
-          <w:szCs w:val="24"/>
-        </w:rPr>
-        <w:tab/>
-        <w:t>:</w:t>
-      </w:r>
-      <w:r>
-        <w:rPr>
-          <w:rFonts w:ascii="Times New Roman" w:hAnsi="Times New Roman" w:cs="Times New Roman"/>
-          <w:szCs w:val="24"/>
-        </w:rPr>
-        <w:tab/>
-      </w:r>
-      <w:r>
-        <w:rPr>
-          <w:rFonts w:ascii="Times New Roman" w:hAnsi="Times New Roman" w:cs="Times New Roman"/>
-          <w:szCs w:val="24"/>
-        </w:rPr>
-        <w:t>${</w:t>
-      </w:r>
-      <w:proofErr w:type="spellStart"/>
-      <w:r>
-        <w:rPr>
-          <w:rFonts w:ascii="Times New Roman" w:hAnsi="Times New Roman" w:cs="Times New Roman"/>
-          <w:szCs w:val="24"/>
-        </w:rPr>
-        <w:t>EmergencyContact</w:t>
-      </w:r>
-      <w:proofErr w:type="spellEnd"/>
-      <w:r>
-        <w:rPr>
-          <w:rFonts w:ascii="Times New Roman" w:hAnsi="Times New Roman" w:cs="Times New Roman"/>
-          <w:szCs w:val="24"/>
-        </w:rPr>
-        <w:t>}</w:t>
-      </w:r>
-    </w:p>
-    <w:p>
-      <w:pPr>
-        <w:pStyle w:val="NoSpacing"/>
-        <w:rPr>
-          <w:rFonts w:ascii="Times New Roman" w:hAnsi="Times New Roman" w:cs="Times New Roman"/>
-          <w:szCs w:val="24"/>
-        </w:rPr>
-      </w:pPr>
-      <w:r>
-        <w:rPr>
-          <w:rFonts w:ascii="Times New Roman" w:hAnsi="Times New Roman" w:cs="Times New Roman"/>
-          <w:szCs w:val="24"/>
-        </w:rPr>
-        <w:tab/>
-      </w:r>
-      <w:r>
-        <w:rPr>
-          <w:rFonts w:ascii="Times New Roman" w:hAnsi="Times New Roman" w:cs="Times New Roman"/>
-          <w:szCs w:val="24"/>
-        </w:rPr>
-        <w:tab/>
-      </w:r>
-      <w:r>
-        <w:rPr>
-          <w:rFonts w:ascii="Times New Roman" w:hAnsi="Times New Roman" w:cs="Times New Roman"/>
-          <w:szCs w:val="24"/>
-        </w:rPr>
-        <w:tab/>
-      </w:r>
-      <w:r>
-        <w:rPr>
-          <w:rFonts w:ascii="Times New Roman" w:hAnsi="Times New Roman" w:cs="Times New Roman"/>
-          <w:szCs w:val="24"/>
-        </w:rPr>
-        <w:tab/>
-      </w:r>
-      <w:r>
-        <w:rPr>
-          <w:rFonts w:ascii="Times New Roman" w:hAnsi="Times New Roman" w:cs="Times New Roman"/>
-          <w:szCs w:val="24"/>
-        </w:rPr>
-        <w:tab/>
-      </w:r>
-      <w:r>
-        <w:rPr>
-          <w:rFonts w:ascii="Times New Roman" w:hAnsi="Times New Roman" w:cs="Times New Roman"/>
-          <w:szCs w:val="24"/>
-        </w:rPr>
-        <w:tab/>
-      </w:r>
-      <w:r>
-        <w:rPr>
-          <w:rFonts w:ascii="Times New Roman" w:hAnsi="Times New Roman" w:cs="Times New Roman"/>
-          <w:szCs w:val="24"/>
-        </w:rPr>
-        <w:tab/>
-      </w:r>
-      <w:r>
-        <w:rPr>
-          <w:rFonts w:ascii="Times New Roman" w:hAnsi="Times New Roman" w:cs="Times New Roman"/>
-          <w:szCs w:val="24"/>
-        </w:rPr>
-        <w:tab/>
-      </w:r>
-      <w:r>
-        <w:rPr>
-          <w:rFonts w:ascii="Times New Roman" w:hAnsi="Times New Roman" w:cs="Times New Roman"/>
-          <w:szCs w:val="24"/>
-        </w:rPr>
-        <w:tab/>
-      </w:r>
-      <w:r>
-        <w:rPr>
-          <w:rFonts w:ascii="Times New Roman" w:hAnsi="Times New Roman" w:cs="Times New Roman"/>
-          <w:szCs w:val="24"/>
-        </w:rPr>
-        <w:tab/>
-      </w:r>
-    </w:p>
-    <w:p>
-      <w:pPr>
-        <w:pStyle w:val="NoSpacing"/>
-        <w:rPr>
-          <w:rFonts w:ascii="Times New Roman" w:hAnsi="Times New Roman" w:cs="Times New Roman"/>
-          <w:color w:val="002060"/>
-          <w:szCs w:val="24"/>
-          <w:u w:val="single"/>
-        </w:rPr>
-      </w:pPr>
-      <w:r>
-        <w:rPr>
-          <w:rFonts w:ascii="Times New Roman" w:hAnsi="Times New Roman" w:cs="Times New Roman"/>
-          <w:b/>
-          <w:color w:val="002060"/>
-          <w:szCs w:val="24"/>
-          <w:u w:val="single"/>
-        </w:rPr>
-        <w:t>EDUCATIONAL BACKGROUND</w:t>
-      </w:r>
-    </w:p>
-    <w:p>
-      <w:pPr>
-        <w:pStyle w:val="NoSpacing"/>
-        <w:rPr>
-          <w:rFonts w:ascii="Times New Roman" w:hAnsi="Times New Roman" w:cs="Times New Roman"/>
-          <w:b/>
-          <w:szCs w:val="24"/>
-        </w:rPr>
-      </w:pPr>
-      <w:r>
-        <w:rPr>
-          <w:rFonts w:ascii="Times New Roman" w:hAnsi="Times New Roman" w:cs="Times New Roman"/>
-          <w:b/>
-          <w:szCs w:val="24"/>
-        </w:rPr>
-        <w:tab/>
-      </w:r>
-      <w:r>
-        <w:rPr>
-          <w:rFonts w:ascii="Times New Roman" w:hAnsi="Times New Roman" w:cs="Times New Roman"/>
-          <w:b/>
-          <w:szCs w:val="24"/>
-        </w:rPr>
-        <w:t>${</w:t>
-      </w:r>
-      <w:proofErr w:type="spellStart"/>
-      <w:r>
-        <w:rPr>
-          <w:rFonts w:ascii="Times New Roman" w:hAnsi="Times New Roman" w:cs="Times New Roman"/>
-          <w:b/>
-          <w:szCs w:val="24"/>
-        </w:rPr>
-        <w:t>block_tertiary</w:t>
-      </w:r>
-      <w:proofErr w:type="spellEnd"/>
-      <w:r>
-        <w:rPr>
-          <w:rFonts w:ascii="Times New Roman" w:hAnsi="Times New Roman" w:cs="Times New Roman"/>
-          <w:b/>
-          <w:szCs w:val="24"/>
-        </w:rPr>
-        <w:t>}</w:t>
-      </w:r>
+          <w:b/>
+          <w:szCs w:val="24"/>
+        </w:rPr>
+      </w:pPr>
     </w:p>
     <w:p>
       <w:pPr>
@@ -1644,141 +1941,6 @@
     <w:p>
       <w:pPr>
         <w:pStyle w:val="NoSpacing"/>
-        <w:numPr>
-          <w:ilvl w:val="0"/>
-          <w:numId w:val="11"/>
-        </w:numPr>
-        <w:rPr>
-          <w:rFonts w:ascii="Times New Roman" w:hAnsi="Times New Roman" w:cs="Times New Roman"/>
-          <w:b/>
-          <w:szCs w:val="24"/>
-        </w:rPr>
-      </w:pPr>
-      <w:r>
-        <w:rPr>
-          <w:rFonts w:ascii="Times New Roman" w:hAnsi="Times New Roman" w:cs="Times New Roman"/>
-          <w:b/>
-          <w:szCs w:val="24"/>
-        </w:rPr>
-        <w:t>Secondary</w:t>
-      </w:r>
-      <w:r>
-        <w:rPr>
-          <w:rFonts w:ascii="Times New Roman" w:hAnsi="Times New Roman" w:cs="Times New Roman"/>
-          <w:b/>
-          <w:szCs w:val="24"/>
-        </w:rPr>
-        <w:tab/>
-      </w:r>
-      <w:r>
-        <w:rPr>
-          <w:rFonts w:ascii="Times New Roman" w:hAnsi="Times New Roman" w:cs="Times New Roman"/>
-          <w:b/>
-          <w:szCs w:val="24"/>
-        </w:rPr>
-        <w:tab/>
-      </w:r>
-      <w:r>
-        <w:rPr>
-          <w:rFonts w:ascii="Times New Roman" w:hAnsi="Times New Roman" w:cs="Times New Roman"/>
-          <w:b/>
-          <w:szCs w:val="24"/>
-        </w:rPr>
-        <w:tab/>
-      </w:r>
-      <w:r>
-        <w:rPr>
-          <w:rFonts w:ascii="Times New Roman" w:hAnsi="Times New Roman" w:cs="Times New Roman"/>
-          <w:b/>
-          <w:szCs w:val="24"/>
-        </w:rPr>
-        <w:t>${</w:t>
-      </w:r>
-      <w:proofErr w:type="spellStart"/>
-      <w:r>
-        <w:rPr>
-          <w:rFonts w:ascii="Times New Roman" w:hAnsi="Times New Roman" w:cs="Times New Roman"/>
-          <w:b/>
-          <w:szCs w:val="24"/>
-        </w:rPr>
-        <w:t>HighSchoolName</w:t>
-      </w:r>
-      <w:proofErr w:type="spellEnd"/>
-      <w:r>
-        <w:rPr>
-          <w:rFonts w:ascii="Times New Roman" w:hAnsi="Times New Roman" w:cs="Times New Roman"/>
-          <w:b/>
-          <w:szCs w:val="24"/>
-        </w:rPr>
-        <w:t>}</w:t>
-      </w:r>
-      <w:r>
-        <w:rPr>
-          <w:rFonts w:ascii="Times New Roman" w:hAnsi="Times New Roman" w:cs="Times New Roman"/>
-          <w:b/>
-          <w:szCs w:val="24"/>
-        </w:rPr>
-        <w:tab/>
-      </w:r>
-      <w:r>
-        <w:rPr>
-          <w:rFonts w:ascii="Times New Roman" w:hAnsi="Times New Roman" w:cs="Times New Roman"/>
-          <w:b/>
-          <w:szCs w:val="24"/>
-        </w:rPr>
-        <w:tab/>
-      </w:r>
-      <w:r>
-        <w:rPr>
-          <w:rFonts w:ascii="Times New Roman" w:hAnsi="Times New Roman" w:cs="Times New Roman"/>
-          <w:b/>
-          <w:szCs w:val="24"/>
-        </w:rPr>
-        <w:tab/>
-      </w:r>
-      <w:r>
-        <w:rPr>
-          <w:rFonts w:ascii="Times New Roman" w:hAnsi="Times New Roman" w:cs="Times New Roman"/>
-          <w:szCs w:val="24"/>
-        </w:rPr>
-        <w:t>${</w:t>
-      </w:r>
-      <w:proofErr w:type="spellStart"/>
-      <w:r>
-        <w:rPr>
-          <w:rFonts w:ascii="Times New Roman" w:hAnsi="Times New Roman" w:cs="Times New Roman"/>
-          <w:szCs w:val="24"/>
-        </w:rPr>
-        <w:t>HighSchoolStart</w:t>
-      </w:r>
-      <w:proofErr w:type="spellEnd"/>
-      <w:r>
-        <w:rPr>
-          <w:rFonts w:ascii="Times New Roman" w:hAnsi="Times New Roman" w:cs="Times New Roman"/>
-          <w:szCs w:val="24"/>
-        </w:rPr>
-        <w:t>} - ${</w:t>
-      </w:r>
-      <w:proofErr w:type="spellStart"/>
-      <w:r>
-        <w:rPr>
-          <w:rFonts w:ascii="Times New Roman" w:hAnsi="Times New Roman" w:cs="Times New Roman"/>
-          <w:szCs w:val="24"/>
-        </w:rPr>
-        <w:t>HighSchoolEnd</w:t>
-      </w:r>
-      <w:proofErr w:type="spellEnd"/>
-      <w:r>
-        <w:rPr>
-          <w:rFonts w:ascii="Times New Roman" w:hAnsi="Times New Roman" w:cs="Times New Roman"/>
-          <w:szCs w:val="24"/>
-        </w:rPr>
-        <w:t>}</w:t>
-      </w:r>
-    </w:p>
-    <w:p>
-      <w:pPr>
-        <w:pStyle w:val="NoSpacing"/>
         <w:ind w:left="720"/>
         <w:rPr>
           <w:rFonts w:ascii="Times New Roman" w:hAnsi="Times New Roman" w:cs="Times New Roman"/>
@@ -1786,69 +1948,6 @@
           <w:szCs w:val="24"/>
         </w:rPr>
       </w:pPr>
-      <w:r>
-        <w:rPr>
-          <w:rFonts w:ascii="Times New Roman" w:hAnsi="Times New Roman" w:cs="Times New Roman"/>
-          <w:b/>
-          <w:szCs w:val="24"/>
-        </w:rPr>
-        <w:t>${/</w:t>
-      </w:r>
-      <w:proofErr w:type="spellStart"/>
-      <w:r>
-        <w:rPr>
-          <w:rFonts w:ascii="Times New Roman" w:hAnsi="Times New Roman" w:cs="Times New Roman"/>
-          <w:b/>
-          <w:szCs w:val="24"/>
-        </w:rPr>
-        <w:t>block_highschool</w:t>
-      </w:r>
-      <w:proofErr w:type="spellEnd"/>
-      <w:r>
-        <w:rPr>
-          <w:rFonts w:ascii="Times New Roman" w:hAnsi="Times New Roman" w:cs="Times New Roman"/>
-          <w:b/>
-          <w:szCs w:val="24"/>
-        </w:rPr>
-        <w:t>}</w:t>
-      </w:r>
-    </w:p>
-    <w:p>
-      <w:pPr>
-        <w:pStyle w:val="NoSpacing"/>
-        <w:ind w:left="720"/>
-        <w:rPr>
-          <w:rFonts w:ascii="Times New Roman" w:hAnsi="Times New Roman" w:cs="Times New Roman"/>
-          <w:b/>
-          <w:szCs w:val="24"/>
-        </w:rPr>
-      </w:pPr>
-      <w:r>
-        <w:rPr>
-          <w:rFonts w:ascii="Times New Roman" w:hAnsi="Times New Roman" w:cs="Times New Roman"/>
-          <w:b/>
-          <w:szCs w:val="24"/>
-        </w:rPr>
-        <w:t>${</w:t>
-      </w:r>
-      <w:proofErr w:type="spellStart"/>
-      <w:r>
-        <w:rPr>
-          <w:rFonts w:ascii="Times New Roman" w:hAnsi="Times New Roman" w:cs="Times New Roman"/>
-          <w:b/>
-          <w:szCs w:val="24"/>
-        </w:rPr>
-        <w:t>block_elementary</w:t>
-      </w:r>
-      <w:proofErr w:type="spellEnd"/>
-      <w:r>
-        <w:rPr>
-          <w:rFonts w:ascii="Times New Roman" w:hAnsi="Times New Roman" w:cs="Times New Roman"/>
-          <w:b/>
-          <w:szCs w:val="24"/>
-        </w:rPr>
-        <w:t>}</w:t>
-      </w:r>
     </w:p>
     <w:p>
       <w:pPr>
@@ -1869,7 +1968,7 @@
           <w:b/>
           <w:szCs w:val="24"/>
         </w:rPr>
-        <w:t xml:space="preserve">Elementary </w:t>
+        <w:t>Secondary</w:t>
       </w:r>
       <w:r>
         <w:rPr>
@@ -1910,7 +2009,7 @@
           <w:b/>
           <w:szCs w:val="24"/>
         </w:rPr>
-        <w:t>ElementaryName</w:t>
+        <w:t>HighSchoolName</w:t>
       </w:r>
       <w:proofErr w:type="spellEnd"/>
       <w:r>
@@ -1958,7 +2057,7 @@
           <w:rFonts w:ascii="Times New Roman" w:hAnsi="Times New Roman" w:cs="Times New Roman"/>
           <w:szCs w:val="24"/>
         </w:rPr>
-        <w:t>ElementaryStart</w:t>
+        <w:t>HighSchoolStart</w:t>
       </w:r>
       <w:proofErr w:type="spellEnd"/>
       <w:r>
@@ -1974,7 +2073,7 @@
           <w:rFonts w:ascii="Times New Roman" w:hAnsi="Times New Roman" w:cs="Times New Roman"/>
           <w:szCs w:val="24"/>
         </w:rPr>
-        <w:t>ElementaryEnd</w:t>
+        <w:t>HighSchoolEnd</w:t>
       </w:r>
       <w:proofErr w:type="spellEnd"/>
       <w:r>
@@ -2010,7 +2109,7 @@
           <w:b/>
           <w:szCs w:val="24"/>
         </w:rPr>
-        <w:t>block_elementary</w:t>
+        <w:t>block_highschool</w:t>
       </w:r>
       <w:proofErr w:type="spellEnd"/>
       <w:r>
@@ -2025,29 +2124,47 @@
     <w:p>
       <w:pPr>
         <w:pStyle w:val="NoSpacing"/>
-        <w:rPr>
-          <w:rFonts w:ascii="Times New Roman" w:hAnsi="Times New Roman" w:cs="Times New Roman"/>
-          <w:color w:val="002060"/>
-          <w:szCs w:val="24"/>
-          <w:u w:val="single"/>
-        </w:rPr>
-      </w:pPr>
-      <w:r>
-        <w:rPr>
-          <w:rFonts w:ascii="Times New Roman" w:hAnsi="Times New Roman" w:cs="Times New Roman"/>
-          <w:b/>
-          <w:color w:val="002060"/>
-          <w:szCs w:val="24"/>
-          <w:u w:val="single"/>
-        </w:rPr>
-        <w:t>WORK EXPERIENCE</w:t>
+        <w:ind w:left="720"/>
+        <w:rPr>
+          <w:rFonts w:ascii="Times New Roman" w:hAnsi="Times New Roman" w:cs="Times New Roman"/>
+          <w:b/>
+          <w:szCs w:val="24"/>
+        </w:rPr>
+      </w:pPr>
+      <w:r>
+        <w:rPr>
+          <w:rFonts w:ascii="Times New Roman" w:hAnsi="Times New Roman" w:cs="Times New Roman"/>
+          <w:b/>
+          <w:szCs w:val="24"/>
+        </w:rPr>
+        <w:t>${</w:t>
+      </w:r>
+      <w:proofErr w:type="spellStart"/>
+      <w:r>
+        <w:rPr>
+          <w:rFonts w:ascii="Times New Roman" w:hAnsi="Times New Roman" w:cs="Times New Roman"/>
+          <w:b/>
+          <w:szCs w:val="24"/>
+        </w:rPr>
+        <w:t>block_elementary</w:t>
+      </w:r>
+      <w:proofErr w:type="spellEnd"/>
+      <w:r>
+        <w:rPr>
+          <w:rFonts w:ascii="Times New Roman" w:hAnsi="Times New Roman" w:cs="Times New Roman"/>
+          <w:b/>
+          <w:szCs w:val="24"/>
+        </w:rPr>
+        <w:t>}</w:t>
       </w:r>
     </w:p>
     <w:p>
       <w:pPr>
-        <w:spacing w:after="0" w:line="240" w:lineRule="auto"/>
-        <w:rPr>
-          <w:rFonts w:ascii="Times New Roman" w:eastAsia="Calibri" w:hAnsi="Times New Roman" w:cs="Times New Roman"/>
+        <w:pStyle w:val="NoSpacing"/>
+        <w:ind w:left="720"/>
+        <w:rPr>
+          <w:rFonts w:ascii="Times New Roman" w:hAnsi="Times New Roman" w:cs="Times New Roman"/>
+          <w:b/>
           <w:szCs w:val="24"/>
         </w:rPr>
       </w:pPr>
@@ -2057,15 +2174,51 @@
         <w:pStyle w:val="NoSpacing"/>
         <w:numPr>
           <w:ilvl w:val="0"/>
-          <w:numId w:val="14"/>
+          <w:numId w:val="11"/>
         </w:numPr>
         <w:rPr>
           <w:rFonts w:ascii="Times New Roman" w:hAnsi="Times New Roman" w:cs="Times New Roman"/>
-        </w:rPr>
-      </w:pPr>
-      <w:r>
-        <w:rPr>
-          <w:rFonts w:ascii="Times New Roman" w:hAnsi="Times New Roman" w:cs="Times New Roman"/>
+          <w:b/>
+          <w:szCs w:val="24"/>
+        </w:rPr>
+      </w:pPr>
+      <w:r>
+        <w:rPr>
+          <w:rFonts w:ascii="Times New Roman" w:hAnsi="Times New Roman" w:cs="Times New Roman"/>
+          <w:b/>
+          <w:szCs w:val="24"/>
+        </w:rPr>
+        <w:t xml:space="preserve">Elementary </w:t>
+      </w:r>
+      <w:r>
+        <w:rPr>
+          <w:rFonts w:ascii="Times New Roman" w:hAnsi="Times New Roman" w:cs="Times New Roman"/>
+          <w:b/>
+          <w:szCs w:val="24"/>
+        </w:rPr>
+        <w:tab/>
+      </w:r>
+      <w:r>
+        <w:rPr>
+          <w:rFonts w:ascii="Times New Roman" w:hAnsi="Times New Roman" w:cs="Times New Roman"/>
+          <w:b/>
+          <w:szCs w:val="24"/>
+        </w:rPr>
+        <w:tab/>
+      </w:r>
+      <w:r>
+        <w:rPr>
+          <w:rFonts w:ascii="Times New Roman" w:hAnsi="Times New Roman" w:cs="Times New Roman"/>
+          <w:b/>
+          <w:szCs w:val="24"/>
+        </w:rPr>
+        <w:tab/>
+      </w:r>
+      <w:r>
+        <w:rPr>
+          <w:rFonts w:ascii="Times New Roman" w:hAnsi="Times New Roman" w:cs="Times New Roman"/>
+          <w:b/>
+          <w:szCs w:val="24"/>
         </w:rPr>
         <w:t>${</w:t>
       </w:r>
@@ -2073,188 +2226,373 @@
       <w:r>
         <w:rPr>
           <w:rFonts w:ascii="Times New Roman" w:hAnsi="Times New Roman" w:cs="Times New Roman"/>
-        </w:rPr>
-        <w:t>WorkExperience</w:t>
+          <w:b/>
+          <w:szCs w:val="24"/>
+        </w:rPr>
+        <w:t>ElementaryName</w:t>
       </w:r>
       <w:proofErr w:type="spellEnd"/>
       <w:r>
         <w:rPr>
           <w:rFonts w:ascii="Times New Roman" w:hAnsi="Times New Roman" w:cs="Times New Roman"/>
+          <w:b/>
+          <w:szCs w:val="24"/>
         </w:rPr>
         <w:t>}</w:t>
       </w:r>
       <w:r>
         <w:rPr>
           <w:rFonts w:ascii="Times New Roman" w:hAnsi="Times New Roman" w:cs="Times New Roman"/>
+          <w:b/>
+          <w:szCs w:val="24"/>
         </w:rPr>
         <w:tab/>
+      </w:r>
+      <w:r>
+        <w:rPr>
+          <w:rFonts w:ascii="Times New Roman" w:hAnsi="Times New Roman" w:cs="Times New Roman"/>
+          <w:b/>
+          <w:szCs w:val="24"/>
+        </w:rPr>
+        <w:tab/>
+      </w:r>
+      <w:r>
+        <w:rPr>
+          <w:rFonts w:ascii="Times New Roman" w:hAnsi="Times New Roman" w:cs="Times New Roman"/>
+          <w:b/>
+          <w:szCs w:val="24"/>
+        </w:rPr>
+        <w:tab/>
+      </w:r>
+      <w:r>
+        <w:rPr>
+          <w:rFonts w:ascii="Times New Roman" w:hAnsi="Times New Roman" w:cs="Times New Roman"/>
+          <w:szCs w:val="24"/>
+        </w:rPr>
+        <w:t>${</w:t>
+      </w:r>
+      <w:proofErr w:type="spellStart"/>
+      <w:r>
+        <w:rPr>
+          <w:rFonts w:ascii="Times New Roman" w:hAnsi="Times New Roman" w:cs="Times New Roman"/>
+          <w:szCs w:val="24"/>
+        </w:rPr>
+        <w:t>ElementaryStart</w:t>
+      </w:r>
+      <w:proofErr w:type="spellEnd"/>
+      <w:r>
+        <w:rPr>
+          <w:rFonts w:ascii="Times New Roman" w:hAnsi="Times New Roman" w:cs="Times New Roman"/>
+          <w:szCs w:val="24"/>
+        </w:rPr>
+        <w:t>} - ${</w:t>
+      </w:r>
+      <w:proofErr w:type="spellStart"/>
+      <w:r>
+        <w:rPr>
+          <w:rFonts w:ascii="Times New Roman" w:hAnsi="Times New Roman" w:cs="Times New Roman"/>
+          <w:szCs w:val="24"/>
+        </w:rPr>
+        <w:t>ElementaryEnd</w:t>
+      </w:r>
+      <w:proofErr w:type="spellEnd"/>
+      <w:r>
+        <w:rPr>
+          <w:rFonts w:ascii="Times New Roman" w:hAnsi="Times New Roman" w:cs="Times New Roman"/>
+          <w:szCs w:val="24"/>
+        </w:rPr>
+        <w:t>}</w:t>
       </w:r>
     </w:p>
     <w:p>
       <w:pPr>
         <w:pStyle w:val="NoSpacing"/>
-        <w:rPr>
-          <w:rFonts w:ascii="Times New Roman" w:hAnsi="Times New Roman" w:cs="Times New Roman"/>
-        </w:rPr>
-      </w:pPr>
+        <w:ind w:left="720"/>
+        <w:rPr>
+          <w:rFonts w:ascii="Times New Roman" w:hAnsi="Times New Roman" w:cs="Times New Roman"/>
+          <w:b/>
+          <w:szCs w:val="24"/>
+        </w:rPr>
+      </w:pPr>
+      <w:r>
+        <w:rPr>
+          <w:rFonts w:ascii="Times New Roman" w:hAnsi="Times New Roman" w:cs="Times New Roman"/>
+          <w:b/>
+          <w:szCs w:val="24"/>
+        </w:rPr>
+        <w:t>${/</w:t>
+      </w:r>
+      <w:proofErr w:type="spellStart"/>
+      <w:r>
+        <w:rPr>
+          <w:rFonts w:ascii="Times New Roman" w:hAnsi="Times New Roman" w:cs="Times New Roman"/>
+          <w:b/>
+          <w:szCs w:val="24"/>
+        </w:rPr>
+        <w:t>block_elementary</w:t>
+      </w:r>
+      <w:proofErr w:type="spellEnd"/>
+      <w:r>
+        <w:rPr>
+          <w:rFonts w:ascii="Times New Roman" w:hAnsi="Times New Roman" w:cs="Times New Roman"/>
+          <w:b/>
+          <w:szCs w:val="24"/>
+        </w:rPr>
+        <w:t>}</w:t>
+      </w:r>
     </w:p>
     <w:p>
       <w:pPr>
         <w:pStyle w:val="NoSpacing"/>
-        <w:rPr>
-          <w:rFonts w:ascii="Times New Roman" w:hAnsi="Times New Roman" w:cs="Times New Roman"/>
-          <w:color w:val="002060"/>
-          <w:szCs w:val="24"/>
-          <w:u w:val="single"/>
-        </w:rPr>
-      </w:pPr>
-      <w:r>
-        <w:rPr>
-          <w:rFonts w:ascii="Times New Roman" w:hAnsi="Times New Roman" w:cs="Times New Roman"/>
-          <w:b/>
-          <w:color w:val="002060"/>
-          <w:szCs w:val="24"/>
-          <w:u w:val="single"/>
-        </w:rPr>
-        <w:t>SKILLS</w:t>
-      </w:r>
+        <w:ind w:left="720"/>
+        <w:rPr>
+          <w:rFonts w:ascii="Times New Roman" w:hAnsi="Times New Roman" w:cs="Times New Roman"/>
+          <w:b/>
+          <w:szCs w:val="24"/>
+        </w:rPr>
+      </w:pPr>
     </w:p>
     <w:p>
       <w:pPr>
-        <w:spacing w:after="0" w:line="240" w:lineRule="auto"/>
-        <w:rPr>
-          <w:rFonts w:ascii="Times New Roman" w:eastAsia="Calibri" w:hAnsi="Times New Roman" w:cs="Times New Roman"/>
-          <w:szCs w:val="24"/>
-        </w:rPr>
-      </w:pPr>
+        <w:pStyle w:val="NoSpacing"/>
+        <w:rPr>
+          <w:rFonts w:ascii="Times New Roman" w:hAnsi="Times New Roman" w:cs="Times New Roman"/>
+          <w:color w:val="002060"/>
+          <w:szCs w:val="24"/>
+          <w:u w:val="single"/>
+        </w:rPr>
+      </w:pPr>
+      <w:r>
+        <w:rPr>
+          <w:rFonts w:ascii="Times New Roman" w:hAnsi="Times New Roman" w:cs="Times New Roman"/>
+          <w:b/>
+          <w:color w:val="002060"/>
+          <w:szCs w:val="24"/>
+          <w:u w:val="single"/>
+        </w:rPr>
+        <w:t>WORK EXPERIENCE</w:t>
+      </w:r>
     </w:p>
     <w:p>
       <w:pPr>
-        <w:pStyle w:val="NoSpacing"/>
-        <w:rPr>
-          <w:rFonts w:ascii="Times New Roman" w:hAnsi="Times New Roman" w:cs="Times New Roman"/>
-        </w:rPr>
-      </w:pPr>
-      <w:r>
-        <w:rPr>
-          <w:rFonts w:ascii="Times New Roman" w:hAnsi="Times New Roman" w:cs="Times New Roman"/>
-        </w:rPr>
-        <w:t xml:space="preserve">* </w:t>
-      </w:r>
-      <w:r>
-        <w:rPr>
-          <w:rFonts w:ascii="Times New Roman" w:hAnsi="Times New Roman" w:cs="Times New Roman"/>
-        </w:rPr>
-        <w:t>Time Management</w:t>
-      </w:r>
-      <w:r>
-        <w:rPr>
-          <w:rFonts w:ascii="Times New Roman" w:hAnsi="Times New Roman" w:cs="Times New Roman"/>
+        <w:spacing w:after="0" w:line="240" w:lineRule="auto"/>
+        <w:rPr>
+          <w:rFonts w:ascii="Times New Roman" w:eastAsia="Calibri" w:hAnsi="Times New Roman" w:cs="Times New Roman"/>
+          <w:szCs w:val="24"/>
+        </w:rPr>
+      </w:pPr>
+      <w:r>
+        <w:rPr>
+          <w:rFonts w:ascii="Times New Roman" w:eastAsia="Calibri" w:hAnsi="Times New Roman" w:cs="Times New Roman"/>
+          <w:szCs w:val="24"/>
         </w:rPr>
         <w:tab/>
       </w:r>
       <w:r>
         <w:rPr>
-          <w:rFonts w:ascii="Times New Roman" w:hAnsi="Times New Roman" w:cs="Times New Roman"/>
-        </w:rPr>
-        <w:tab/>
-        <w:t>* Adaptability</w:t>
-      </w:r>
-      <w:r>
-        <w:rPr>
-          <w:rFonts w:ascii="Times New Roman" w:hAnsi="Times New Roman" w:cs="Times New Roman"/>
-        </w:rPr>
-        <w:tab/>
-      </w:r>
-      <w:r>
-        <w:rPr>
-          <w:rFonts w:ascii="Times New Roman" w:hAnsi="Times New Roman" w:cs="Times New Roman"/>
-        </w:rPr>
-        <w:tab/>
-        <w:t>* Interpersonal skills</w:t>
-      </w:r>
-      <w:r>
-        <w:rPr>
-          <w:rFonts w:ascii="Times New Roman" w:hAnsi="Times New Roman" w:cs="Times New Roman"/>
-        </w:rPr>
-        <w:tab/>
-      </w:r>
-      <w:r>
-        <w:rPr>
-          <w:rFonts w:ascii="Times New Roman" w:hAnsi="Times New Roman" w:cs="Times New Roman"/>
-        </w:rPr>
-        <w:tab/>
-        <w:t>* Problem-solving</w:t>
+          <w:rFonts w:ascii="Times New Roman" w:eastAsia="Calibri" w:hAnsi="Times New Roman" w:cs="Times New Roman"/>
+          <w:szCs w:val="24"/>
+        </w:rPr>
+        <w:t>${</w:t>
+      </w:r>
+      <w:proofErr w:type="spellStart"/>
+      <w:r>
+        <w:rPr>
+          <w:rFonts w:ascii="Times New Roman" w:eastAsia="Calibri" w:hAnsi="Times New Roman" w:cs="Times New Roman"/>
+          <w:szCs w:val="24"/>
+        </w:rPr>
+        <w:t>block_work</w:t>
+      </w:r>
+      <w:proofErr w:type="spellEnd"/>
+      <w:r>
+        <w:rPr>
+          <w:rFonts w:ascii="Times New Roman" w:eastAsia="Calibri" w:hAnsi="Times New Roman" w:cs="Times New Roman"/>
+          <w:szCs w:val="24"/>
+        </w:rPr>
+        <w:t>}</w:t>
       </w:r>
     </w:p>
     <w:p>
       <w:pPr>
+        <w:spacing w:after="0" w:line="240" w:lineRule="auto"/>
+        <w:rPr>
+          <w:rFonts w:ascii="Times New Roman" w:eastAsia="Calibri" w:hAnsi="Times New Roman" w:cs="Times New Roman"/>
+          <w:szCs w:val="24"/>
+        </w:rPr>
+      </w:pPr>
+      <w:r>
+        <w:rPr>
+          <w:rFonts w:ascii="Times New Roman" w:eastAsia="Calibri" w:hAnsi="Times New Roman" w:cs="Times New Roman"/>
+          <w:szCs w:val="24"/>
+        </w:rPr>
+        <w:tab/>
+      </w:r>
+    </w:p>
+    <w:tbl>
+      <w:tblPr>
+        <w:tblStyle w:val="TableGrid"/>
+        <w:tblW w:w="0" w:type="auto"/>
+        <w:tblBorders>
+          <w:top w:val="none" w:sz="0" w:space="0" w:color="auto"/>
+          <w:left w:val="none" w:sz="0" w:space="0" w:color="auto"/>
+          <w:bottom w:val="none" w:sz="0" w:space="0" w:color="auto"/>
+          <w:right w:val="none" w:sz="0" w:space="0" w:color="auto"/>
+          <w:insideH w:val="none" w:sz="0" w:space="0" w:color="auto"/>
+          <w:insideV w:val="none" w:sz="0" w:space="0" w:color="auto"/>
+        </w:tblBorders>
+        <w:tblLook w:val="04A0" w:firstRow="1" w:lastRow="0" w:firstColumn="1" w:lastColumn="0" w:noHBand="0" w:noVBand="1"/>
+      </w:tblPr>
+      <w:tblGrid>
+        <w:gridCol w:w="3788"/>
+        <w:gridCol w:w="3789"/>
+        <w:gridCol w:w="3789"/>
+      </w:tblGrid>
+      <w:tr>
+        <w:tc>
+          <w:tcPr>
+            <w:tcW w:w="3788" w:type="dxa"/>
+          </w:tcPr>
+          <w:p>
+            <w:pPr>
+              <w:pStyle w:val="ListParagraph"/>
+              <w:numPr>
+                <w:ilvl w:val="0"/>
+                <w:numId w:val="18"/>
+              </w:numPr>
+              <w:rPr>
+                <w:rFonts w:ascii="Times New Roman" w:eastAsia="Calibri" w:hAnsi="Times New Roman" w:cs="Times New Roman"/>
+                <w:szCs w:val="24"/>
+              </w:rPr>
+            </w:pPr>
+            <w:r>
+              <w:rPr>
+                <w:rFonts w:ascii="Times New Roman" w:hAnsi="Times New Roman" w:cs="Times New Roman"/>
+              </w:rPr>
+              <w:t>${</w:t>
+            </w:r>
+            <w:proofErr w:type="spellStart"/>
+            <w:r>
+              <w:rPr>
+                <w:rFonts w:ascii="Times New Roman" w:hAnsi="Times New Roman" w:cs="Times New Roman"/>
+              </w:rPr>
+              <w:t>JobPosition</w:t>
+            </w:r>
+            <w:proofErr w:type="spellEnd"/>
+            <w:r>
+              <w:rPr>
+                <w:rFonts w:ascii="Times New Roman" w:hAnsi="Times New Roman" w:cs="Times New Roman"/>
+              </w:rPr>
+              <w:t>}</w:t>
+            </w:r>
+          </w:p>
+        </w:tc>
+        <w:tc>
+          <w:tcPr>
+            <w:tcW w:w="3789" w:type="dxa"/>
+          </w:tcPr>
+          <w:p>
+            <w:pPr>
+              <w:rPr>
+                <w:rFonts w:ascii="Times New Roman" w:eastAsia="Calibri" w:hAnsi="Times New Roman" w:cs="Times New Roman"/>
+                <w:szCs w:val="24"/>
+              </w:rPr>
+            </w:pPr>
+            <w:r>
+              <w:rPr>
+                <w:rFonts w:ascii="Times New Roman" w:hAnsi="Times New Roman" w:cs="Times New Roman"/>
+              </w:rPr>
+              <w:t>${CompanyName}</w:t>
+            </w:r>
+          </w:p>
+        </w:tc>
+        <w:tc>
+          <w:tcPr>
+            <w:tcW w:w="3789" w:type="dxa"/>
+          </w:tcPr>
+          <w:p>
+            <w:pPr>
+              <w:rPr>
+                <w:rFonts w:ascii="Times New Roman" w:eastAsia="Calibri" w:hAnsi="Times New Roman" w:cs="Times New Roman"/>
+                <w:szCs w:val="24"/>
+              </w:rPr>
+            </w:pPr>
+            <w:r>
+              <w:rPr>
+                <w:rFonts w:ascii="Times New Roman" w:hAnsi="Times New Roman" w:cs="Times New Roman"/>
+              </w:rPr>
+              <w:t>${</w:t>
+            </w:r>
+            <w:proofErr w:type="spellStart"/>
+            <w:r>
+              <w:rPr>
+                <w:rFonts w:ascii="Times New Roman" w:hAnsi="Times New Roman" w:cs="Times New Roman"/>
+              </w:rPr>
+              <w:t>JobStart</w:t>
+            </w:r>
+            <w:proofErr w:type="spellEnd"/>
+            <w:r>
+              <w:rPr>
+                <w:rFonts w:ascii="Times New Roman" w:hAnsi="Times New Roman" w:cs="Times New Roman"/>
+              </w:rPr>
+              <w:t>} - ${</w:t>
+            </w:r>
+            <w:proofErr w:type="spellStart"/>
+            <w:r>
+              <w:rPr>
+                <w:rFonts w:ascii="Times New Roman" w:hAnsi="Times New Roman" w:cs="Times New Roman"/>
+              </w:rPr>
+              <w:t>JobEnd</w:t>
+            </w:r>
+            <w:proofErr w:type="spellEnd"/>
+            <w:r>
+              <w:rPr>
+                <w:rFonts w:ascii="Times New Roman" w:hAnsi="Times New Roman" w:cs="Times New Roman"/>
+              </w:rPr>
+              <w:t>}</w:t>
+            </w:r>
+          </w:p>
+        </w:tc>
+      </w:tr>
+    </w:tbl>
+    <w:p>
+      <w:pPr>
         <w:pStyle w:val="NoSpacing"/>
-        <w:rPr>
-          <w:rFonts w:ascii="Times New Roman" w:hAnsi="Times New Roman" w:cs="Times New Roman"/>
-        </w:rPr>
-      </w:pPr>
-      <w:r>
-        <w:rPr>
-          <w:rFonts w:ascii="Times New Roman" w:hAnsi="Times New Roman" w:cs="Times New Roman"/>
-        </w:rPr>
-        <w:t xml:space="preserve">* </w:t>
-      </w:r>
-      <w:r>
-        <w:rPr>
-          <w:rFonts w:ascii="Times New Roman" w:hAnsi="Times New Roman" w:cs="Times New Roman"/>
-        </w:rPr>
-        <w:t>Communication</w:t>
-      </w:r>
-      <w:r>
-        <w:rPr>
-          <w:rFonts w:ascii="Times New Roman" w:hAnsi="Times New Roman" w:cs="Times New Roman"/>
-        </w:rPr>
-        <w:tab/>
-      </w:r>
-      <w:r>
-        <w:rPr>
-          <w:rFonts w:ascii="Times New Roman" w:hAnsi="Times New Roman" w:cs="Times New Roman"/>
-        </w:rPr>
-        <w:tab/>
-        <w:t>* Teamwork</w:t>
-      </w:r>
-      <w:r>
-        <w:rPr>
-          <w:rFonts w:ascii="Times New Roman" w:hAnsi="Times New Roman" w:cs="Times New Roman"/>
-        </w:rPr>
-        <w:tab/>
-      </w:r>
-      <w:r>
-        <w:rPr>
-          <w:rFonts w:ascii="Times New Roman" w:hAnsi="Times New Roman" w:cs="Times New Roman"/>
-        </w:rPr>
-        <w:tab/>
-        <w:t>* Work ethic</w:t>
-      </w:r>
-      <w:r>
-        <w:rPr>
-          <w:rFonts w:ascii="Times New Roman" w:hAnsi="Times New Roman" w:cs="Times New Roman"/>
-        </w:rPr>
-        <w:tab/>
-      </w:r>
-      <w:r>
-        <w:rPr>
-          <w:rFonts w:ascii="Times New Roman" w:hAnsi="Times New Roman" w:cs="Times New Roman"/>
-        </w:rPr>
-        <w:tab/>
-      </w:r>
-      <w:r>
-        <w:rPr>
-          <w:rFonts w:ascii="Times New Roman" w:hAnsi="Times New Roman" w:cs="Times New Roman"/>
-        </w:rPr>
-        <w:tab/>
-        <w:t>* Attention to detail</w:t>
+        <w:ind w:left="720"/>
+        <w:rPr>
+          <w:rFonts w:ascii="Times New Roman" w:hAnsi="Times New Roman" w:cs="Times New Roman"/>
+        </w:rPr>
+      </w:pPr>
+      <w:r>
+        <w:rPr>
+          <w:rFonts w:ascii="Times New Roman" w:hAnsi="Times New Roman" w:cs="Times New Roman"/>
+        </w:rPr>
+        <w:t>${/</w:t>
+      </w:r>
+      <w:proofErr w:type="spellStart"/>
+      <w:r>
+        <w:rPr>
+          <w:rFonts w:ascii="Times New Roman" w:hAnsi="Times New Roman" w:cs="Times New Roman"/>
+        </w:rPr>
+        <w:t>block_work</w:t>
+      </w:r>
+      <w:proofErr w:type="spellEnd"/>
+      <w:r>
+        <w:rPr>
+          <w:rFonts w:ascii="Times New Roman" w:hAnsi="Times New Roman" w:cs="Times New Roman"/>
+        </w:rPr>
+        <w:t>}</w:t>
+      </w:r>
+      <w:r>
+        <w:rPr>
+          <w:rFonts w:ascii="Times New Roman" w:hAnsi="Times New Roman" w:cs="Times New Roman"/>
+        </w:rPr>
+        <w:br/>
       </w:r>
     </w:p>
     <w:p>
       <w:pPr>
         <w:pStyle w:val="NoSpacing"/>
+        <w:ind w:left="720"/>
         <w:rPr>
           <w:rFonts w:ascii="Times New Roman" w:hAnsi="Times New Roman" w:cs="Times New Roman"/>
         </w:rPr>
@@ -2265,14 +2603,28 @@
         <w:pStyle w:val="NoSpacing"/>
         <w:rPr>
           <w:rFonts w:ascii="Times New Roman" w:hAnsi="Times New Roman" w:cs="Times New Roman"/>
-        </w:rPr>
-      </w:pPr>
+          <w:color w:val="002060"/>
+          <w:szCs w:val="24"/>
+          <w:u w:val="single"/>
+        </w:rPr>
+      </w:pPr>
+      <w:r>
+        <w:rPr>
+          <w:rFonts w:ascii="Times New Roman" w:hAnsi="Times New Roman" w:cs="Times New Roman"/>
+          <w:b/>
+          <w:color w:val="002060"/>
+          <w:szCs w:val="24"/>
+          <w:u w:val="single"/>
+        </w:rPr>
+        <w:t>SKILLS</w:t>
+      </w:r>
     </w:p>
     <w:p>
       <w:pPr>
-        <w:pStyle w:val="NoSpacing"/>
-        <w:rPr>
-          <w:rFonts w:ascii="Times New Roman" w:hAnsi="Times New Roman" w:cs="Times New Roman"/>
+        <w:spacing w:after="0" w:line="240" w:lineRule="auto"/>
+        <w:rPr>
+          <w:rFonts w:ascii="Times New Roman" w:eastAsia="Calibri" w:hAnsi="Times New Roman" w:cs="Times New Roman"/>
+          <w:szCs w:val="24"/>
         </w:rPr>
       </w:pPr>
     </w:p>
@@ -2281,71 +2633,269 @@
         <w:pStyle w:val="NoSpacing"/>
         <w:rPr>
           <w:rFonts w:ascii="Times New Roman" w:hAnsi="Times New Roman" w:cs="Times New Roman"/>
-          <w:color w:val="002060"/>
-          <w:szCs w:val="24"/>
-          <w:u w:val="single"/>
-        </w:rPr>
-      </w:pPr>
-      <w:r>
-        <w:rPr>
-          <w:rFonts w:ascii="Times New Roman" w:hAnsi="Times New Roman" w:cs="Times New Roman"/>
-          <w:b/>
-          <w:color w:val="002060"/>
-          <w:szCs w:val="24"/>
-          <w:u w:val="single"/>
-        </w:rPr>
-        <w:t>CHARACTER REFERENCE</w:t>
+        </w:rPr>
+      </w:pPr>
+      <w:r>
+        <w:t>${</w:t>
+      </w:r>
+      <w:proofErr w:type="spellStart"/>
+      <w:r>
+        <w:t>SkillsList</w:t>
+      </w:r>
+      <w:proofErr w:type="spellEnd"/>
+      <w:r>
+        <w:t>}</w:t>
       </w:r>
     </w:p>
     <w:p>
       <w:pPr>
-        <w:spacing w:after="0" w:line="240" w:lineRule="auto"/>
-        <w:rPr>
-          <w:rFonts w:ascii="Times New Roman" w:eastAsia="Calibri" w:hAnsi="Times New Roman" w:cs="Times New Roman"/>
-          <w:szCs w:val="24"/>
+        <w:pStyle w:val="NoSpacing"/>
+        <w:rPr>
+          <w:rFonts w:ascii="Times New Roman" w:hAnsi="Times New Roman" w:cs="Times New Roman"/>
         </w:rPr>
       </w:pPr>
     </w:p>
     <w:p>
       <w:pPr>
         <w:pStyle w:val="NoSpacing"/>
-        <w:numPr>
-          <w:ilvl w:val="0"/>
-          <w:numId w:val="20"/>
-        </w:numPr>
-        <w:rPr>
-          <w:rFonts w:ascii="Times New Roman" w:hAnsi="Times New Roman" w:cs="Times New Roman"/>
-        </w:rPr>
-      </w:pPr>
-      <w:r>
-        <w:t>${</w:t>
-      </w:r>
-      <w:proofErr w:type="spellStart"/>
-      <w:r>
-        <w:t>CharacterReference</w:t>
-      </w:r>
-      <w:proofErr w:type="spellEnd"/>
-      <w:r>
-        <w:t>}</w:t>
+        <w:rPr>
+          <w:rFonts w:ascii="Times New Roman" w:hAnsi="Times New Roman" w:cs="Times New Roman"/>
+          <w:color w:val="002060"/>
+          <w:szCs w:val="24"/>
+          <w:u w:val="single"/>
+        </w:rPr>
+      </w:pPr>
+      <w:r>
+        <w:rPr>
+          <w:rFonts w:ascii="Times New Roman" w:hAnsi="Times New Roman" w:cs="Times New Roman"/>
+          <w:b/>
+          <w:color w:val="002060"/>
+          <w:szCs w:val="24"/>
+          <w:u w:val="single"/>
+        </w:rPr>
+        <w:t>CHARACTER REFERENCE</w:t>
       </w:r>
     </w:p>
     <w:p>
       <w:pPr>
-        <w:pStyle w:val="NoSpacing"/>
+        <w:spacing w:after="0" w:line="240" w:lineRule="auto"/>
         <w:rPr>
           <w:rFonts w:ascii="Times New Roman" w:eastAsia="Calibri" w:hAnsi="Times New Roman" w:cs="Times New Roman"/>
           <w:szCs w:val="24"/>
         </w:rPr>
       </w:pPr>
+      <w:r>
+        <w:rPr>
+          <w:rFonts w:ascii="Times New Roman" w:eastAsia="Calibri" w:hAnsi="Times New Roman" w:cs="Times New Roman"/>
+          <w:szCs w:val="24"/>
+        </w:rPr>
+        <w:tab/>
+      </w:r>
+      <w:r>
+        <w:rPr>
+          <w:rFonts w:ascii="Times New Roman" w:eastAsia="Calibri" w:hAnsi="Times New Roman" w:cs="Times New Roman"/>
+          <w:szCs w:val="24"/>
+        </w:rPr>
+        <w:t>${</w:t>
+      </w:r>
+      <w:proofErr w:type="spellStart"/>
+      <w:r>
+        <w:rPr>
+          <w:rFonts w:ascii="Times New Roman" w:eastAsia="Calibri" w:hAnsi="Times New Roman" w:cs="Times New Roman"/>
+          <w:szCs w:val="24"/>
+        </w:rPr>
+        <w:t>block_reference</w:t>
+      </w:r>
+      <w:proofErr w:type="spellEnd"/>
+      <w:r>
+        <w:rPr>
+          <w:rFonts w:ascii="Times New Roman" w:eastAsia="Calibri" w:hAnsi="Times New Roman" w:cs="Times New Roman"/>
+          <w:szCs w:val="24"/>
+        </w:rPr>
+        <w:t>}</w:t>
+      </w:r>
     </w:p>
     <w:p>
       <w:pPr>
+        <w:spacing w:after="0" w:line="240" w:lineRule="auto"/>
+        <w:rPr>
+          <w:rFonts w:ascii="Times New Roman" w:eastAsia="Calibri" w:hAnsi="Times New Roman" w:cs="Times New Roman"/>
+          <w:szCs w:val="24"/>
+        </w:rPr>
+      </w:pPr>
+      <w:r>
+        <w:rPr>
+          <w:rFonts w:ascii="Times New Roman" w:eastAsia="Calibri" w:hAnsi="Times New Roman" w:cs="Times New Roman"/>
+          <w:szCs w:val="24"/>
+        </w:rPr>
+        <w:tab/>
+      </w:r>
+    </w:p>
+    <w:tbl>
+      <w:tblPr>
+        <w:tblStyle w:val="TableGrid"/>
+        <w:tblW w:w="0" w:type="auto"/>
+        <w:tblBorders>
+          <w:top w:val="none" w:sz="0" w:space="0" w:color="auto"/>
+          <w:left w:val="none" w:sz="0" w:space="0" w:color="auto"/>
+          <w:bottom w:val="none" w:sz="0" w:space="0" w:color="auto"/>
+          <w:right w:val="none" w:sz="0" w:space="0" w:color="auto"/>
+          <w:insideH w:val="none" w:sz="0" w:space="0" w:color="auto"/>
+          <w:insideV w:val="none" w:sz="0" w:space="0" w:color="auto"/>
+        </w:tblBorders>
+        <w:tblLook w:val="04A0" w:firstRow="1" w:lastRow="0" w:firstColumn="1" w:lastColumn="0" w:noHBand="0" w:noVBand="1"/>
+      </w:tblPr>
+      <w:tblGrid>
+        <w:gridCol w:w="3788"/>
+        <w:gridCol w:w="3789"/>
+        <w:gridCol w:w="3789"/>
+      </w:tblGrid>
+      <w:tr>
+        <w:tc>
+          <w:tcPr>
+            <w:tcW w:w="3788" w:type="dxa"/>
+          </w:tcPr>
+          <w:p>
+            <w:pPr>
+              <w:pStyle w:val="ListParagraph"/>
+              <w:numPr>
+                <w:ilvl w:val="0"/>
+                <w:numId w:val="21"/>
+              </w:numPr>
+              <w:rPr>
+                <w:rFonts w:ascii="Times New Roman" w:eastAsia="Calibri" w:hAnsi="Times New Roman" w:cs="Times New Roman"/>
+                <w:szCs w:val="24"/>
+              </w:rPr>
+            </w:pPr>
+            <w:r>
+              <w:rPr>
+                <w:rFonts w:ascii="Times New Roman" w:hAnsi="Times New Roman" w:cs="Times New Roman"/>
+              </w:rPr>
+              <w:t>${</w:t>
+            </w:r>
+            <w:proofErr w:type="spellStart"/>
+            <w:r>
+              <w:rPr>
+                <w:rFonts w:ascii="Times New Roman" w:hAnsi="Times New Roman" w:cs="Times New Roman"/>
+              </w:rPr>
+              <w:t>RefName</w:t>
+            </w:r>
+            <w:proofErr w:type="spellEnd"/>
+            <w:r>
+              <w:rPr>
+                <w:rFonts w:ascii="Times New Roman" w:hAnsi="Times New Roman" w:cs="Times New Roman"/>
+              </w:rPr>
+              <w:t>}</w:t>
+            </w:r>
+          </w:p>
+        </w:tc>
+        <w:tc>
+          <w:tcPr>
+            <w:tcW w:w="3789" w:type="dxa"/>
+          </w:tcPr>
+          <w:p>
+            <w:pPr>
+              <w:rPr>
+                <w:rFonts w:ascii="Times New Roman" w:eastAsia="Calibri" w:hAnsi="Times New Roman" w:cs="Times New Roman"/>
+                <w:szCs w:val="24"/>
+              </w:rPr>
+            </w:pPr>
+            <w:r>
+              <w:rPr>
+                <w:rFonts w:ascii="Times New Roman" w:hAnsi="Times New Roman" w:cs="Times New Roman"/>
+              </w:rPr>
+              <w:t>${</w:t>
+            </w:r>
+            <w:proofErr w:type="spellStart"/>
+            <w:r>
+              <w:rPr>
+                <w:rFonts w:ascii="Times New Roman" w:hAnsi="Times New Roman" w:cs="Times New Roman"/>
+              </w:rPr>
+              <w:t>RefPosition</w:t>
+            </w:r>
+            <w:proofErr w:type="spellEnd"/>
+            <w:r>
+              <w:rPr>
+                <w:rFonts w:ascii="Times New Roman" w:hAnsi="Times New Roman" w:cs="Times New Roman"/>
+              </w:rPr>
+              <w:t>}</w:t>
+            </w:r>
+          </w:p>
+        </w:tc>
+        <w:tc>
+          <w:tcPr>
+            <w:tcW w:w="3789" w:type="dxa"/>
+          </w:tcPr>
+          <w:p>
+            <w:pPr>
+              <w:rPr>
+                <w:rFonts w:ascii="Times New Roman" w:eastAsia="Calibri" w:hAnsi="Times New Roman" w:cs="Times New Roman"/>
+                <w:szCs w:val="24"/>
+              </w:rPr>
+            </w:pPr>
+            <w:r>
+              <w:rPr>
+                <w:rFonts w:ascii="Times New Roman" w:hAnsi="Times New Roman" w:cs="Times New Roman"/>
+              </w:rPr>
+              <w:t>${</w:t>
+            </w:r>
+            <w:proofErr w:type="spellStart"/>
+            <w:r>
+              <w:rPr>
+                <w:rFonts w:ascii="Times New Roman" w:hAnsi="Times New Roman" w:cs="Times New Roman"/>
+              </w:rPr>
+              <w:t>RefContact</w:t>
+            </w:r>
+            <w:proofErr w:type="spellEnd"/>
+            <w:r>
+              <w:rPr>
+                <w:rFonts w:ascii="Times New Roman" w:hAnsi="Times New Roman" w:cs="Times New Roman"/>
+              </w:rPr>
+              <w:t>}</w:t>
+            </w:r>
+          </w:p>
+        </w:tc>
+      </w:tr>
+    </w:tbl>
+    <w:p>
+      <w:pPr>
         <w:pStyle w:val="NoSpacing"/>
+        <w:ind w:firstLine="720"/>
         <w:rPr>
           <w:rFonts w:ascii="Times New Roman" w:eastAsia="Calibri" w:hAnsi="Times New Roman" w:cs="Times New Roman"/>
           <w:szCs w:val="24"/>
         </w:rPr>
       </w:pPr>
+      <w:r>
+        <w:rPr>
+          <w:rFonts w:ascii="Times New Roman" w:eastAsia="Calibri" w:hAnsi="Times New Roman" w:cs="Times New Roman"/>
+          <w:szCs w:val="24"/>
+        </w:rPr>
+        <w:t>${/</w:t>
+      </w:r>
+      <w:proofErr w:type="spellStart"/>
+      <w:r>
+        <w:rPr>
+          <w:rFonts w:ascii="Times New Roman" w:eastAsia="Calibri" w:hAnsi="Times New Roman" w:cs="Times New Roman"/>
+          <w:szCs w:val="24"/>
+        </w:rPr>
+        <w:t>block_reference</w:t>
+      </w:r>
+      <w:proofErr w:type="spellEnd"/>
+      <w:r>
+        <w:rPr>
+          <w:rFonts w:ascii="Times New Roman" w:eastAsia="Calibri" w:hAnsi="Times New Roman" w:cs="Times New Roman"/>
+          <w:szCs w:val="24"/>
+        </w:rPr>
+        <w:t>}</w:t>
+      </w:r>
+      <w:r>
+        <w:rPr>
+          <w:rFonts w:ascii="Times New Roman" w:eastAsia="Calibri" w:hAnsi="Times New Roman" w:cs="Times New Roman"/>
+          <w:szCs w:val="24"/>
+        </w:rPr>
+        <w:br/>
+      </w:r>
     </w:p>
     <w:p>
       <w:pPr>
@@ -2355,27 +2905,6 @@
           <w:szCs w:val="24"/>
         </w:rPr>
       </w:pPr>
-      <w:r>
-        <w:rPr>
-          <w:rFonts w:ascii="Times New Roman" w:hAnsi="Times New Roman" w:cs="Times New Roman"/>
-          <w:sz w:val="24"/>
-        </w:rPr>
-        <w:t>I hereby declare that all information stated above are true and correct to the best of my knowledge and belief.</w:t>
-      </w:r>
-      <w:r>
-        <w:rPr>
-          <w:rFonts w:ascii="Times New Roman" w:eastAsia="Calibri" w:hAnsi="Times New Roman" w:cs="Times New Roman"/>
-          <w:szCs w:val="24"/>
-        </w:rPr>
-        <w:tab/>
-      </w:r>
-      <w:r>
-        <w:rPr>
-          <w:rFonts w:ascii="Times New Roman" w:eastAsia="Calibri" w:hAnsi="Times New Roman" w:cs="Times New Roman"/>
-          <w:szCs w:val="24"/>
-        </w:rPr>
-        <w:tab/>
-      </w:r>
     </w:p>
     <w:p>
       <w:pPr>
@@ -2387,6 +2916,21 @@
       </w:pPr>
       <w:r>
         <w:rPr>
+          <w:rFonts w:ascii="Times New Roman" w:hAnsi="Times New Roman" w:cs="Times New Roman"/>
+          <w:sz w:val="24"/>
+        </w:rPr>
+        <w:lastRenderedPageBreak/>
+        <w:t>I hereby declare that all information stated above are true and correct to the best of my knowledge and belief.</w:t>
+      </w:r>
+      <w:r>
+        <w:rPr>
+          <w:rFonts w:ascii="Times New Roman" w:eastAsia="Calibri" w:hAnsi="Times New Roman" w:cs="Times New Roman"/>
+          <w:szCs w:val="24"/>
+        </w:rPr>
+        <w:tab/>
+      </w:r>
+      <w:r>
+        <w:rPr>
           <w:rFonts w:ascii="Times New Roman" w:eastAsia="Calibri" w:hAnsi="Times New Roman" w:cs="Times New Roman"/>
           <w:szCs w:val="24"/>
         </w:rPr>
@@ -2397,219 +2941,126 @@
       <w:pPr>
         <w:pStyle w:val="NoSpacing"/>
         <w:rPr>
-          <w:rFonts w:ascii="Times New Roman" w:hAnsi="Times New Roman" w:cs="Times New Roman"/>
-          <w:sz w:val="24"/>
-        </w:rPr>
-      </w:pPr>
+          <w:rFonts w:ascii="Times New Roman" w:eastAsia="Calibri" w:hAnsi="Times New Roman" w:cs="Times New Roman"/>
+          <w:szCs w:val="24"/>
+        </w:rPr>
+      </w:pPr>
+      <w:r>
+        <w:rPr>
+          <w:rFonts w:ascii="Times New Roman" w:eastAsia="Calibri" w:hAnsi="Times New Roman" w:cs="Times New Roman"/>
+          <w:szCs w:val="24"/>
+        </w:rPr>
+        <w:tab/>
+      </w:r>
     </w:p>
     <w:p>
       <w:pPr>
         <w:pStyle w:val="NoSpacing"/>
         <w:rPr>
+          <w:rFonts w:ascii="Times New Roman" w:hAnsi="Times New Roman" w:cs="Times New Roman"/>
+          <w:sz w:val="24"/>
+        </w:rPr>
+      </w:pPr>
+    </w:p>
+    <w:tbl>
+      <w:tblPr>
+        <w:tblStyle w:val="TableGrid"/>
+        <w:tblW w:w="0" w:type="auto"/>
+        <w:tblInd w:w="7083" w:type="dxa"/>
+        <w:tblBorders>
+          <w:top w:val="none" w:sz="0" w:space="0" w:color="auto"/>
+          <w:left w:val="none" w:sz="0" w:space="0" w:color="auto"/>
+          <w:bottom w:val="none" w:sz="0" w:space="0" w:color="auto"/>
+          <w:right w:val="none" w:sz="0" w:space="0" w:color="auto"/>
+          <w:insideH w:val="none" w:sz="0" w:space="0" w:color="auto"/>
+          <w:insideV w:val="none" w:sz="0" w:space="0" w:color="auto"/>
+        </w:tblBorders>
+        <w:tblLook w:val="04A0" w:firstRow="1" w:lastRow="0" w:firstColumn="1" w:lastColumn="0" w:noHBand="0" w:noVBand="1"/>
+      </w:tblPr>
+      <w:tblGrid>
+        <w:gridCol w:w="2873"/>
+      </w:tblGrid>
+      <w:tr>
+        <w:trPr>
+          <w:trHeight w:val="311"/>
+        </w:trPr>
+        <w:tc>
+          <w:tcPr>
+            <w:tcW w:w="2873" w:type="dxa"/>
+            <w:tcBorders>
+              <w:bottom w:val="single" w:sz="4" w:space="0" w:color="auto"/>
+            </w:tcBorders>
+          </w:tcPr>
+          <w:p>
+            <w:pPr>
+              <w:pStyle w:val="NoSpacing"/>
+              <w:rPr>
+                <w:rFonts w:ascii="Times New Roman" w:hAnsi="Times New Roman" w:cs="Times New Roman"/>
+                <w:sz w:val="24"/>
+              </w:rPr>
+            </w:pPr>
+          </w:p>
+        </w:tc>
+      </w:tr>
+      <w:tr>
+        <w:trPr>
+          <w:trHeight w:val="311"/>
+        </w:trPr>
+        <w:tc>
+          <w:tcPr>
+            <w:tcW w:w="2873" w:type="dxa"/>
+            <w:tcBorders>
+              <w:top w:val="single" w:sz="4" w:space="0" w:color="auto"/>
+            </w:tcBorders>
+          </w:tcPr>
+          <w:p>
+            <w:pPr>
+              <w:pStyle w:val="NoSpacing"/>
+              <w:jc w:val="center"/>
+              <w:rPr>
+                <w:rFonts w:ascii="Times New Roman" w:hAnsi="Times New Roman" w:cs="Times New Roman"/>
+                <w:sz w:val="24"/>
+              </w:rPr>
+            </w:pPr>
+            <w:r>
+              <w:rPr>
+                <w:rFonts w:ascii="Times New Roman" w:eastAsia="Calibri" w:hAnsi="Times New Roman" w:cs="Times New Roman"/>
+                <w:b/>
+                <w:szCs w:val="24"/>
+              </w:rPr>
+              <w:t>${</w:t>
+            </w:r>
+            <w:proofErr w:type="spellStart"/>
+            <w:r>
+              <w:rPr>
+                <w:rFonts w:ascii="Times New Roman" w:eastAsia="Calibri" w:hAnsi="Times New Roman" w:cs="Times New Roman"/>
+                <w:b/>
+                <w:szCs w:val="24"/>
+              </w:rPr>
+              <w:t>FullName</w:t>
+            </w:r>
+            <w:proofErr w:type="spellEnd"/>
+            <w:r>
+              <w:rPr>
+                <w:rFonts w:ascii="Times New Roman" w:eastAsia="Calibri" w:hAnsi="Times New Roman" w:cs="Times New Roman"/>
+                <w:b/>
+                <w:szCs w:val="24"/>
+              </w:rPr>
+              <w:t>}</w:t>
+            </w:r>
+          </w:p>
+        </w:tc>
+      </w:tr>
+    </w:tbl>
+    <w:p>
+      <w:pPr>
+        <w:pStyle w:val="NoSpacing"/>
+        <w:rPr>
           <w:rFonts w:ascii="Times New Roman" w:eastAsia="Calibri" w:hAnsi="Times New Roman" w:cs="Times New Roman"/>
           <w:b/>
           <w:szCs w:val="24"/>
         </w:rPr>
       </w:pPr>
-      <w:r>
-        <w:rPr>
-          <w:rFonts w:ascii="Times New Roman" w:eastAsia="Calibri" w:hAnsi="Times New Roman" w:cs="Times New Roman"/>
-          <w:noProof/>
-          <w:szCs w:val="24"/>
-        </w:rPr>
-        <mc:AlternateContent>
-          <mc:Choice Requires="wps">
-            <w:drawing>
-              <wp:anchor distT="0" distB="0" distL="114300" distR="114300" simplePos="0" relativeHeight="251663360" behindDoc="0" locked="0" layoutInCell="1" allowOverlap="1" wp14:anchorId="4EF37041" wp14:editId="799750A4">
-                <wp:simplePos x="0" y="0"/>
-                <wp:positionH relativeFrom="column">
-                  <wp:posOffset>4491990</wp:posOffset>
-                </wp:positionH>
-                <wp:positionV relativeFrom="paragraph">
-                  <wp:posOffset>137795</wp:posOffset>
-                </wp:positionV>
-                <wp:extent cx="1828800" cy="0"/>
-                <wp:effectExtent l="13335" t="11430" r="5715" b="7620"/>
-                <wp:wrapNone/>
-                <wp:docPr id="1" name="AutoShape 12"/>
-                <wp:cNvGraphicFramePr>
-                  <a:graphicFrameLocks xmlns:a="http://schemas.openxmlformats.org/drawingml/2006/main"/>
-                </wp:cNvGraphicFramePr>
-                <a:graphic xmlns:a="http://schemas.openxmlformats.org/drawingml/2006/main">
-                  <a:graphicData uri="http://schemas.microsoft.com/office/word/2010/wordprocessingShape">
-                    <wps:wsp>
-                      <wps:cNvCnPr>
-                        <a:cxnSpLocks noChangeShapeType="1"/>
-                      </wps:cNvCnPr>
-                      <wps:spPr bwMode="auto">
-                        <a:xfrm flipV="1">
-                          <a:off x="0" y="0"/>
-                          <a:ext cx="1828800" cy="0"/>
-                        </a:xfrm>
-                        <a:prstGeom prst="straightConnector1">
-                          <a:avLst/>
-                        </a:prstGeom>
-                        <a:noFill/>
-                        <a:ln w="9525">
-                          <a:solidFill>
-                            <a:srgbClr val="000000"/>
-                          </a:solidFill>
-                          <a:round/>
-                          <a:headEnd/>
-                          <a:tailEnd/>
-                        </a:ln>
-                        <a:extLst>
-                          <a:ext uri="{909E8E84-426E-40DD-AFC4-6F175D3DCCD1}">
-                            <a14:hiddenFill xmlns:a14="http://schemas.microsoft.com/office/drawing/2010/main">
-                              <a:noFill/>
-                            </a14:hiddenFill>
-                          </a:ext>
-                        </a:extLst>
-                      </wps:spPr>
-                      <wps:bodyPr/>
-                    </wps:wsp>
-                  </a:graphicData>
-                </a:graphic>
-                <wp14:sizeRelH relativeFrom="page">
-                  <wp14:pctWidth>0</wp14:pctWidth>
-                </wp14:sizeRelH>
-                <wp14:sizeRelV relativeFrom="page">
-                  <wp14:pctHeight>0</wp14:pctHeight>
-                </wp14:sizeRelV>
-              </wp:anchor>
-            </w:drawing>
-          </mc:Choice>
-          <mc:Fallback>
-            <w:pict>
-              <v:shape w14:anchorId="5A3E59FE" id="AutoShape 12" o:spid="_x0000_s1026" type="#_x0000_t32" style="position:absolute;margin-left:353.7pt;margin-top:10.85pt;width:2in;height:0;flip:y;z-index:251663360;visibility:visible;mso-wrap-style:square;mso-width-percent:0;mso-height-percent:0;mso-wrap-distance-left:9pt;mso-wrap-distance-top:0;mso-wrap-distance-right:9pt;mso-wrap-distance-bottom:0;mso-position-horizontal:absolute;mso-position-horizontal-relative:text;mso-position-vertical:absolute;mso-position-vertical-relative:text;mso-width-percent:0;mso-height-percent:0;mso-width-relative:page;mso-height-relative:page" o:gfxdata="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"/>
-            </w:pict>
-          </mc:Fallback>
-        </mc:AlternateContent>
-      </w:r>
-    </w:p>
-    <w:p>
-      <w:pPr>
-        <w:pStyle w:val="NoSpacing"/>
-        <w:rPr>
-          <w:rFonts w:ascii="Times New Roman" w:eastAsia="Calibri" w:hAnsi="Times New Roman" w:cs="Times New Roman"/>
-          <w:b/>
-          <w:szCs w:val="24"/>
-        </w:rPr>
-      </w:pPr>
-      <w:r>
-        <w:rPr>
-          <w:rFonts w:ascii="Times New Roman" w:eastAsia="Calibri" w:hAnsi="Times New Roman" w:cs="Times New Roman"/>
-          <w:b/>
-          <w:szCs w:val="24"/>
-        </w:rPr>
-        <w:tab/>
-      </w:r>
-      <w:r>
-        <w:rPr>
-          <w:rFonts w:ascii="Times New Roman" w:eastAsia="Calibri" w:hAnsi="Times New Roman" w:cs="Times New Roman"/>
-          <w:b/>
-          <w:szCs w:val="24"/>
-        </w:rPr>
-        <w:tab/>
-      </w:r>
-      <w:r>
-        <w:rPr>
-          <w:rFonts w:ascii="Times New Roman" w:eastAsia="Calibri" w:hAnsi="Times New Roman" w:cs="Times New Roman"/>
-          <w:b/>
-          <w:szCs w:val="24"/>
-        </w:rPr>
-        <w:tab/>
-      </w:r>
-      <w:r>
-        <w:rPr>
-          <w:rFonts w:ascii="Times New Roman" w:eastAsia="Calibri" w:hAnsi="Times New Roman" w:cs="Times New Roman"/>
-          <w:b/>
-          <w:szCs w:val="24"/>
-        </w:rPr>
-        <w:tab/>
-      </w:r>
-      <w:r>
-        <w:rPr>
-          <w:rFonts w:ascii="Times New Roman" w:eastAsia="Calibri" w:hAnsi="Times New Roman" w:cs="Times New Roman"/>
-          <w:b/>
-          <w:szCs w:val="24"/>
-        </w:rPr>
-        <w:tab/>
-      </w:r>
-      <w:r>
-        <w:rPr>
-          <w:rFonts w:ascii="Times New Roman" w:eastAsia="Calibri" w:hAnsi="Times New Roman" w:cs="Times New Roman"/>
-          <w:b/>
-          <w:szCs w:val="24"/>
-        </w:rPr>
-        <w:tab/>
-      </w:r>
-      <w:r>
-        <w:rPr>
-          <w:rFonts w:ascii="Times New Roman" w:eastAsia="Calibri" w:hAnsi="Times New Roman" w:cs="Times New Roman"/>
-          <w:b/>
-          <w:szCs w:val="24"/>
-        </w:rPr>
-        <w:tab/>
-      </w:r>
-      <w:r>
-        <w:rPr>
-          <w:rFonts w:ascii="Times New Roman" w:eastAsia="Calibri" w:hAnsi="Times New Roman" w:cs="Times New Roman"/>
-          <w:b/>
-          <w:szCs w:val="24"/>
-        </w:rPr>
-        <w:tab/>
-      </w:r>
-      <w:r>
-        <w:rPr>
-          <w:rFonts w:ascii="Times New Roman" w:eastAsia="Calibri" w:hAnsi="Times New Roman" w:cs="Times New Roman"/>
-          <w:b/>
-          <w:szCs w:val="24"/>
-        </w:rPr>
-        <w:tab/>
-      </w:r>
-      <w:r>
-        <w:rPr>
-          <w:rFonts w:ascii="Times New Roman" w:eastAsia="Calibri" w:hAnsi="Times New Roman" w:cs="Times New Roman"/>
-          <w:b/>
-          <w:szCs w:val="24"/>
-        </w:rPr>
-        <w:tab/>
-      </w:r>
-      <w:r>
-        <w:rPr>
-          <w:rFonts w:ascii="Times New Roman" w:eastAsia="Calibri" w:hAnsi="Times New Roman" w:cs="Times New Roman"/>
-          <w:b/>
-          <w:szCs w:val="24"/>
-        </w:rPr>
-        <w:tab/>
-      </w:r>
-      <w:r>
-        <w:rPr>
-          <w:rFonts w:ascii="Times New Roman" w:eastAsia="Calibri" w:hAnsi="Times New Roman" w:cs="Times New Roman"/>
-          <w:b/>
-          <w:szCs w:val="24"/>
-        </w:rPr>
-        <w:t>${</w:t>
-      </w:r>
-      <w:proofErr w:type="spellStart"/>
-      <w:r>
-        <w:rPr>
-          <w:rFonts w:ascii="Times New Roman" w:eastAsia="Calibri" w:hAnsi="Times New Roman" w:cs="Times New Roman"/>
-          <w:b/>
-          <w:szCs w:val="24"/>
-        </w:rPr>
-        <w:t>FullName</w:t>
-      </w:r>
-      <w:proofErr w:type="spellEnd"/>
-      <w:r>
-        <w:rPr>
-          <w:rFonts w:ascii="Times New Roman" w:eastAsia="Calibri" w:hAnsi="Times New Roman" w:cs="Times New Roman"/>
-          <w:b/>
-          <w:szCs w:val="24"/>
-        </w:rPr>
-        <w:t>}</w:t>
-      </w:r>
     </w:p>
     <w:sectPr>
       <w:pgSz w:w="12240" w:h="15840" w:code="1"/>
@@ -2644,7 +3095,7 @@
         <v:path o:extrusionok="f" gradientshapeok="t" o:connecttype="rect"/>
         <o:lock v:ext="edit" aspectratio="t"/>
       </v:shapetype>
-      <v:shape id="_x0000_i1199" type="#_x0000_t75" style="width:9.6pt;height:9.6pt" o:bullet="t">
+      <v:shape id="_x0000_i1076" type="#_x0000_t75" style="width:9.6pt;height:9.6pt" o:bullet="t">
         <v:imagedata r:id="rId1" o:title="msoA35"/>
       </v:shape>
     </w:pict>
@@ -2772,7 +3223,7 @@
       <w:lvlText w:val=""/>
       <w:lvlJc w:val="left"/>
       <w:pPr>
-        <w:ind w:left="720" w:hanging="360"/>
+        <w:ind w:left="786" w:hanging="360"/>
       </w:pPr>
       <w:rPr>
         <w:rFonts w:ascii="Wingdings" w:hAnsi="Wingdings" w:hint="default"/>
@@ -2784,7 +3235,7 @@
       <w:lvlText w:val="o"/>
       <w:lvlJc w:val="left"/>
       <w:pPr>
-        <w:ind w:left="1440" w:hanging="360"/>
+        <w:ind w:left="1506" w:hanging="360"/>
       </w:pPr>
       <w:rPr>
         <w:rFonts w:ascii="Courier New" w:hAnsi="Courier New" w:cs="Courier New" w:hint="default"/>
@@ -2796,7 +3247,7 @@
       <w:lvlText w:val=""/>
       <w:lvlJc w:val="left"/>
       <w:pPr>
-        <w:ind w:left="2160" w:hanging="360"/>
+        <w:ind w:left="2226" w:hanging="360"/>
       </w:pPr>
       <w:rPr>
         <w:rFonts w:ascii="Wingdings" w:hAnsi="Wingdings" w:hint="default"/>
@@ -2808,7 +3259,7 @@
       <w:lvlText w:val=""/>
       <w:lvlJc w:val="left"/>
       <w:pPr>
-        <w:ind w:left="2880" w:hanging="360"/>
+        <w:ind w:left="2946" w:hanging="360"/>
       </w:pPr>
       <w:rPr>
         <w:rFonts w:ascii="Symbol" w:hAnsi="Symbol" w:hint="default"/>
@@ -2820,7 +3271,7 @@
       <w:lvlText w:val="o"/>
       <w:lvlJc w:val="left"/>
       <w:pPr>
-        <w:ind w:left="3600" w:hanging="360"/>
+        <w:ind w:left="3666" w:hanging="360"/>
       </w:pPr>
       <w:rPr>
         <w:rFonts w:ascii="Courier New" w:hAnsi="Courier New" w:cs="Courier New" w:hint="default"/>
@@ -2832,7 +3283,7 @@
       <w:lvlText w:val=""/>
       <w:lvlJc w:val="left"/>
       <w:pPr>
-        <w:ind w:left="4320" w:hanging="360"/>
+        <w:ind w:left="4386" w:hanging="360"/>
       </w:pPr>
       <w:rPr>
         <w:rFonts w:ascii="Wingdings" w:hAnsi="Wingdings" w:hint="default"/>
@@ -2844,7 +3295,7 @@
       <w:lvlText w:val=""/>
       <w:lvlJc w:val="left"/>
       <w:pPr>
-        <w:ind w:left="5040" w:hanging="360"/>
+        <w:ind w:left="5106" w:hanging="360"/>
       </w:pPr>
       <w:rPr>
         <w:rFonts w:ascii="Symbol" w:hAnsi="Symbol" w:hint="default"/>
@@ -2856,7 +3307,7 @@
       <w:lvlText w:val="o"/>
       <w:lvlJc w:val="left"/>
       <w:pPr>
-        <w:ind w:left="5760" w:hanging="360"/>
+        <w:ind w:left="5826" w:hanging="360"/>
       </w:pPr>
       <w:rPr>
         <w:rFonts w:ascii="Courier New" w:hAnsi="Courier New" w:cs="Courier New" w:hint="default"/>
@@ -2868,7 +3319,7 @@
       <w:lvlText w:val=""/>
       <w:lvlJc w:val="left"/>
       <w:pPr>
-        <w:ind w:left="6480" w:hanging="360"/>
+        <w:ind w:left="6546" w:hanging="360"/>
       </w:pPr>
       <w:rPr>
         <w:rFonts w:ascii="Wingdings" w:hAnsi="Wingdings" w:hint="default"/>
@@ -3442,6 +3893,120 @@
     </w:lvl>
   </w:abstractNum>
   <w:abstractNum w:abstractNumId="7" w15:restartNumberingAfterBreak="0">
+    <w:nsid w:val="3354595D"/>
+    <w:multiLevelType w:val="hybridMultilevel"/>
+    <w:tmpl w:val="3894F082"/>
+    <w:lvl w:ilvl="0" w:tplc="34090007">
+      <w:start w:val="1"/>
+      <w:numFmt w:val="bullet"/>
+      <w:lvlText w:val=""/>
+      <w:lvlPicBulletId w:val="0"/>
+      <w:lvlJc w:val="left"/>
+      <w:pPr>
+        <w:ind w:left="720" w:hanging="360"/>
+      </w:pPr>
+      <w:rPr>
+        <w:rFonts w:ascii="Symbol" w:hAnsi="Symbol" w:hint="default"/>
+      </w:rPr>
+    </w:lvl>
+    <w:lvl w:ilvl="1" w:tplc="34090003" w:tentative="1">
+      <w:start w:val="1"/>
+      <w:numFmt w:val="bullet"/>
+      <w:lvlText w:val="o"/>
+      <w:lvlJc w:val="left"/>
+      <w:pPr>
+        <w:ind w:left="1440" w:hanging="360"/>
+      </w:pPr>
+      <w:rPr>
+        <w:rFonts w:ascii="Courier New" w:hAnsi="Courier New" w:cs="Courier New" w:hint="default"/>
+      </w:rPr>
+    </w:lvl>
+    <w:lvl w:ilvl="2" w:tplc="34090005" w:tentative="1">
+      <w:start w:val="1"/>
+      <w:numFmt w:val="bullet"/>
+      <w:lvlText w:val=""/>
+      <w:lvlJc w:val="left"/>
+      <w:pPr>
+        <w:ind w:left="2160" w:hanging="360"/>
+      </w:pPr>
+      <w:rPr>
+        <w:rFonts w:ascii="Wingdings" w:hAnsi="Wingdings" w:hint="default"/>
+      </w:rPr>
+    </w:lvl>
+    <w:lvl w:ilvl="3" w:tplc="34090001" w:tentative="1">
+      <w:start w:val="1"/>
+      <w:numFmt w:val="bullet"/>
+      <w:lvlText w:val=""/>
+      <w:lvlJc w:val="left"/>
+      <w:pPr>
+        <w:ind w:left="2880" w:hanging="360"/>
+      </w:pPr>
+      <w:rPr>
+        <w:rFonts w:ascii="Symbol" w:hAnsi="Symbol" w:hint="default"/>
+      </w:rPr>
+    </w:lvl>
+    <w:lvl w:ilvl="4" w:tplc="34090003" w:tentative="1">
+      <w:start w:val="1"/>
+      <w:numFmt w:val="bullet"/>
+      <w:lvlText w:val="o"/>
+      <w:lvlJc w:val="left"/>
+      <w:pPr>
+        <w:ind w:left="3600" w:hanging="360"/>
+      </w:pPr>
+      <w:rPr>
+        <w:rFonts w:ascii="Courier New" w:hAnsi="Courier New" w:cs="Courier New" w:hint="default"/>
+      </w:rPr>
+    </w:lvl>
+    <w:lvl w:ilvl="5" w:tplc="34090005" w:tentative="1">
+      <w:start w:val="1"/>
+      <w:numFmt w:val="bullet"/>
+      <w:lvlText w:val=""/>
+      <w:lvlJc w:val="left"/>
+      <w:pPr>
+        <w:ind w:left="4320" w:hanging="360"/>
+      </w:pPr>
+      <w:rPr>
+        <w:rFonts w:ascii="Wingdings" w:hAnsi="Wingdings" w:hint="default"/>
+      </w:rPr>
+    </w:lvl>
+    <w:lvl w:ilvl="6" w:tplc="34090001" w:tentative="1">
+      <w:start w:val="1"/>
+      <w:numFmt w:val="bullet"/>
+      <w:lvlText w:val=""/>
+      <w:lvlJc w:val="left"/>
+      <w:pPr>
+        <w:ind w:left="5040" w:hanging="360"/>
+      </w:pPr>
+      <w:rPr>
+        <w:rFonts w:ascii="Symbol" w:hAnsi="Symbol" w:hint="default"/>
+      </w:rPr>
+    </w:lvl>
+    <w:lvl w:ilvl="7" w:tplc="34090003" w:tentative="1">
+      <w:start w:val="1"/>
+      <w:numFmt w:val="bullet"/>
+      <w:lvlText w:val="o"/>
+      <w:lvlJc w:val="left"/>
+      <w:pPr>
+        <w:ind w:left="5760" w:hanging="360"/>
+      </w:pPr>
+      <w:rPr>
+        <w:rFonts w:ascii="Courier New" w:hAnsi="Courier New" w:cs="Courier New" w:hint="default"/>
+      </w:rPr>
+    </w:lvl>
+    <w:lvl w:ilvl="8" w:tplc="34090005" w:tentative="1">
+      <w:start w:val="1"/>
+      <w:numFmt w:val="bullet"/>
+      <w:lvlText w:val=""/>
+      <w:lvlJc w:val="left"/>
+      <w:pPr>
+        <w:ind w:left="6480" w:hanging="360"/>
+      </w:pPr>
+      <w:rPr>
+        <w:rFonts w:ascii="Wingdings" w:hAnsi="Wingdings" w:hint="default"/>
+      </w:rPr>
+    </w:lvl>
+  </w:abstractNum>
+  <w:abstractNum w:abstractNumId="8" w15:restartNumberingAfterBreak="0">
     <w:nsid w:val="3D6D4F17"/>
     <w:multiLevelType w:val="hybridMultilevel"/>
     <w:tmpl w:val="D1ECF95E"/>
@@ -3554,7 +4119,7 @@
       </w:rPr>
     </w:lvl>
   </w:abstractNum>
-  <w:abstractNum w:abstractNumId="8" w15:restartNumberingAfterBreak="0">
+  <w:abstractNum w:abstractNumId="9" w15:restartNumberingAfterBreak="0">
     <w:nsid w:val="4D020962"/>
     <w:multiLevelType w:val="hybridMultilevel"/>
     <w:tmpl w:val="3DEE52A4"/>
@@ -3668,7 +4233,7 @@
       </w:rPr>
     </w:lvl>
   </w:abstractNum>
-  <w:abstractNum w:abstractNumId="9" w15:restartNumberingAfterBreak="0">
+  <w:abstractNum w:abstractNumId="10" w15:restartNumberingAfterBreak="0">
     <w:nsid w:val="51706E53"/>
     <w:multiLevelType w:val="hybridMultilevel"/>
     <w:tmpl w:val="7FB85D82"/>
@@ -3781,7 +4346,7 @@
       </w:rPr>
     </w:lvl>
   </w:abstractNum>
-  <w:abstractNum w:abstractNumId="10" w15:restartNumberingAfterBreak="0">
+  <w:abstractNum w:abstractNumId="11" w15:restartNumberingAfterBreak="0">
     <w:nsid w:val="59D91B11"/>
     <w:multiLevelType w:val="hybridMultilevel"/>
     <w:tmpl w:val="3DAEB02C"/>
@@ -3894,7 +4459,7 @@
       </w:rPr>
     </w:lvl>
   </w:abstractNum>
-  <w:abstractNum w:abstractNumId="11" w15:restartNumberingAfterBreak="0">
+  <w:abstractNum w:abstractNumId="12" w15:restartNumberingAfterBreak="0">
     <w:nsid w:val="5EB763D0"/>
     <w:multiLevelType w:val="hybridMultilevel"/>
     <w:tmpl w:val="28C8CD80"/>
@@ -4007,7 +4572,7 @@
       </w:rPr>
     </w:lvl>
   </w:abstractNum>
-  <w:abstractNum w:abstractNumId="12" w15:restartNumberingAfterBreak="0">
+  <w:abstractNum w:abstractNumId="13" w15:restartNumberingAfterBreak="0">
     <w:nsid w:val="6559528B"/>
     <w:multiLevelType w:val="hybridMultilevel"/>
     <w:tmpl w:val="F738BA36"/>
@@ -4120,7 +4685,7 @@
       </w:rPr>
     </w:lvl>
   </w:abstractNum>
-  <w:abstractNum w:abstractNumId="13" w15:restartNumberingAfterBreak="0">
+  <w:abstractNum w:abstractNumId="14" w15:restartNumberingAfterBreak="0">
     <w:nsid w:val="6A3E107C"/>
     <w:multiLevelType w:val="hybridMultilevel"/>
     <w:tmpl w:val="3A04362C"/>
@@ -4233,7 +4798,7 @@
       </w:rPr>
     </w:lvl>
   </w:abstractNum>
-  <w:abstractNum w:abstractNumId="14" w15:restartNumberingAfterBreak="0">
+  <w:abstractNum w:abstractNumId="15" w15:restartNumberingAfterBreak="0">
     <w:nsid w:val="6E451A1A"/>
     <w:multiLevelType w:val="hybridMultilevel"/>
     <w:tmpl w:val="FB78DBD4"/>
@@ -4346,7 +4911,7 @@
       </w:rPr>
     </w:lvl>
   </w:abstractNum>
-  <w:abstractNum w:abstractNumId="15" w15:restartNumberingAfterBreak="0">
+  <w:abstractNum w:abstractNumId="16" w15:restartNumberingAfterBreak="0">
     <w:nsid w:val="77B4038E"/>
     <w:multiLevelType w:val="hybridMultilevel"/>
     <w:tmpl w:val="038A178A"/>
@@ -4459,7 +5024,7 @@
       </w:rPr>
     </w:lvl>
   </w:abstractNum>
-  <w:abstractNum w:abstractNumId="16" w15:restartNumberingAfterBreak="0">
+  <w:abstractNum w:abstractNumId="17" w15:restartNumberingAfterBreak="0">
     <w:nsid w:val="77D46095"/>
     <w:multiLevelType w:val="hybridMultilevel"/>
     <w:tmpl w:val="EFA2D27A"/>
@@ -4573,7 +5138,7 @@
       </w:rPr>
     </w:lvl>
   </w:abstractNum>
-  <w:abstractNum w:abstractNumId="17" w15:restartNumberingAfterBreak="0">
+  <w:abstractNum w:abstractNumId="18" w15:restartNumberingAfterBreak="0">
     <w:nsid w:val="77D57208"/>
     <w:multiLevelType w:val="hybridMultilevel"/>
     <w:tmpl w:val="C2C6C274"/>
@@ -4686,10 +5251,10 @@
       </w:rPr>
     </w:lvl>
   </w:abstractNum>
-  <w:abstractNum w:abstractNumId="18" w15:restartNumberingAfterBreak="0">
+  <w:abstractNum w:abstractNumId="19" w15:restartNumberingAfterBreak="0">
     <w:nsid w:val="7A62678F"/>
     <w:multiLevelType w:val="hybridMultilevel"/>
-    <w:tmpl w:val="0B7C0622"/>
+    <w:tmpl w:val="8D86EFE6"/>
     <w:lvl w:ilvl="0" w:tplc="04090009">
       <w:start w:val="1"/>
       <w:numFmt w:val="bullet"/>
@@ -4799,7 +5364,7 @@
       </w:rPr>
     </w:lvl>
   </w:abstractNum>
-  <w:abstractNum w:abstractNumId="19" w15:restartNumberingAfterBreak="0">
+  <w:abstractNum w:abstractNumId="20" w15:restartNumberingAfterBreak="0">
     <w:nsid w:val="7B9F5E87"/>
     <w:multiLevelType w:val="hybridMultilevel"/>
     <w:tmpl w:val="3262520C"/>
@@ -4914,7 +5479,7 @@
     </w:lvl>
   </w:abstractNum>
   <w:num w:numId="1">
-    <w:abstractNumId w:val="16"/>
+    <w:abstractNumId w:val="17"/>
   </w:num>
   <w:num w:numId="2">
     <w:abstractNumId w:val="4"/>
@@ -4926,52 +5491,55 @@
     <w:abstractNumId w:val="2"/>
   </w:num>
   <w:num w:numId="5">
-    <w:abstractNumId w:val="19"/>
+    <w:abstractNumId w:val="20"/>
   </w:num>
   <w:num w:numId="6">
     <w:abstractNumId w:val="0"/>
   </w:num>
   <w:num w:numId="7">
+    <w:abstractNumId w:val="15"/>
+  </w:num>
+  <w:num w:numId="8">
+    <w:abstractNumId w:val="13"/>
+  </w:num>
+  <w:num w:numId="9">
     <w:abstractNumId w:val="14"/>
   </w:num>
-  <w:num w:numId="8">
+  <w:num w:numId="10">
+    <w:abstractNumId w:val="11"/>
+  </w:num>
+  <w:num w:numId="11">
     <w:abstractNumId w:val="12"/>
   </w:num>
-  <w:num w:numId="9">
-    <w:abstractNumId w:val="13"/>
-  </w:num>
-  <w:num w:numId="10">
-    <w:abstractNumId w:val="10"/>
-  </w:num>
-  <w:num w:numId="11">
-    <w:abstractNumId w:val="11"/>
-  </w:num>
   <w:num w:numId="12">
-    <w:abstractNumId w:val="15"/>
+    <w:abstractNumId w:val="16"/>
   </w:num>
   <w:num w:numId="13">
-    <w:abstractNumId w:val="9"/>
+    <w:abstractNumId w:val="10"/>
   </w:num>
   <w:num w:numId="14">
     <w:abstractNumId w:val="1"/>
   </w:num>
   <w:num w:numId="15">
-    <w:abstractNumId w:val="17"/>
+    <w:abstractNumId w:val="18"/>
   </w:num>
   <w:num w:numId="16">
-    <w:abstractNumId w:val="7"/>
+    <w:abstractNumId w:val="8"/>
   </w:num>
   <w:num w:numId="17">
-    <w:abstractNumId w:val="8"/>
+    <w:abstractNumId w:val="9"/>
   </w:num>
   <w:num w:numId="18">
-    <w:abstractNumId w:val="18"/>
+    <w:abstractNumId w:val="19"/>
   </w:num>
   <w:num w:numId="19">
     <w:abstractNumId w:val="5"/>
   </w:num>
   <w:num w:numId="20">
     <w:abstractNumId w:val="6"/>
+  </w:num>
+  <w:num w:numId="21">
+    <w:abstractNumId w:val="7"/>
   </w:num>
 </w:numbering>
 </file>
@@ -5374,7 +5942,7 @@
   <w:style w:type="paragraph" w:default="1" w:styleId="Normal">
     <w:name w:val="Normal"/>
     <w:qFormat/>
-    <w:rsid w:val="00C15C91"/>
+    <w:rsid w:val="008367DC"/>
   </w:style>
   <w:style w:type="character" w:default="1" w:styleId="DefaultParagraphFont">
     <w:name w:val="Default Paragraph Font"/>
@@ -5463,6 +6031,25 @@
       <w:color w:val="0000FF" w:themeColor="hyperlink"/>
       <w:u w:val="single"/>
     </w:rPr>
+  </w:style>
+  <w:style w:type="table" w:styleId="TableGrid">
+    <w:name w:val="Table Grid"/>
+    <w:basedOn w:val="TableNormal"/>
+    <w:uiPriority w:val="59"/>
+    <w:rsid w:val="00CE2630"/>
+    <w:pPr>
+      <w:spacing w:after="0" w:line="240" w:lineRule="auto"/>
+    </w:pPr>
+    <w:tblPr>
+      <w:tblBorders>
+        <w:top w:val="single" w:sz="4" w:space="0" w:color="auto"/>
+        <w:left w:val="single" w:sz="4" w:space="0" w:color="auto"/>
+        <w:bottom w:val="single" w:sz="4" w:space="0" w:color="auto"/>
+        <w:right w:val="single" w:sz="4" w:space="0" w:color="auto"/>
+        <w:insideH w:val="single" w:sz="4" w:space="0" w:color="auto"/>
+        <w:insideV w:val="single" w:sz="4" w:space="0" w:color="auto"/>
+      </w:tblBorders>
+    </w:tblPr>
   </w:style>
 </w:styles>
 </file>
@@ -5750,4 +6337,16 @@
   <a:objectDefaults/>
   <a:extraClrSchemeLst/>
 </a:theme>
+</file>
+
+<file path=customXml/item1.xml><?xml version="1.0" encoding="utf-8"?>
+<b:Sources xmlns:b="http://schemas.openxmlformats.org/officeDocument/2006/bibliography" xmlns="http://schemas.openxmlformats.org/officeDocument/2006/bibliography" SelectedStyle="\APASixthEditionOfficeOnline.xsl" StyleName="APA" Version="6"/>
+</file>
+
+<file path=customXml/itemProps1.xml><?xml version="1.0" encoding="utf-8"?>
+<ds:datastoreItem xmlns:ds="http://schemas.openxmlformats.org/officeDocument/2006/customXml" ds:itemID="{14A88AD2-2D74-4335-900A-804B036DBFE1}">
+  <ds:schemaRefs>
+    <ds:schemaRef ds:uri="http://schemas.openxmlformats.org/officeDocument/2006/bibliography"/>
+  </ds:schemaRefs>
+</ds:datastoreItem>
 </file>
</xml_diff>

<commit_message>
Crop and reverted the background feature since idk how to fix it rn
</commit_message>
<xml_diff>
--- a/PHPInput_Resume_Format.docx
+++ b/PHPInput_Resume_Format.docx
@@ -3037,7 +3037,7 @@
                 <w:b/>
                 <w:szCs w:val="24"/>
               </w:rPr>
-              <w:t>FullName</w:t>
+              <w:t>SignatureName</w:t>
             </w:r>
             <w:proofErr w:type="spellEnd"/>
             <w:r>
@@ -3095,7 +3095,7 @@
         <v:path o:extrusionok="f" gradientshapeok="t" o:connecttype="rect"/>
         <o:lock v:ext="edit" aspectratio="t"/>
       </v:shapetype>
-      <v:shape id="_x0000_i1076" type="#_x0000_t75" style="width:9.6pt;height:9.6pt" o:bullet="t">
+      <v:shape id="_x0000_i1046" type="#_x0000_t75" style="width:9.6pt;height:9.6pt" o:bullet="t">
         <v:imagedata r:id="rId1" o:title="msoA35"/>
       </v:shape>
     </w:pict>

</xml_diff>